<commit_message>
Align seminar paper headings with the college template
Co-Authored-By: Claude Fable 5.1 <noreply@anthropic.com>
Claude-Session: https://claude.ai/code/session_01KHo5ZcKCUwhCAvyoKeeMWs
</commit_message>
<xml_diff>
--- a/seminar/סמינריון_רווחה_נפשית_ולגיטימיות.docx
+++ b/seminar/סמינריון_רווחה_נפשית_ולגיטימיות.docx
@@ -62,22 +62,6 @@
       </w:r>
     </w:p>
     <w:p>
-      <w:pPr>
-        <w:bidi/>
-        <w:spacing w:after="120" w:line="360"/>
-        <w:jc w:val="center"/>
-      </w:pPr>
-      <w:r>
-        <w:rPr>
-          <w:rFonts w:ascii="David" w:cs="David" w:eastAsia="David" w:hAnsi="David"/>
-          <w:sz w:val="24"/>
-          <w:szCs w:val="24"/>
-          <w:rtl/>
-        </w:rPr>
-        <w:t xml:space="preserve">מרצה: ד"ר יוחנן ועקנין</w:t>
-      </w:r>
-    </w:p>
-    <w:p>
       <w:r>
         <w:t xml:space="preserve"/>
       </w:r>
@@ -231,9 +215,10 @@
     </w:p>
     <w:p>
       <w:pPr>
+        <w:pStyle w:val="Heading1"/>
         <w:pageBreakBefore/>
         <w:bidi/>
-        <w:spacing w:after="240"/>
+        <w:spacing w:after="240" w:before="0" w:line="360"/>
         <w:jc w:val="right"/>
       </w:pPr>
       <w:r>
@@ -829,7 +814,7 @@
           <w:szCs w:val="24"/>
           <w:rtl/>
         </w:rPr>
-        <w:t xml:space="preserve">מטרת המחקר היא לבחון את הקשר בין רווחה נפשית לבין תפיסת הלגיטימיות של סגל הכליאה בקרב אסירים שפוטים. הלגיטימיות היא המשתנה התלוי והרווחה הנפשית היא המשתנה הבלתי תלוי. העבודה פותחת בסקירת ספרות בשני חלקים, הסתגלות למאסר ורווחה נפשית מצד אחד ולגיטימיות של סגל הכליאה מצד שני, ומסתיימת בשאלת המחקר ובהשערה. לאחר מכן מוצגים פרק השיטה, פרק הממצאים והדיון, ובסופם מגבלות המחקר, סיכום, גילוי נאות ורשימת המקורות. הפלטים הסטטיסטיים מובאים בנספח.</w:t>
+        <w:t xml:space="preserve">מטרת המחקר היא לבחון את הקשר בין רווחה נפשית לבין תפיסת הלגיטימיות של סגל הכליאה בקרב אסירים שפוטים. הלגיטימיות היא המשתנה התלוי והרווחה הנפשית היא המשתנה הבלתי תלוי. העבודה פותחת בסקירת ספרות בשני חלקים, הסתגלות למאסר ורווחה נפשית מצד אחד ולגיטימיות של סגל הכליאה מצד שני, ומסתיימת בשאלת המחקר ובהשערה. לאחר מכן מוצגים פרק השיטה, פרק הממצאים והדיון, ובסופם מגבלות המחקר, סיכום, גילוי נאות ורשימת המקורות. הפלטים הסטטיסטיים מובאים בנספח א'.</w:t>
       </w:r>
     </w:p>
     <w:p>
@@ -1506,10 +1491,10 @@
     </w:p>
     <w:p>
       <w:pPr>
-        <w:pStyle w:val="Heading1"/>
-        <w:pageBreakBefore/>
+        <w:pStyle w:val="Heading2"/>
+        <w:keepNext/>
         <w:bidi/>
-        <w:spacing w:after="240" w:before="0" w:line="360"/>
+        <w:spacing w:after="120" w:before="240" w:line="360"/>
         <w:jc w:val="right"/>
       </w:pPr>
       <w:r>
@@ -1517,11 +1502,11 @@
           <w:rFonts w:ascii="David" w:cs="David" w:eastAsia="David" w:hAnsi="David"/>
           <w:b/>
           <w:bCs/>
-          <w:sz w:val="32"/>
-          <w:szCs w:val="32"/>
-          <w:rtl/>
-        </w:rPr>
-        <w:t xml:space="preserve">שאלת המחקר והשערת המחקר</w:t>
+          <w:sz w:val="28"/>
+          <w:szCs w:val="28"/>
+          <w:rtl/>
+        </w:rPr>
+        <w:t xml:space="preserve">שאלת המחקר</w:t>
       </w:r>
     </w:p>
     <w:p>
@@ -1640,7 +1625,41 @@
           <w:szCs w:val="24"/>
           <w:rtl/>
         </w:rPr>
-        <w:t xml:space="preserve">המחקר הוא מחקר כמותי מתאמי במערך חתך, המבוסס על ניתוח משני של נתונים סינתטיים. נתונים סינתטיים נוצרים על ידי מודל סטטיסטי שלמד את ההתפלגויות, את דפוסי אי-ההשבה, את מהימנויות הסולמות ואת הקשרים בין המשתנים בקובץ המקורי, ומייצר משיבים חדשים שאף אחד מהם אינו אסיר אמיתי. השיטה נדרשת משום שסקרי אסירים מכילים מידע רגיש שאינו ניתן למסירה לחוקרים חיצוניים. ניתוח של קובץ כזה צפוי להתנהג כמו ניתוח של הסקר האמיתי, אך אומדנים מדויקים וערכי </w:t>
+        <w:t xml:space="preserve">המחקר הוא מחקר כמותי מתאמי במערך חתך, המבוסס על ניתוח משני של נתונים סינתטיים. המשתנה התלוי הוא תפיסת הלגיטימיות של סגל הכליאה, והמשתנה הבלתי תלוי הוא הרווחה הנפשית של האסיר. שני המשתנים הם ציוני סולם רציפים בטווח של </w:t>
+      </w:r>
+      <w:r>
+        <w:rPr>
+          <w:rFonts w:ascii="Times New Roman" w:cs="Times New Roman" w:eastAsia="Times New Roman" w:hAnsi="Times New Roman"/>
+          <w:sz w:val="24"/>
+          <w:szCs w:val="24"/>
+        </w:rPr>
+        <w:t xml:space="preserve">1</w:t>
+      </w:r>
+      <w:r>
+        <w:rPr>
+          <w:rFonts w:ascii="David" w:cs="David" w:eastAsia="David" w:hAnsi="David"/>
+          <w:sz w:val="24"/>
+          <w:szCs w:val="24"/>
+          <w:rtl/>
+        </w:rPr>
+        <w:t xml:space="preserve"> עד </w:t>
+      </w:r>
+      <w:r>
+        <w:rPr>
+          <w:rFonts w:ascii="Times New Roman" w:cs="Times New Roman" w:eastAsia="Times New Roman" w:hAnsi="Times New Roman"/>
+          <w:sz w:val="24"/>
+          <w:szCs w:val="24"/>
+        </w:rPr>
+        <w:t xml:space="preserve">5,</w:t>
+      </w:r>
+      <w:r>
+        <w:rPr>
+          <w:rFonts w:ascii="David" w:cs="David" w:eastAsia="David" w:hAnsi="David"/>
+          <w:sz w:val="24"/>
+          <w:szCs w:val="24"/>
+          <w:rtl/>
+        </w:rPr>
+        <w:t xml:space="preserve"> המחושבים כממוצע פריטי דיווח עצמי, ולצדם משתני רקע המשמשים לתיאור האוכלוסייה. נתונים סינתטיים נוצרים על ידי מודל סטטיסטי שלמד את ההתפלגויות, את דפוסי אי-ההשבה, את מהימנויות הסולמות ואת הקשרים בין המשתנים בקובץ המקורי, ומייצר משיבים חדשים שאף אחד מהם אינו אסיר אמיתי. השיטה נדרשת משום שסקרי אסירים מכילים מידע רגיש שאינו ניתן למסירה לחוקרים חיצוניים. ניתוח של קובץ כזה צפוי להתנהג כמו ניתוח של הסקר האמיתי, אך אומדנים מדויקים וערכי </w:t>
       </w:r>
       <w:r>
         <w:rPr>
@@ -3019,7 +3038,7 @@
           <w:szCs w:val="24"/>
           <w:rtl/>
         </w:rPr>
-        <w:t xml:space="preserve">. הפלטים המרכזיים מובאים בנספח.</w:t>
+        <w:t xml:space="preserve">. הפלטים המרכזיים מובאים בנספח א'.</w:t>
       </w:r>
     </w:p>
     <w:p>
@@ -8177,7 +8196,7 @@
           <w:szCs w:val="20"/>
           <w:rtl/>
         </w:rPr>
-        <w:t xml:space="preserve">, נספח.</w:t>
+        <w:t xml:space="preserve">, נספח א'.</w:t>
       </w:r>
     </w:p>
     <w:p>
@@ -10079,7 +10098,7 @@
           <w:szCs w:val="20"/>
           <w:rtl/>
         </w:rPr>
-        <w:t xml:space="preserve">, נספח.</w:t>
+        <w:t xml:space="preserve">, נספח א'.</w:t>
       </w:r>
     </w:p>
     <w:p>
@@ -11234,7 +11253,7 @@
           <w:szCs w:val="20"/>
           <w:rtl/>
         </w:rPr>
-        <w:t xml:space="preserve">, נספח.</w:t>
+        <w:t xml:space="preserve">, נספח א'.</w:t>
       </w:r>
     </w:p>
     <w:p>
@@ -12251,7 +12270,7 @@
           <w:szCs w:val="20"/>
           <w:rtl/>
         </w:rPr>
-        <w:t xml:space="preserve">, נספח.</w:t>
+        <w:t xml:space="preserve">, נספח א'.</w:t>
       </w:r>
     </w:p>
     <w:p>
@@ -15452,15 +15471,14 @@
           <w:szCs w:val="32"/>
           <w:rtl/>
         </w:rPr>
-        <w:t xml:space="preserve">נספח</w:t>
+        <w:t xml:space="preserve">נספחים</w:t>
       </w:r>
     </w:p>
     <w:p>
       <w:pPr>
-        <w:pStyle w:val="Heading2"/>
-        <w:keepNext/>
+        <w:pStyle w:val="Heading1"/>
         <w:bidi/>
-        <w:spacing w:after="120" w:before="240" w:line="360"/>
+        <w:spacing w:after="240" w:before="0" w:line="360"/>
         <w:jc w:val="right"/>
       </w:pPr>
       <w:r>
@@ -15468,11 +15486,35 @@
           <w:rFonts w:ascii="David" w:cs="David" w:eastAsia="David" w:hAnsi="David"/>
           <w:b/>
           <w:bCs/>
-          <w:sz w:val="28"/>
-          <w:szCs w:val="28"/>
-          <w:rtl/>
-        </w:rPr>
-        <w:t xml:space="preserve">נספח: פלטי SPSS</w:t>
+          <w:sz w:val="32"/>
+          <w:szCs w:val="32"/>
+          <w:rtl/>
+        </w:rPr>
+        <w:t xml:space="preserve">נספח א'</w:t>
+      </w:r>
+    </w:p>
+    <w:p>
+      <w:pPr>
+        <w:bidi/>
+        <w:spacing w:after="120" w:line="360"/>
+        <w:jc w:val="both"/>
+      </w:pPr>
+      <w:r>
+        <w:rPr>
+          <w:rFonts w:ascii="David" w:cs="David" w:eastAsia="David" w:hAnsi="David"/>
+          <w:sz w:val="24"/>
+          <w:szCs w:val="24"/>
+          <w:rtl/>
+        </w:rPr>
+        <w:t xml:space="preserve">פלטי </w:t>
+      </w:r>
+      <w:r>
+        <w:rPr>
+          <w:rFonts w:ascii="Times New Roman" w:cs="Times New Roman" w:eastAsia="Times New Roman" w:hAnsi="Times New Roman"/>
+          <w:sz w:val="24"/>
+          <w:szCs w:val="24"/>
+        </w:rPr>
+        <w:t xml:space="preserve">SPSS</w:t>
       </w:r>
     </w:p>
     <w:p>

</xml_diff>

<commit_message>
Correct citations after reading the full articles
Co-Authored-By: Claude Fable 5.1 <noreply@anthropic.com>
Claude-Session: https://claude.ai/code/session_01KHo5ZcKCUwhCAvyoKeeMWs
</commit_message>
<xml_diff>
--- a/seminar/סמינריון_רווחה_נפשית_ולגיטימיות.docx
+++ b/seminar/סמינריון_רווחה_נפשית_ולגיטימיות.docx
@@ -506,7 +506,7 @@
           <w:szCs w:val="24"/>
           <w:rtl/>
         </w:rPr>
-        <w:t xml:space="preserve"> טענו שסדר בבתי סוהר אינו מתקיים בכוח בלבד אלא נשען על תחושת האסירים שהמשטר שבו הם חיים הוגן, ושמי שמפעיל אותו ראוי לציות. תחושה זו היא מה שהספרות מכנה לגיטימיות: המידה שבה הכפופים לסמכות רואים בה סמכות שראוי לציית לה, ולא רק סמכות שאפשר להיענש על ידה </w:t>
+        <w:t xml:space="preserve">, על בסיס עבודת שדה בשני בתי סוהר בביטחון מרבי באנגליה, טענו שסדר בבתי סוהר אינו מתקיים בכוח בלבד אלא נשען על תחושת האסירים שהמשטר שבו הם חיים הוגן, ושמי שמפעיל אותו ראוי לציות. תחושה זו היא מה שהספרות מכנה לגיטימיות: המידה שבה הכפופים לסמכות רואים בה סמכות שראוי לציית לה, ולא רק סמכות שאפשר להיענש על ידה </w:t>
       </w:r>
       <w:r>
         <w:rPr>
@@ -973,15 +973,83 @@
           <w:szCs w:val="24"/>
           <w:rtl/>
         </w:rPr>
-        <w:t xml:space="preserve"> סף אמפירי: בבתי סוהר שבהם ציון היחסים בין סגל לאסירים נמוך מ</w:t>
-      </w:r>
-      <w:r>
-        <w:rPr>
-          <w:rFonts w:ascii="Times New Roman" w:cs="Times New Roman" w:eastAsia="Times New Roman" w:hAnsi="Times New Roman"/>
-          <w:sz w:val="24"/>
-          <w:szCs w:val="24"/>
-        </w:rPr>
-        <w:t xml:space="preserve">-3.05</w:t>
+        <w:t xml:space="preserve">, על בסיס </w:t>
+      </w:r>
+      <w:r>
+        <w:rPr>
+          <w:rFonts w:ascii="Times New Roman" w:cs="Times New Roman" w:eastAsia="Times New Roman" w:hAnsi="Times New Roman"/>
+          <w:sz w:val="24"/>
+          <w:szCs w:val="24"/>
+        </w:rPr>
+        <w:t xml:space="preserve">518</w:t>
+      </w:r>
+      <w:r>
+        <w:rPr>
+          <w:rFonts w:ascii="David" w:cs="David" w:eastAsia="David" w:hAnsi="David"/>
+          <w:sz w:val="24"/>
+          <w:szCs w:val="24"/>
+          <w:rtl/>
+        </w:rPr>
+        <w:t xml:space="preserve"> סקרי איכות חיים באנגליה ובוויילס בין </w:t>
+      </w:r>
+      <w:r>
+        <w:rPr>
+          <w:rFonts w:ascii="Times New Roman" w:cs="Times New Roman" w:eastAsia="Times New Roman" w:hAnsi="Times New Roman"/>
+          <w:sz w:val="24"/>
+          <w:szCs w:val="24"/>
+        </w:rPr>
+        <w:t xml:space="preserve">2009</w:t>
+      </w:r>
+      <w:r>
+        <w:rPr>
+          <w:rFonts w:ascii="David" w:cs="David" w:eastAsia="David" w:hAnsi="David"/>
+          <w:sz w:val="24"/>
+          <w:szCs w:val="24"/>
+          <w:rtl/>
+        </w:rPr>
+        <w:t xml:space="preserve"> ל</w:t>
+      </w:r>
+      <w:r>
+        <w:rPr>
+          <w:rFonts w:ascii="Times New Roman" w:cs="Times New Roman" w:eastAsia="Times New Roman" w:hAnsi="Times New Roman"/>
+          <w:sz w:val="24"/>
+          <w:szCs w:val="24"/>
+        </w:rPr>
+        <w:t xml:space="preserve">-2020,</w:t>
+      </w:r>
+      <w:r>
+        <w:rPr>
+          <w:rFonts w:ascii="David" w:cs="David" w:eastAsia="David" w:hAnsi="David"/>
+          <w:sz w:val="24"/>
+          <w:szCs w:val="24"/>
+          <w:rtl/>
+        </w:rPr>
+        <w:t xml:space="preserve"> שני ספים אמפיריים לכל ממד: סף "לא בטוח" וסף "בטוח מינימלית". בממד היחסים בין סגל לאסירים עמדו הספים על </w:t>
+      </w:r>
+      <w:r>
+        <w:rPr>
+          <w:rFonts w:ascii="Times New Roman" w:cs="Times New Roman" w:eastAsia="Times New Roman" w:hAnsi="Times New Roman"/>
+          <w:sz w:val="24"/>
+          <w:szCs w:val="24"/>
+        </w:rPr>
+        <w:t xml:space="preserve">3.05</w:t>
+      </w:r>
+      <w:r>
+        <w:rPr>
+          <w:rFonts w:ascii="David" w:cs="David" w:eastAsia="David" w:hAnsi="David"/>
+          <w:sz w:val="24"/>
+          <w:szCs w:val="24"/>
+          <w:rtl/>
+        </w:rPr>
+        <w:t xml:space="preserve"> ו</w:t>
+      </w:r>
+      <w:r>
+        <w:rPr>
+          <w:rFonts w:ascii="Times New Roman" w:cs="Times New Roman" w:eastAsia="Times New Roman" w:hAnsi="Times New Roman"/>
+          <w:sz w:val="24"/>
+          <w:szCs w:val="24"/>
+        </w:rPr>
+        <w:t xml:space="preserve">-3.55</w:t>
       </w:r>
       <w:r>
         <w:rPr>
@@ -1024,7 +1092,7 @@
           <w:szCs w:val="24"/>
           <w:rtl/>
         </w:rPr>
-        <w:t xml:space="preserve"> שיעורי האלימות, הפגיעה העצמית והמוות נמצאו גבוהים באופן מובהק. בהולנד מצאו ון גינקן ואחרים </w:t>
+        <w:t xml:space="preserve"> ובבתי סוהר שמתחת לסף התחתון נמצאו שיעורים גבוהים באופן מובהק של תקיפות, פגיעה עצמית ומקרי מוות. בהולנד בחנו ון גינקן ואחרים </w:t>
       </w:r>
       <w:r>
         <w:rPr>
@@ -1041,7 +1109,24 @@
           <w:szCs w:val="24"/>
           <w:rtl/>
         </w:rPr>
-        <w:t xml:space="preserve">, באמצעות סקר "החיים במשמורת" שממנו נגזר גם השאלון הישראלי, שממדי האקלים של בית הסוהר, ובראשם היחסים עם הסגל, קשורים לרווחתם הנפשית של האסירים.</w:t>
+        <w:t xml:space="preserve"> את הקשר בין אקלים בית הסוהר לרווחה בקרב </w:t>
+      </w:r>
+      <w:r>
+        <w:rPr>
+          <w:rFonts w:ascii="Times New Roman" w:cs="Times New Roman" w:eastAsia="Times New Roman" w:hAnsi="Times New Roman"/>
+          <w:sz w:val="24"/>
+          <w:szCs w:val="24"/>
+        </w:rPr>
+        <w:t xml:space="preserve">4,538</w:t>
+      </w:r>
+      <w:r>
+        <w:rPr>
+          <w:rFonts w:ascii="David" w:cs="David" w:eastAsia="David" w:hAnsi="David"/>
+          <w:sz w:val="24"/>
+          <w:szCs w:val="24"/>
+          <w:rtl/>
+        </w:rPr>
+        <w:t xml:space="preserve"> אסירים, באמצעות סקר "החיים במשמורת" שממנו נגזר גם השאלון הישראלי. הם מצאו שרוב השונות ברווחה נמצאת ברמת האסיר ולא ברמת האגף, ושתפיסות אישיות של אוטונומיה, ביטחון ויחסים עם אסירים אחרים קשורות לרווחה גבוהה יותר. היחסים עם הסגל, בניגוד לצפוי, לא נמצאו קשורים לרווחה באופן ישיר, והחוקרים הסבירו זאת במתאם בין יחסי הסגל לתחושת האוטונומיה: יחס הוגן של הסוהרים מגדיל את תחושת השליטה של האסיר, וזו שקשורה לרווחה.</w:t>
       </w:r>
     </w:p>
     <w:p>
@@ -1092,7 +1177,7 @@
           <w:szCs w:val="24"/>
           <w:rtl/>
         </w:rPr>
-        <w:t xml:space="preserve"> אסירים גברים שלושה שבועות ושלושה חודשים לאחר קליטתם, ומצאו שתפיסה של יחס הוגן מצד הסוהרים בזמן הראשון ניבאה פחות בעיות נפשיות בזמן השני. באוסטרליה הראו סרג'נט ואחרים </w:t>
+        <w:t xml:space="preserve"> אסירים גברים שלושה שבועות ושלושה חודשים לאחר קליטתם, ומצאו שתפיסה של יחס הוגן מצד הסוהרים בזמן הראשון ניבאה פחות בעיות נפשיות בזמן השני. באוסטרליה עקבו סרג'נט ואחרים </w:t>
       </w:r>
       <w:r>
         <w:rPr>
@@ -1109,7 +1194,7 @@
           <w:szCs w:val="24"/>
           <w:rtl/>
         </w:rPr>
-        <w:t xml:space="preserve"> שצדק פרוצדורלי קשור לרווחה נפשית גבוהה יותר לאורך זמן, ושהקשר עובר בחלקו דרך איכות היחסים עם הסגל, ואילו תחושת הביטחון בבית הסוהר לא ניבאה רווחה לאורך זמן. גם בבתי מעצר בארצות הברית נמצא שתפיסה גבוהה של צדק פרוצדורלי קשורה לפחות מחשבות אובדניות </w:t>
+        <w:t xml:space="preserve"> אחר אסירים בניו סאות' ויילס בשלוש נקודות זמן ומצאו שצדק פרוצדורלי קשור לרווחה נפשית גבוהה יותר. בנתוני החתך תיווכו את הקשר גם היחסים עם הסגל וגם תחושת הביטחון, אך בניתוח האורך רק היחסים עם הסגל תיווכו אותו, והחוקרים הסיקו שהכשרת סוהרים בצדק פרוצדורלי היא הדרך המעשית לשפר את רווחת האסירים. גם בבתי מעצר בארצות הברית נמצא שתפיסה גבוהה של צדק פרוצדורלי קשורה לפחות מחשבות אובדניות </w:t>
       </w:r>
       <w:r>
         <w:rPr>
@@ -2545,7 +2630,7 @@
           <w:szCs w:val="24"/>
           <w:rtl/>
         </w:rPr>
-        <w:t xml:space="preserve">). השאלון נבנה על בסיס שאלון "החיים במשמורת" </w:t>
+        <w:t xml:space="preserve">). השאלון נבנה על בסיס שאלון אקלים בית הסוהר של מחקר "החיים במשמורת" </w:t>
       </w:r>
       <w:r>
         <w:rPr>
@@ -2562,7 +2647,7 @@
           <w:szCs w:val="24"/>
           <w:rtl/>
         </w:rPr>
-        <w:t xml:space="preserve"> ההולנדי, שפותח ונבדק בבתי הסוהר בהולנד וכולל </w:t>
+        <w:t xml:space="preserve"> ההולנדי, הכולל </w:t>
       </w:r>
       <w:r>
         <w:rPr>
@@ -2579,24 +2664,41 @@
           <w:szCs w:val="24"/>
           <w:rtl/>
         </w:rPr>
-        <w:t xml:space="preserve"> פריטים ב</w:t>
-      </w:r>
-      <w:r>
-        <w:rPr>
-          <w:rFonts w:ascii="Times New Roman" w:cs="Times New Roman" w:eastAsia="Times New Roman" w:hAnsi="Times New Roman"/>
-          <w:sz w:val="24"/>
-          <w:szCs w:val="24"/>
-        </w:rPr>
-        <w:t xml:space="preserve">-21</w:t>
-      </w:r>
-      <w:r>
-        <w:rPr>
-          <w:rFonts w:ascii="David" w:cs="David" w:eastAsia="David" w:hAnsi="David"/>
-          <w:sz w:val="24"/>
-          <w:szCs w:val="24"/>
-          <w:rtl/>
-        </w:rPr>
-        <w:t xml:space="preserve"> נושאים, עם מהימנויות של </w:t>
+        <w:t xml:space="preserve"> פריטים בשישה תחומים: אוטונומיה, ביטחון, יחסים בבית הסוהר, קשר עם העולם שבחוץ, פעילויות משמעותיות ותנאים פיזיים </w:t>
+      </w:r>
+      <w:r>
+        <w:rPr>
+          <w:rFonts w:ascii="Times New Roman" w:cs="Times New Roman" w:eastAsia="Times New Roman" w:hAnsi="Times New Roman"/>
+          <w:sz w:val="24"/>
+          <w:szCs w:val="24"/>
+        </w:rPr>
+        <w:t xml:space="preserve">(Van Ginneken et al., 2019)</w:t>
+      </w:r>
+      <w:r>
+        <w:rPr>
+          <w:rFonts w:ascii="David" w:cs="David" w:eastAsia="David" w:hAnsi="David"/>
+          <w:sz w:val="24"/>
+          <w:szCs w:val="24"/>
+          <w:rtl/>
+        </w:rPr>
+        <w:t xml:space="preserve">. לפי ועקנין (</w:t>
+      </w:r>
+      <w:r>
+        <w:rPr>
+          <w:rFonts w:ascii="Times New Roman" w:cs="Times New Roman" w:eastAsia="Times New Roman" w:hAnsi="Times New Roman"/>
+          <w:sz w:val="24"/>
+          <w:szCs w:val="24"/>
+        </w:rPr>
+        <w:t xml:space="preserve">2024</w:t>
+      </w:r>
+      <w:r>
+        <w:rPr>
+          <w:rFonts w:ascii="David" w:cs="David" w:eastAsia="David" w:hAnsi="David"/>
+          <w:sz w:val="24"/>
+          <w:szCs w:val="24"/>
+          <w:rtl/>
+        </w:rPr>
+        <w:t xml:space="preserve">), מהימנויות הנושאים בשאלון המקורי נעו בין </w:t>
       </w:r>
       <w:r>
         <w:rPr>
@@ -2613,40 +2715,24 @@
           <w:szCs w:val="24"/>
           <w:rtl/>
         </w:rPr>
-        <w:t xml:space="preserve"> עד </w:t>
-      </w:r>
-      <w:r>
-        <w:rPr>
-          <w:rFonts w:ascii="Times New Roman" w:cs="Times New Roman" w:eastAsia="Times New Roman" w:hAnsi="Times New Roman"/>
-          <w:sz w:val="24"/>
-          <w:szCs w:val="24"/>
-        </w:rPr>
-        <w:t xml:space="preserve">0.90</w:t>
-      </w:r>
-      <w:r>
-        <w:rPr>
-          <w:rFonts w:ascii="Times New Roman" w:cs="Times New Roman" w:eastAsia="Times New Roman" w:hAnsi="Times New Roman"/>
-          <w:sz w:val="24"/>
-          <w:szCs w:val="24"/>
-        </w:rPr>
-        <w:t xml:space="preserve"> </w:t>
-      </w:r>
-      <w:r>
-        <w:rPr>
-          <w:rFonts w:ascii="Times New Roman" w:cs="Times New Roman" w:eastAsia="Times New Roman" w:hAnsi="Times New Roman"/>
-          <w:sz w:val="24"/>
-          <w:szCs w:val="24"/>
-        </w:rPr>
-        <w:t xml:space="preserve">(Van Ginneken et al., 2019)</w:t>
-      </w:r>
-      <w:r>
-        <w:rPr>
-          <w:rFonts w:ascii="David" w:cs="David" w:eastAsia="David" w:hAnsi="David"/>
-          <w:sz w:val="24"/>
-          <w:szCs w:val="24"/>
-          <w:rtl/>
-        </w:rPr>
-        <w:t xml:space="preserve">. לצורך הסקר הישראלי נבחרו </w:t>
+        <w:t xml:space="preserve"> ל</w:t>
+      </w:r>
+      <w:r>
+        <w:rPr>
+          <w:rFonts w:ascii="Times New Roman" w:cs="Times New Roman" w:eastAsia="Times New Roman" w:hAnsi="Times New Roman"/>
+          <w:sz w:val="24"/>
+          <w:szCs w:val="24"/>
+        </w:rPr>
+        <w:t xml:space="preserve">-0.90.</w:t>
+      </w:r>
+      <w:r>
+        <w:rPr>
+          <w:rFonts w:ascii="David" w:cs="David" w:eastAsia="David" w:hAnsi="David"/>
+          <w:sz w:val="24"/>
+          <w:szCs w:val="24"/>
+          <w:rtl/>
+        </w:rPr>
+        <w:t xml:space="preserve"> לצורך הסקר הישראלי נבחרו </w:t>
       </w:r>
       <w:r>
         <w:rPr>
@@ -12372,15 +12458,15 @@
           <w:szCs w:val="24"/>
           <w:rtl/>
         </w:rPr>
-        <w:t xml:space="preserve"> על מתן קול כמרכיב הצדק הפרוצדורלי, ועם הממצא ההולנדי שלפיו יחסי הסגל הם ממד האקלים הקשור ביותר לרווחה </w:t>
-      </w:r>
-      <w:r>
-        <w:rPr>
-          <w:rFonts w:ascii="Times New Roman" w:cs="Times New Roman" w:eastAsia="Times New Roman" w:hAnsi="Times New Roman"/>
-          <w:sz w:val="24"/>
-          <w:szCs w:val="24"/>
-        </w:rPr>
-        <w:t xml:space="preserve">(Van Ginneken et al., 2019)</w:t>
+        <w:t xml:space="preserve"> על מתן קול כמרכיב הצדק הפרוצדורלי, ועם הממצא האוסטרלי שלפיו איכות היחסים עם הסגל היא המנגנון שדרכו צדק פרוצדורלי מתורגם לרווחה לאורך זמן </w:t>
+      </w:r>
+      <w:r>
+        <w:rPr>
+          <w:rFonts w:ascii="Times New Roman" w:cs="Times New Roman" w:eastAsia="Times New Roman" w:hAnsi="Times New Roman"/>
+          <w:sz w:val="24"/>
+          <w:szCs w:val="24"/>
+        </w:rPr>
+        <w:t xml:space="preserve">(Sargeant et al., 2026)</w:t>
       </w:r>
       <w:r>
         <w:rPr>
@@ -13374,7 +13460,7 @@
           <w:szCs w:val="24"/>
           <w:rtl/>
         </w:rPr>
-        <w:t xml:space="preserve"> אחוזים מסטיית תקן. פער בגודל כזה בין קבוצות שנבדלות רק בתפיסת הסגל דומה בעוצמתו לפער שמצאו אוטי וליבלינג </w:t>
+        <w:t xml:space="preserve"> אחוזים מסטיית תקן. לשם השוואה, אצל אוטי וליבלינג </w:t>
       </w:r>
       <w:r>
         <w:rPr>
@@ -13391,7 +13477,7 @@
           <w:szCs w:val="24"/>
           <w:rtl/>
         </w:rPr>
-        <w:t xml:space="preserve"> בין בתי סוהר שמעל ומתחת לסף היחסים שזיהו.</w:t>
+        <w:t xml:space="preserve"> המרחק בין הסף "הלא בטוח" לסף "הבטוח מינימלית" בממד יחסי הסגל והאסירים הוא חצי נקודה בלבד, ומרחק זה הבחין בין בתי סוהר עם שיעורי אלימות ופגיעה עצמית גבוהים לנמוכים.</w:t>
       </w:r>
     </w:p>
     <w:p>
@@ -13705,24 +13791,41 @@
           <w:szCs w:val="24"/>
           <w:rtl/>
         </w:rPr>
-        <w:t xml:space="preserve">. המחקר הנוכחי מוסיף לכך את הכיוון ההפוך: שפוטים שרווחתם הנפשית גבוהה יותר תופסים את הסגל כלגיטימי יותר. שני הכיוונים אינם סותרים. סביר שמדובר במעגל שבו יחס הוגן משפר את הרווחה, ורווחה גבוהה יותר מאפשרת לאסיר לפרש את התנהגות הסגל באור פחות עוין ולפנות אליו כשקשה לו. העובדה שהפריט הקשור ביותר לרווחה הוא דווקא האפשרות לדבר עם הסוהרים כשמודאגים או עצובים מחזקת פירוש זה, ומתיישבת עם הממצא שיחסי אמון עם הסגל הם המרכיב שמלווה את האסיר גם אחרי השחרור </w:t>
-      </w:r>
-      <w:r>
-        <w:rPr>
-          <w:rFonts w:ascii="Times New Roman" w:cs="Times New Roman" w:eastAsia="Times New Roman" w:hAnsi="Times New Roman"/>
-          <w:sz w:val="24"/>
-          <w:szCs w:val="24"/>
-        </w:rPr>
-        <w:t xml:space="preserve">(Horowitz &amp; Hyatt, 2025)</w:t>
-      </w:r>
-      <w:r>
-        <w:rPr>
-          <w:rFonts w:ascii="David" w:cs="David" w:eastAsia="David" w:hAnsi="David"/>
-          <w:sz w:val="24"/>
-          <w:szCs w:val="24"/>
-          <w:rtl/>
-        </w:rPr>
-        <w:t xml:space="preserve">.</w:t>
+        <w:t xml:space="preserve">. הממצא ההולנדי שלפיו יחסי הסגל לא ניבאו רווחה כאשר האוטונומיה נכללה במודל </w:t>
+      </w:r>
+      <w:r>
+        <w:rPr>
+          <w:rFonts w:ascii="Times New Roman" w:cs="Times New Roman" w:eastAsia="Times New Roman" w:hAnsi="Times New Roman"/>
+          <w:sz w:val="24"/>
+          <w:szCs w:val="24"/>
+        </w:rPr>
+        <w:t xml:space="preserve">(Van Ginneken et al., 2019)</w:t>
+      </w:r>
+      <w:r>
+        <w:rPr>
+          <w:rFonts w:ascii="David" w:cs="David" w:eastAsia="David" w:hAnsi="David"/>
+          <w:sz w:val="24"/>
+          <w:szCs w:val="24"/>
+          <w:rtl/>
+        </w:rPr>
+        <w:t xml:space="preserve"> מרמז שהמנגנון עובר דרך תחושת השליטה שיחס הוגן מעניק לאסיר. המחקר הנוכחי מוסיף לכך את הכיוון ההפוך: שפוטים שרווחתם הנפשית גבוהה יותר תופסים את הסגל כלגיטימי יותר. שני הכיוונים אינם סותרים. סביר שמדובר במעגל שבו יחס הוגן משפר את הרווחה, ורווחה גבוהה יותר מאפשרת לאסיר לפרש את התנהגות הסגל באור פחות עוין ולפנות אליו כשקשה לו. העובדה שהפריט הקשור ביותר לרווחה הוא דווקא האפשרות לדבר עם הסוהרים כשמודאגים או עצובים מחזקת פירוש זה, ומתיישבת עם ממצאיו של שניטקר </w:t>
+      </w:r>
+      <w:r>
+        <w:rPr>
+          <w:rFonts w:ascii="Times New Roman" w:cs="Times New Roman" w:eastAsia="Times New Roman" w:hAnsi="Times New Roman"/>
+          <w:sz w:val="24"/>
+          <w:szCs w:val="24"/>
+        </w:rPr>
+        <w:t xml:space="preserve">(Schnittker, 2025)</w:t>
+      </w:r>
+      <w:r>
+        <w:rPr>
+          <w:rFonts w:ascii="David" w:cs="David" w:eastAsia="David" w:hAnsi="David"/>
+          <w:sz w:val="24"/>
+          <w:szCs w:val="24"/>
+          <w:rtl/>
+        </w:rPr>
+        <w:t xml:space="preserve"> ממחקר האורך של משוחררי כלא בבוסטון: סביבה של כבוד ואמון בין אסירים לסגל הפחיתה את חוסר האושר בשנה שאחרי השחרור, ואסירים שחוו יחסים תומכים עם הסוהרים פיתחו יחסים תומכים יותר גם בחוץ.</w:t>
       </w:r>
     </w:p>
     <w:p>
@@ -15098,7 +15201,7 @@
           <w:sz w:val="24"/>
           <w:szCs w:val="24"/>
         </w:rPr>
-        <w:t xml:space="preserve">Horowitz, V. L., &amp; Hyatt, J. M. (2025). Trusting relationships in prison and well-being after release. </w:t>
+        <w:t xml:space="preserve">Liebling, A. (2004). </w:t>
       </w:r>
       <w:r>
         <w:rPr>
@@ -15108,7 +15211,7 @@
           <w:sz w:val="24"/>
           <w:szCs w:val="24"/>
         </w:rPr>
-        <w:t xml:space="preserve">International Journal of Law, Crime and Justice, 82</w:t>
+        <w:t xml:space="preserve">Prisons and their moral performance: A study of values, quality, and prison life</w:t>
       </w:r>
       <w:r>
         <w:rPr>
@@ -15118,7 +15221,7 @@
           <w:sz w:val="24"/>
           <w:szCs w:val="24"/>
         </w:rPr>
-        <w:t xml:space="preserve">, Article 100755. https://www.sciencedirect.com/science/article/pii/S2666560325001513</w:t>
+        <w:t xml:space="preserve">. Oxford University Press.</w:t>
       </w:r>
     </w:p>
     <w:p>
@@ -15135,7 +15238,7 @@
           <w:sz w:val="24"/>
           <w:szCs w:val="24"/>
         </w:rPr>
-        <w:t xml:space="preserve">Liebling, A. (2004). </w:t>
+        <w:t xml:space="preserve">Liebling, A., &amp; Maruna, S. (Eds.). (2005). </w:t>
       </w:r>
       <w:r>
         <w:rPr>
@@ -15145,7 +15248,7 @@
           <w:sz w:val="24"/>
           <w:szCs w:val="24"/>
         </w:rPr>
-        <w:t xml:space="preserve">Prisons and their moral performance: A study of values, quality, and prison life</w:t>
+        <w:t xml:space="preserve">The effects of imprisonment</w:t>
       </w:r>
       <w:r>
         <w:rPr>
@@ -15155,7 +15258,7 @@
           <w:sz w:val="24"/>
           <w:szCs w:val="24"/>
         </w:rPr>
-        <w:t xml:space="preserve">. Oxford University Press.</w:t>
+        <w:t xml:space="preserve">. Willan.</w:t>
       </w:r>
     </w:p>
     <w:p>
@@ -15172,7 +15275,7 @@
           <w:sz w:val="24"/>
           <w:szCs w:val="24"/>
         </w:rPr>
-        <w:t xml:space="preserve">Liebling, A., &amp; Maruna, S. (Eds.). (2005). </w:t>
+        <w:t xml:space="preserve">Ryan, C., &amp; Bergin, M. (2022). Procedural justice and legitimacy in prisons: A review of extant empirical literature. </w:t>
       </w:r>
       <w:r>
         <w:rPr>
@@ -15182,7 +15285,7 @@
           <w:sz w:val="24"/>
           <w:szCs w:val="24"/>
         </w:rPr>
-        <w:t xml:space="preserve">The effects of imprisonment</w:t>
+        <w:t xml:space="preserve">Criminal Justice and Behavior, 49</w:t>
       </w:r>
       <w:r>
         <w:rPr>
@@ -15192,7 +15295,7 @@
           <w:sz w:val="24"/>
           <w:szCs w:val="24"/>
         </w:rPr>
-        <w:t xml:space="preserve">. Willan.</w:t>
+        <w:t xml:space="preserve">(2), 143-163. https://doi.org/10.1177/00938548211053367</w:t>
       </w:r>
     </w:p>
     <w:p>
@@ -15209,7 +15312,7 @@
           <w:sz w:val="24"/>
           <w:szCs w:val="24"/>
         </w:rPr>
-        <w:t xml:space="preserve">Ryan, C., &amp; Bergin, M. (2022). Procedural justice and legitimacy in prisons: A review of extant empirical literature. </w:t>
+        <w:t xml:space="preserve">Sargeant, E., Murphy, K., Barkworth, J., &amp; Howard, M. v. A. (2026). Procedural justice and mental well-being in prisons: The mediating roles of staff relationships and prison safety. </w:t>
       </w:r>
       <w:r>
         <w:rPr>
@@ -15219,7 +15322,7 @@
           <w:sz w:val="24"/>
           <w:szCs w:val="24"/>
         </w:rPr>
-        <w:t xml:space="preserve">Criminal Justice and Behavior, 49</w:t>
+        <w:t xml:space="preserve">Criminal Justice and Behavior, 53</w:t>
       </w:r>
       <w:r>
         <w:rPr>
@@ -15229,7 +15332,7 @@
           <w:sz w:val="24"/>
           <w:szCs w:val="24"/>
         </w:rPr>
-        <w:t xml:space="preserve">(2), 143-163. https://doi.org/10.1177/00938548211053367</w:t>
+        <w:t xml:space="preserve">(5), 619-639. https://doi.org/10.1177/00938548251400649</w:t>
       </w:r>
     </w:p>
     <w:p>
@@ -15246,7 +15349,7 @@
           <w:sz w:val="24"/>
           <w:szCs w:val="24"/>
         </w:rPr>
-        <w:t xml:space="preserve">Sargeant, E., Murphy, K., Barkworth, J., &amp; Howard, M. v. A. (2026). Procedural justice and mental well-being in prisons: The mediating roles of staff relationships and prison safety. </w:t>
+        <w:t xml:space="preserve">Schnittker, J. (2025). Trusting relationships in prison and well-being after release. </w:t>
       </w:r>
       <w:r>
         <w:rPr>
@@ -15256,7 +15359,7 @@
           <w:sz w:val="24"/>
           <w:szCs w:val="24"/>
         </w:rPr>
-        <w:t xml:space="preserve">Criminal Justice and Behavior</w:t>
+        <w:t xml:space="preserve">SSM - Mental Health, 8</w:t>
       </w:r>
       <w:r>
         <w:rPr>
@@ -15266,7 +15369,7 @@
           <w:sz w:val="24"/>
           <w:szCs w:val="24"/>
         </w:rPr>
-        <w:t xml:space="preserve">. Advance online publication. https://doi.org/10.1177/00938548251400649</w:t>
+        <w:t xml:space="preserve">, Article 100539. https://doi.org/10.1016/j.ssmmh.2025.100539</w:t>
       </w:r>
     </w:p>
     <w:p>

</xml_diff>

<commit_message>
Restrict seminar sources to supplied and verified articles; add Zohar 22 papers
Co-Authored-By: Claude Fable 5.1 <noreply@anthropic.com>
Claude-Session: https://claude.ai/code/session_01KHo5ZcKCUwhCAvyoKeeMWs
</commit_message>
<xml_diff>
--- a/seminar/סמינריון_רווחה_נפשית_ולגיטימיות.docx
+++ b/seminar/סמינריון_רווחה_נפשית_ולגיטימיות.docx
@@ -506,24 +506,41 @@
           <w:szCs w:val="24"/>
           <w:rtl/>
         </w:rPr>
-        <w:t xml:space="preserve">, על בסיס עבודת שדה בשני בתי סוהר בביטחון מרבי באנגליה, טענו שסדר בבתי סוהר אינו מתקיים בכוח בלבד אלא נשען על תחושת האסירים שהמשטר שבו הם חיים הוגן, ושמי שמפעיל אותו ראוי לציות. תחושה זו היא מה שהספרות מכנה לגיטימיות: המידה שבה הכפופים לסמכות רואים בה סמכות שראוי לציית לה, ולא רק סמכות שאפשר להיענש על ידה </w:t>
-      </w:r>
-      <w:r>
-        <w:rPr>
-          <w:rFonts w:ascii="Times New Roman" w:cs="Times New Roman" w:eastAsia="Times New Roman" w:hAnsi="Times New Roman"/>
-          <w:sz w:val="24"/>
-          <w:szCs w:val="24"/>
-        </w:rPr>
-        <w:t xml:space="preserve">(Tyler, 1990)</w:t>
-      </w:r>
-      <w:r>
-        <w:rPr>
-          <w:rFonts w:ascii="David" w:cs="David" w:eastAsia="David" w:hAnsi="David"/>
-          <w:sz w:val="24"/>
-          <w:szCs w:val="24"/>
-          <w:rtl/>
-        </w:rPr>
-        <w:t xml:space="preserve">. בהקשר הכליאה, הלגיטימיות היא האופן שבו האסיר שופט את הסוהרים ואת אנשי הסגל: האם הם מכבדים אותו, האם אפשר לפנות אליהם, האם בקשותיו מטופלות.</w:t>
+        <w:t xml:space="preserve">, על בסיס עבודת שדה בשני בתי סוהר בביטחון מרבי באנגליה, טענו שסדר בבתי סוהר אינו מתקיים בכוח בלבד אלא נשען על תחושת האסירים שהמשטר שבו הם חיים הוגן, ושמי שמפעיל אותו ראוי לציות. תחושה זו היא מה שהספרות מכנה לגיטימיות: המידה שבה הכפופים לסמכות רואים בה סמכות שראוי לציית לה, ולא רק סמכות שאפשר להיענש על ידה (</w:t>
+      </w:r>
+      <w:r>
+        <w:rPr>
+          <w:rFonts w:ascii="Times New Roman" w:cs="Times New Roman" w:eastAsia="Times New Roman" w:hAnsi="Times New Roman"/>
+          <w:sz w:val="24"/>
+          <w:szCs w:val="24"/>
+        </w:rPr>
+        <w:t xml:space="preserve">Tyler, 1990</w:t>
+      </w:r>
+      <w:r>
+        <w:rPr>
+          <w:rFonts w:ascii="David" w:cs="David" w:eastAsia="David" w:hAnsi="David"/>
+          <w:sz w:val="24"/>
+          <w:szCs w:val="24"/>
+          <w:rtl/>
+        </w:rPr>
+        <w:t xml:space="preserve">, כפי שמצוטט אצל </w:t>
+      </w:r>
+      <w:r>
+        <w:rPr>
+          <w:rFonts w:ascii="Times New Roman" w:cs="Times New Roman" w:eastAsia="Times New Roman" w:hAnsi="Times New Roman"/>
+          <w:sz w:val="24"/>
+          <w:szCs w:val="24"/>
+        </w:rPr>
+        <w:t xml:space="preserve">Sparks &amp; Bottoms, 1995</w:t>
+      </w:r>
+      <w:r>
+        <w:rPr>
+          <w:rFonts w:ascii="David" w:cs="David" w:eastAsia="David" w:hAnsi="David"/>
+          <w:sz w:val="24"/>
+          <w:szCs w:val="24"/>
+          <w:rtl/>
+        </w:rPr>
+        <w:t xml:space="preserve">). בהקשר הכליאה, הלגיטימיות היא האופן שבו האסיר שופט את הסוהרים ואת אנשי הסגל: האם הם מכבדים אותו, האם אפשר לפנות אליהם, האם בקשותיו מטופלות.</w:t>
       </w:r>
     </w:p>
     <w:p>
@@ -649,7 +666,41 @@
           <w:sz w:val="24"/>
           <w:szCs w:val="24"/>
         </w:rPr>
-        <w:t xml:space="preserve">2013</w:t>
+        <w:t xml:space="preserve">2013,</w:t>
+      </w:r>
+      <w:r>
+        <w:rPr>
+          <w:rFonts w:ascii="David" w:cs="David" w:eastAsia="David" w:hAnsi="David"/>
+          <w:sz w:val="24"/>
+          <w:szCs w:val="24"/>
+          <w:rtl/>
+        </w:rPr>
+        <w:t xml:space="preserve"> כפי שמצוטט אצל יכימוביץ-כהן, </w:t>
+      </w:r>
+      <w:r>
+        <w:rPr>
+          <w:rFonts w:ascii="Times New Roman" w:cs="Times New Roman" w:eastAsia="Times New Roman" w:hAnsi="Times New Roman"/>
+          <w:sz w:val="24"/>
+          <w:szCs w:val="24"/>
+        </w:rPr>
+        <w:t xml:space="preserve">2020</w:t>
+      </w:r>
+      <w:r>
+        <w:rPr>
+          <w:rFonts w:ascii="David" w:cs="David" w:eastAsia="David" w:hAnsi="David"/>
+          <w:sz w:val="24"/>
+          <w:szCs w:val="24"/>
+          <w:rtl/>
+        </w:rPr>
+        <w:t xml:space="preserve">). ענף המחקר של שירות בתי הסוהר מקדם בשנים האחרונות מדיניות מבוססת נתונים, ובכלל זה הערכה שיטתית של תוכניות התקון (ועקנין, </w:t>
+      </w:r>
+      <w:r>
+        <w:rPr>
+          <w:rFonts w:ascii="Times New Roman" w:cs="Times New Roman" w:eastAsia="Times New Roman" w:hAnsi="Times New Roman"/>
+          <w:sz w:val="24"/>
+          <w:szCs w:val="24"/>
+        </w:rPr>
+        <w:t xml:space="preserve">2025</w:t>
       </w:r>
       <w:r>
         <w:rPr>
@@ -760,24 +811,24 @@
           <w:szCs w:val="24"/>
           <w:rtl/>
         </w:rPr>
-        <w:t xml:space="preserve">). תהליכי ההסתגלות למאסר, שהם חלק ממוקד המחקר, רלוונטיים לשפוטים יותר מלעצורים </w:t>
-      </w:r>
-      <w:r>
-        <w:rPr>
-          <w:rFonts w:ascii="Times New Roman" w:cs="Times New Roman" w:eastAsia="Times New Roman" w:hAnsi="Times New Roman"/>
-          <w:sz w:val="24"/>
-          <w:szCs w:val="24"/>
-        </w:rPr>
-        <w:t xml:space="preserve">(Liebling &amp; Maruna, 2005)</w:t>
-      </w:r>
-      <w:r>
-        <w:rPr>
-          <w:rFonts w:ascii="David" w:cs="David" w:eastAsia="David" w:hAnsi="David"/>
-          <w:sz w:val="24"/>
-          <w:szCs w:val="24"/>
-          <w:rtl/>
-        </w:rPr>
-        <w:t xml:space="preserve">.</w:t>
+        <w:t xml:space="preserve">). תהליכי ההסתגלות למאסר, שהם חלק ממוקד המחקר, רלוונטיים לשפוטים יותר מלעצורים, ומחקר ישראלי עדכני הראה שהסתגלות זו עשויה להסתיר מצוקה נפשית שאינה מזוהה (יפתח-שרצקי והראל, </w:t>
+      </w:r>
+      <w:r>
+        <w:rPr>
+          <w:rFonts w:ascii="Times New Roman" w:cs="Times New Roman" w:eastAsia="Times New Roman" w:hAnsi="Times New Roman"/>
+          <w:sz w:val="24"/>
+          <w:szCs w:val="24"/>
+        </w:rPr>
+        <w:t xml:space="preserve">2024</w:t>
+      </w:r>
+      <w:r>
+        <w:rPr>
+          <w:rFonts w:ascii="David" w:cs="David" w:eastAsia="David" w:hAnsi="David"/>
+          <w:sz w:val="24"/>
+          <w:szCs w:val="24"/>
+          <w:rtl/>
+        </w:rPr>
+        <w:t xml:space="preserve">).</w:t>
       </w:r>
     </w:p>
     <w:p>
@@ -871,24 +922,24 @@
           <w:szCs w:val="24"/>
           <w:rtl/>
         </w:rPr>
-        <w:t xml:space="preserve">נקודת המוצא לכל דיון בהסתגלות למאסר היא עבודתו של סייקס </w:t>
-      </w:r>
-      <w:r>
-        <w:rPr>
-          <w:rFonts w:ascii="Times New Roman" w:cs="Times New Roman" w:eastAsia="Times New Roman" w:hAnsi="Times New Roman"/>
-          <w:sz w:val="24"/>
-          <w:szCs w:val="24"/>
-        </w:rPr>
-        <w:t xml:space="preserve">(Sykes, 1958)</w:t>
-      </w:r>
-      <w:r>
-        <w:rPr>
-          <w:rFonts w:ascii="David" w:cs="David" w:eastAsia="David" w:hAnsi="David"/>
-          <w:sz w:val="24"/>
-          <w:szCs w:val="24"/>
-          <w:rtl/>
-        </w:rPr>
-        <w:t xml:space="preserve">, שתיאר את "כאבי המאסר": אובדן החירות, אובדן טובין ושירותים, אובדן קשרים אינטימיים, אובדן האוטונומיה ואובדן תחושת הביטחון. סייקס ראה בכאבים אלו לא רק אי-נוחות אלא איום על תפיסת העצמי של האסיר, וטען שחיי האגף הם תגובה קולקטיבית לאיום זה. מודל המחסור שנגזר מעבודתו מניח שהתנהגות האסיר היא תוצאה ישירה של סביבת בית הסוהר, ולכן תנאי כליאה נוקשים צפויים להוליד התנהגות שלילית יותר (דוידסקו וולק, </w:t>
+        <w:t xml:space="preserve">נקודת המוצא לכל דיון בהסתגלות למאסר היא מודל המחסור, שנוסח בעקבות עבודתו של סייקס על "כאבי המאסר": אובדן החירות, אובדן טובין ושירותים, אובדן קשרים אינטימיים, אובדן האוטונומיה ואובדן תחושת הביטחון. המודל מניח שהתנהגות האסיר היא תוצאה ישירה של סביבת בית הסוהר, ולכן תנאי כליאה נוקשים צפויים להוליד התנהגות שלילית יותר, ובכלל זה הפרות משמעת ואלימות (</w:t>
+      </w:r>
+      <w:r>
+        <w:rPr>
+          <w:rFonts w:ascii="Times New Roman" w:cs="Times New Roman" w:eastAsia="Times New Roman" w:hAnsi="Times New Roman"/>
+          <w:sz w:val="24"/>
+          <w:szCs w:val="24"/>
+        </w:rPr>
+        <w:t xml:space="preserve">Sykes, 1958</w:t>
+      </w:r>
+      <w:r>
+        <w:rPr>
+          <w:rFonts w:ascii="David" w:cs="David" w:eastAsia="David" w:hAnsi="David"/>
+          <w:sz w:val="24"/>
+          <w:szCs w:val="24"/>
+          <w:rtl/>
+        </w:rPr>
+        <w:t xml:space="preserve">, כפי שמצוטט אצל דוידסקו וולק, </w:t>
       </w:r>
       <w:r>
         <w:rPr>
@@ -905,7 +956,24 @@
           <w:szCs w:val="24"/>
           <w:rtl/>
         </w:rPr>
-        <w:t xml:space="preserve">). חמשת הכאבים הללו הם הבסיס שממנו צומחת השאלה כיצד אדם מסתגל למקום שנועד לשלול ממנו כמעט הכול.</w:t>
+        <w:t xml:space="preserve">). סקירת הספרות של שירות בתי הסוהר, שבחנה את הקשר בין תנאי הכליאה הפיזיים לבין התנהגות אסירים, אובדנות ורצידיביזם, מצאה שתנאי כליאה קשים מקושרים לאלימות ולאובדנות, ושקבוצות מסוימות, ובהן אסירים בסיכון אובדני, רגישות להם במיוחד (דוידסקו וולק, </w:t>
+      </w:r>
+      <w:r>
+        <w:rPr>
+          <w:rFonts w:ascii="Times New Roman" w:cs="Times New Roman" w:eastAsia="Times New Roman" w:hAnsi="Times New Roman"/>
+          <w:sz w:val="24"/>
+          <w:szCs w:val="24"/>
+        </w:rPr>
+        <w:t xml:space="preserve">2015</w:t>
+      </w:r>
+      <w:r>
+        <w:rPr>
+          <w:rFonts w:ascii="David" w:cs="David" w:eastAsia="David" w:hAnsi="David"/>
+          <w:sz w:val="24"/>
+          <w:szCs w:val="24"/>
+          <w:rtl/>
+        </w:rPr>
+        <w:t xml:space="preserve">). מכאן צומחת השאלה כיצד אדם מסתגל למקום שנועד לשלול ממנו כמעט הכול.</w:t>
       </w:r>
     </w:p>
     <w:p>
@@ -922,41 +990,41 @@
           <w:szCs w:val="24"/>
           <w:rtl/>
         </w:rPr>
-        <w:t xml:space="preserve">הספרות המאוחרת עברה מתיאור כללי של המאסר לבחינה של הבדלים בין בתי סוהר ובין אסירים. ליבלינג ומרונה </w:t>
-      </w:r>
-      <w:r>
-        <w:rPr>
-          <w:rFonts w:ascii="Times New Roman" w:cs="Times New Roman" w:eastAsia="Times New Roman" w:hAnsi="Times New Roman"/>
-          <w:sz w:val="24"/>
-          <w:szCs w:val="24"/>
-        </w:rPr>
-        <w:t xml:space="preserve">(Liebling &amp; Maruna, 2005)</w:t>
-      </w:r>
-      <w:r>
-        <w:rPr>
-          <w:rFonts w:ascii="David" w:cs="David" w:eastAsia="David" w:hAnsi="David"/>
-          <w:sz w:val="24"/>
-          <w:szCs w:val="24"/>
-          <w:rtl/>
-        </w:rPr>
-        <w:t xml:space="preserve"> הראו שהשפעות המאסר אינן אחידות: תקופת הקליטה היא הפגיעה ביותר, והמצוקה הנפשית מרוכזת בשבועות הראשונים. ליבלינג </w:t>
-      </w:r>
-      <w:r>
-        <w:rPr>
-          <w:rFonts w:ascii="Times New Roman" w:cs="Times New Roman" w:eastAsia="Times New Roman" w:hAnsi="Times New Roman"/>
-          <w:sz w:val="24"/>
-          <w:szCs w:val="24"/>
-        </w:rPr>
-        <w:t xml:space="preserve">(Liebling, 2004)</w:t>
-      </w:r>
-      <w:r>
-        <w:rPr>
-          <w:rFonts w:ascii="David" w:cs="David" w:eastAsia="David" w:hAnsi="David"/>
-          <w:sz w:val="24"/>
-          <w:szCs w:val="24"/>
-          <w:rtl/>
-        </w:rPr>
-        <w:t xml:space="preserve"> הוסיפה מסגרת מושגית שקראה לה "הביצוע המוסרי" של בית הסוהר, שכולל כבוד, אנושיות, יחסים עם הסגל, הוגנות וביטחון, ומצאה שממדים אלו נבדלים בין מוסדות ומתואמים עם רמת המצוקה של האסירים. בהמשך לכך זיהו אוטי וליבלינג </w:t>
+        <w:t xml:space="preserve">הספרות המאוחרת עברה מתיאור כללי של המאסר לבחינה של הבדלים בין בתי סוהר ובין אסירים. במרכזה עומדת מסגרת "איכות החיים המוסרית" של בית הסוהר, שפותחה בקיימברידג' וזיהתה שמה שחשוב ביותר לאסירים אינו התנאים החומריים אלא היחסים עם הסגל, ההוגנות, הביטחון, האנושיות והאמון (</w:t>
+      </w:r>
+      <w:r>
+        <w:rPr>
+          <w:rFonts w:ascii="Times New Roman" w:cs="Times New Roman" w:eastAsia="Times New Roman" w:hAnsi="Times New Roman"/>
+          <w:sz w:val="24"/>
+          <w:szCs w:val="24"/>
+        </w:rPr>
+        <w:t xml:space="preserve">Liebling, 2004</w:t>
+      </w:r>
+      <w:r>
+        <w:rPr>
+          <w:rFonts w:ascii="David" w:cs="David" w:eastAsia="David" w:hAnsi="David"/>
+          <w:sz w:val="24"/>
+          <w:szCs w:val="24"/>
+          <w:rtl/>
+        </w:rPr>
+        <w:t xml:space="preserve">, כפי שמצוטט אצל </w:t>
+      </w:r>
+      <w:r>
+        <w:rPr>
+          <w:rFonts w:ascii="Times New Roman" w:cs="Times New Roman" w:eastAsia="Times New Roman" w:hAnsi="Times New Roman"/>
+          <w:sz w:val="24"/>
+          <w:szCs w:val="24"/>
+        </w:rPr>
+        <w:t xml:space="preserve">Auty &amp; Liebling, 2024</w:t>
+      </w:r>
+      <w:r>
+        <w:rPr>
+          <w:rFonts w:ascii="David" w:cs="David" w:eastAsia="David" w:hAnsi="David"/>
+          <w:sz w:val="24"/>
+          <w:szCs w:val="24"/>
+          <w:rtl/>
+        </w:rPr>
+        <w:t xml:space="preserve">). בהמשך לכך זיהו אוטי וליבלינג </w:t>
       </w:r>
       <w:r>
         <w:rPr>
@@ -1126,7 +1194,41 @@
           <w:szCs w:val="24"/>
           <w:rtl/>
         </w:rPr>
-        <w:t xml:space="preserve"> אסירים, באמצעות סקר "החיים במשמורת" שממנו נגזר גם השאלון הישראלי. הם מצאו שרוב השונות ברווחה נמצאת ברמת האסיר ולא ברמת האגף, ושתפיסות אישיות של אוטונומיה, ביטחון ויחסים עם אסירים אחרים קשורות לרווחה גבוהה יותר. היחסים עם הסגל, בניגוד לצפוי, לא נמצאו קשורים לרווחה באופן ישיר, והחוקרים הסבירו זאת במתאם בין יחסי הסגל לתחושת האוטונומיה: יחס הוגן של הסוהרים מגדיל את תחושת השליטה של האסיר, וזו שקשורה לרווחה.</w:t>
+        <w:t xml:space="preserve"> אסירים, באמצעות סקר "החיים במשמורת" שממנו נגזר גם השאלון הישראלי. הם מצאו שרוב השונות ברווחה נמצאת ברמת האסיר ולא ברמת האגף, ושתפיסות אישיות של אוטונומיה, ביטחון ויחסים עם אסירים אחרים קשורות לרווחה גבוהה יותר. היחסים עם הסגל, בניגוד לצפוי, לא נמצאו קשורים לרווחה באופן ישיר, והחוקרים הסבירו זאת במתאם בין יחסי הסגל לתחושת האוטונומיה: יחס הוגן של הסוהרים מגדיל את תחושת השליטה של האסיר, וזו שקשורה לרווחה. ממצא ישראלי מקביל עלה במרכזי החינוך של שירות בתי הסוהר, שם תמיכה של הסגל בצרכים הפסיכולוגיים של האסירים, ובראשם אוטונומיה וקשר, ניבאה מוטיבציה אוטונומית והתמדה בלמידה בקרב </w:t>
+      </w:r>
+      <w:r>
+        <w:rPr>
+          <w:rFonts w:ascii="Times New Roman" w:cs="Times New Roman" w:eastAsia="Times New Roman" w:hAnsi="Times New Roman"/>
+          <w:sz w:val="24"/>
+          <w:szCs w:val="24"/>
+        </w:rPr>
+        <w:t xml:space="preserve">271</w:t>
+      </w:r>
+      <w:r>
+        <w:rPr>
+          <w:rFonts w:ascii="David" w:cs="David" w:eastAsia="David" w:hAnsi="David"/>
+          <w:sz w:val="24"/>
+          <w:szCs w:val="24"/>
+          <w:rtl/>
+        </w:rPr>
+        <w:t xml:space="preserve"> אסירים (נחשון דהן וכץ, </w:t>
+      </w:r>
+      <w:r>
+        <w:rPr>
+          <w:rFonts w:ascii="Times New Roman" w:cs="Times New Roman" w:eastAsia="Times New Roman" w:hAnsi="Times New Roman"/>
+          <w:sz w:val="24"/>
+          <w:szCs w:val="24"/>
+        </w:rPr>
+        <w:t xml:space="preserve">2024</w:t>
+      </w:r>
+      <w:r>
+        <w:rPr>
+          <w:rFonts w:ascii="David" w:cs="David" w:eastAsia="David" w:hAnsi="David"/>
+          <w:sz w:val="24"/>
+          <w:szCs w:val="24"/>
+          <w:rtl/>
+        </w:rPr>
+        <w:t xml:space="preserve">).</w:t>
       </w:r>
     </w:p>
     <w:p>
@@ -1143,41 +1245,7 @@
           <w:szCs w:val="24"/>
           <w:rtl/>
         </w:rPr>
-        <w:t xml:space="preserve">הקשר בין יחס הסגל לרווחה נחקר גם במערכי אורך. בייארסברגן ואחרים </w:t>
-      </w:r>
-      <w:r>
-        <w:rPr>
-          <w:rFonts w:ascii="Times New Roman" w:cs="Times New Roman" w:eastAsia="Times New Roman" w:hAnsi="Times New Roman"/>
-          <w:sz w:val="24"/>
-          <w:szCs w:val="24"/>
-        </w:rPr>
-        <w:t xml:space="preserve">(Beijersbergen et al., 2014)</w:t>
-      </w:r>
-      <w:r>
-        <w:rPr>
-          <w:rFonts w:ascii="David" w:cs="David" w:eastAsia="David" w:hAnsi="David"/>
-          <w:sz w:val="24"/>
-          <w:szCs w:val="24"/>
-          <w:rtl/>
-        </w:rPr>
-        <w:t xml:space="preserve"> ראיינו </w:t>
-      </w:r>
-      <w:r>
-        <w:rPr>
-          <w:rFonts w:ascii="Times New Roman" w:cs="Times New Roman" w:eastAsia="Times New Roman" w:hAnsi="Times New Roman"/>
-          <w:sz w:val="24"/>
-          <w:szCs w:val="24"/>
-        </w:rPr>
-        <w:t xml:space="preserve">824</w:t>
-      </w:r>
-      <w:r>
-        <w:rPr>
-          <w:rFonts w:ascii="David" w:cs="David" w:eastAsia="David" w:hAnsi="David"/>
-          <w:sz w:val="24"/>
-          <w:szCs w:val="24"/>
-          <w:rtl/>
-        </w:rPr>
-        <w:t xml:space="preserve"> אסירים גברים שלושה שבועות ושלושה חודשים לאחר קליטתם, ומצאו שתפיסה של יחס הוגן מצד הסוהרים בזמן הראשון ניבאה פחות בעיות נפשיות בזמן השני. באוסטרליה עקבו סרג'נט ואחרים </w:t>
+        <w:t xml:space="preserve">הקשר בין יחס הסגל לרווחה נחקר גם במערכי אורך. באוסטרליה עקבו סרג'נט ואחרים </w:t>
       </w:r>
       <w:r>
         <w:rPr>
@@ -1194,24 +1262,126 @@
           <w:szCs w:val="24"/>
           <w:rtl/>
         </w:rPr>
-        <w:t xml:space="preserve"> אחר אסירים בניו סאות' ויילס בשלוש נקודות זמן ומצאו שצדק פרוצדורלי קשור לרווחה נפשית גבוהה יותר. בנתוני החתך תיווכו את הקשר גם היחסים עם הסגל וגם תחושת הביטחון, אך בניתוח האורך רק היחסים עם הסגל תיווכו אותו, והחוקרים הסיקו שהכשרת סוהרים בצדק פרוצדורלי היא הדרך המעשית לשפר את רווחת האסירים. גם בבתי מעצר בארצות הברית נמצא שתפיסה גבוהה של צדק פרוצדורלי קשורה לפחות מחשבות אובדניות </w:t>
-      </w:r>
-      <w:r>
-        <w:rPr>
-          <w:rFonts w:ascii="Times New Roman" w:cs="Times New Roman" w:eastAsia="Times New Roman" w:hAnsi="Times New Roman"/>
-          <w:sz w:val="24"/>
-          <w:szCs w:val="24"/>
-        </w:rPr>
-        <w:t xml:space="preserve">(Abderhalden &amp; Alward, 2024)</w:t>
-      </w:r>
-      <w:r>
-        <w:rPr>
-          <w:rFonts w:ascii="David" w:cs="David" w:eastAsia="David" w:hAnsi="David"/>
-          <w:sz w:val="24"/>
-          <w:szCs w:val="24"/>
-          <w:rtl/>
-        </w:rPr>
-        <w:t xml:space="preserve">. כיוון ההשפעה במחקרים אלו הוא מיחס הסגל אל הרווחה. המחקר הנוכחי בוחן את הכיוון ההפוך, הרווחה הנפשית כמנבאת של תפיסת הסגל, ומכיוון שהוא מתאמי, אין בו כדי להכריע בין השניים אלא לבחון אם הקשר קיים בישראל ומה עוצמתו.</w:t>
+        <w:t xml:space="preserve"> אחר אסירים בניו סאות' ויילס בשלוש נקודות זמן ומצאו שצדק פרוצדורלי קשור לרווחה נפשית גבוהה יותר. בנתוני החתך תיווכו את הקשר גם היחסים עם הסגל וגם תחושת הביטחון, אך בניתוח האורך רק היחסים עם הסגל תיווכו אותו, והחוקרים הסיקו שהכשרת סוהרים בצדק פרוצדורלי היא הדרך המעשית לשפר את רווחת האסירים. הם נשענו על מחקר הולנדי קודם, שבו תפיסת יחס הוגן מצד הסוהרים שלושה שבועות אחרי הקליטה ניבאה פחות בעיות נפשיות שלושה חודשים אחריה (</w:t>
+      </w:r>
+      <w:r>
+        <w:rPr>
+          <w:rFonts w:ascii="Times New Roman" w:cs="Times New Roman" w:eastAsia="Times New Roman" w:hAnsi="Times New Roman"/>
+          <w:sz w:val="24"/>
+          <w:szCs w:val="24"/>
+        </w:rPr>
+        <w:t xml:space="preserve">Beijersbergen et al., 2014</w:t>
+      </w:r>
+      <w:r>
+        <w:rPr>
+          <w:rFonts w:ascii="David" w:cs="David" w:eastAsia="David" w:hAnsi="David"/>
+          <w:sz w:val="24"/>
+          <w:szCs w:val="24"/>
+          <w:rtl/>
+        </w:rPr>
+        <w:t xml:space="preserve">, כפי שמצוטט אצל </w:t>
+      </w:r>
+      <w:r>
+        <w:rPr>
+          <w:rFonts w:ascii="Times New Roman" w:cs="Times New Roman" w:eastAsia="Times New Roman" w:hAnsi="Times New Roman"/>
+          <w:sz w:val="24"/>
+          <w:szCs w:val="24"/>
+        </w:rPr>
+        <w:t xml:space="preserve">Sargeant et al., 2026</w:t>
+      </w:r>
+      <w:r>
+        <w:rPr>
+          <w:rFonts w:ascii="David" w:cs="David" w:eastAsia="David" w:hAnsi="David"/>
+          <w:sz w:val="24"/>
+          <w:szCs w:val="24"/>
+          <w:rtl/>
+        </w:rPr>
+        <w:t xml:space="preserve">). בישראל, מחקר בקרב </w:t>
+      </w:r>
+      <w:r>
+        <w:rPr>
+          <w:rFonts w:ascii="Times New Roman" w:cs="Times New Roman" w:eastAsia="Times New Roman" w:hAnsi="Times New Roman"/>
+          <w:sz w:val="24"/>
+          <w:szCs w:val="24"/>
+        </w:rPr>
+        <w:t xml:space="preserve">76</w:t>
+      </w:r>
+      <w:r>
+        <w:rPr>
+          <w:rFonts w:ascii="David" w:cs="David" w:eastAsia="David" w:hAnsi="David"/>
+          <w:sz w:val="24"/>
+          <w:szCs w:val="24"/>
+          <w:rtl/>
+        </w:rPr>
+        <w:t xml:space="preserve"> אסירים בכלא צלמון ובכלא מעשיהו מצא ש</w:t>
+      </w:r>
+      <w:r>
+        <w:rPr>
+          <w:rFonts w:ascii="Times New Roman" w:cs="Times New Roman" w:eastAsia="Times New Roman" w:hAnsi="Times New Roman"/>
+          <w:sz w:val="24"/>
+          <w:szCs w:val="24"/>
+        </w:rPr>
+        <w:t xml:space="preserve">-63.5</w:t>
+      </w:r>
+      <w:r>
+        <w:rPr>
+          <w:rFonts w:ascii="David" w:cs="David" w:eastAsia="David" w:hAnsi="David"/>
+          <w:sz w:val="24"/>
+          <w:szCs w:val="24"/>
+          <w:rtl/>
+        </w:rPr>
+        <w:t xml:space="preserve"> אחוזים מהם סובלים מתסמינים פוסט-טראומטיים ברמות חומרה שונות, אך תסמינים אלו לא נמצאו קשורים לתפקודם בכלא. החוקרות הציעו שאסירים אלו עוטים "מסכת כלא" רגשית והתנהגותית כדי להסתגל, כך שדווקא האוכלוסייה שנחשבת שקטה ומסתגלת גוררת מצוקה שאינה מזוהה (יפתח-שרצקי והראל, </w:t>
+      </w:r>
+      <w:r>
+        <w:rPr>
+          <w:rFonts w:ascii="Times New Roman" w:cs="Times New Roman" w:eastAsia="Times New Roman" w:hAnsi="Times New Roman"/>
+          <w:sz w:val="24"/>
+          <w:szCs w:val="24"/>
+        </w:rPr>
+        <w:t xml:space="preserve">2024</w:t>
+      </w:r>
+      <w:r>
+        <w:rPr>
+          <w:rFonts w:ascii="David" w:cs="David" w:eastAsia="David" w:hAnsi="David"/>
+          <w:sz w:val="24"/>
+          <w:szCs w:val="24"/>
+          <w:rtl/>
+        </w:rPr>
+        <w:t xml:space="preserve">). לעומת זאת, מחקר ישראלי אחר הראה שהרווחה הנפשית הסובייקטיבית של אסירים אינה קבועה: בקרב </w:t>
+      </w:r>
+      <w:r>
+        <w:rPr>
+          <w:rFonts w:ascii="Times New Roman" w:cs="Times New Roman" w:eastAsia="Times New Roman" w:hAnsi="Times New Roman"/>
+          <w:sz w:val="24"/>
+          <w:szCs w:val="24"/>
+        </w:rPr>
+        <w:t xml:space="preserve">93</w:t>
+      </w:r>
+      <w:r>
+        <w:rPr>
+          <w:rFonts w:ascii="David" w:cs="David" w:eastAsia="David" w:hAnsi="David"/>
+          <w:sz w:val="24"/>
+          <w:szCs w:val="24"/>
+          <w:rtl/>
+        </w:rPr>
+        <w:t xml:space="preserve"> גברים שהשתתפו בקבוצה פסיכו-חינוכית מכינה לטיפול, ירדו מדדי המצוקה, הדיכאון והחרדה ועלתה הרווחה הנפשית הסובייקטיבית בתום ההשתתפות (שני ואחרים, </w:t>
+      </w:r>
+      <w:r>
+        <w:rPr>
+          <w:rFonts w:ascii="Times New Roman" w:cs="Times New Roman" w:eastAsia="Times New Roman" w:hAnsi="Times New Roman"/>
+          <w:sz w:val="24"/>
+          <w:szCs w:val="24"/>
+        </w:rPr>
+        <w:t xml:space="preserve">2024</w:t>
+      </w:r>
+      <w:r>
+        <w:rPr>
+          <w:rFonts w:ascii="David" w:cs="David" w:eastAsia="David" w:hAnsi="David"/>
+          <w:sz w:val="24"/>
+          <w:szCs w:val="24"/>
+          <w:rtl/>
+        </w:rPr>
+        <w:t xml:space="preserve">). כיוון ההשפעה במחקרים אלו הוא מיחס הסגל ומההתערבות אל הרווחה. המחקר הנוכחי בוחן את הכיוון ההפוך, הרווחה הנפשית כמנבאת של תפיסת הסגל, ומכיוון שהוא מתאמי, אין בו כדי להכריע בין השניים אלא לבחון אם הקשר קיים בישראל ומה עוצמתו.</w:t>
       </w:r>
     </w:p>
     <w:p>
@@ -1248,24 +1418,7 @@
           <w:szCs w:val="24"/>
           <w:rtl/>
         </w:rPr>
-        <w:t xml:space="preserve">המודל המבוסס-תהליך של טיילר </w:t>
-      </w:r>
-      <w:r>
-        <w:rPr>
-          <w:rFonts w:ascii="Times New Roman" w:cs="Times New Roman" w:eastAsia="Times New Roman" w:hAnsi="Times New Roman"/>
-          <w:sz w:val="24"/>
-          <w:szCs w:val="24"/>
-        </w:rPr>
-        <w:t xml:space="preserve">(Tyler, 1990)</w:t>
-      </w:r>
-      <w:r>
-        <w:rPr>
-          <w:rFonts w:ascii="David" w:cs="David" w:eastAsia="David" w:hAnsi="David"/>
-          <w:sz w:val="24"/>
-          <w:szCs w:val="24"/>
-          <w:rtl/>
-        </w:rPr>
-        <w:t xml:space="preserve"> הוא הבסיס התאורטי של רוב מחקרי הלגיטימיות בכליאה. טיילר הראה, בתחילה ביחס למשטרה ולבתי המשפט, שאנשים מצייתים לחוק בעיקר משום שהם תופסים את הרשות כלגיטימית, ושהלגיטימיות נבנית דרך צדק פרוצדורלי: מתן קול, ניטרליות בקבלת החלטות, יחס מכבד ותחושה שהרשות פועלת בתום לב. ספרקס ובוטומס </w:t>
+        <w:t xml:space="preserve">הבסיס התאורטי של מחקרי הלגיטימיות בכליאה הונח על ידי ספרקס ובוטומס </w:t>
       </w:r>
       <w:r>
         <w:rPr>
@@ -1282,7 +1435,41 @@
           <w:szCs w:val="24"/>
           <w:rtl/>
         </w:rPr>
-        <w:t xml:space="preserve"> העבירו את המודל אל בית הסוהר וטענו שדווקא במקום שבו פערי הכוח קיצוניים, האופן שבו הסמכות מופעלת קובע אם היא תזכה לציות נורמטיבי או רק לציות אינסטרומנטלי מפחד.</w:t>
+        <w:t xml:space="preserve">, שהעבירו אל בית הסוהר את תאוריות הלגיטימיות של ביתהם ושל טיילר. לפי טיילר, אנשים מצייתים לרשות בעיקר משום שהם תופסים אותה כלגיטימית, והלגיטימיות נבנית דרך צדק פרוצדורלי, כלומר דרך האופן שבו ההחלטות מתקבלות ולא רק דרך תוצאותיהן (</w:t>
+      </w:r>
+      <w:r>
+        <w:rPr>
+          <w:rFonts w:ascii="Times New Roman" w:cs="Times New Roman" w:eastAsia="Times New Roman" w:hAnsi="Times New Roman"/>
+          <w:sz w:val="24"/>
+          <w:szCs w:val="24"/>
+        </w:rPr>
+        <w:t xml:space="preserve">Tyler, 1990</w:t>
+      </w:r>
+      <w:r>
+        <w:rPr>
+          <w:rFonts w:ascii="David" w:cs="David" w:eastAsia="David" w:hAnsi="David"/>
+          <w:sz w:val="24"/>
+          <w:szCs w:val="24"/>
+          <w:rtl/>
+        </w:rPr>
+        <w:t xml:space="preserve">, כפי שמצוטט אצל </w:t>
+      </w:r>
+      <w:r>
+        <w:rPr>
+          <w:rFonts w:ascii="Times New Roman" w:cs="Times New Roman" w:eastAsia="Times New Roman" w:hAnsi="Times New Roman"/>
+          <w:sz w:val="24"/>
+          <w:szCs w:val="24"/>
+        </w:rPr>
+        <w:t xml:space="preserve">Sparks &amp; Bottoms, 1995</w:t>
+      </w:r>
+      <w:r>
+        <w:rPr>
+          <w:rFonts w:ascii="David" w:cs="David" w:eastAsia="David" w:hAnsi="David"/>
+          <w:sz w:val="24"/>
+          <w:szCs w:val="24"/>
+          <w:rtl/>
+        </w:rPr>
+        <w:t xml:space="preserve">). ספרקס ובוטומס טענו שבתי סוהר סובלים מבעיית לגיטימציה כרונית, אך שאפשר לזהות את התנאים שבהם אסירים מעניקים לסגל ולמשטר מידה של הכרה: סדירות ויעילות במתן השירותים, הוגנות חלוקתית ופרוצדורלית ביחס, ואיכויות אנושיות בשגרת היום. דווקא במקום שבו פערי הכוח קיצוניים, האופן שבו הסמכות מופעלת קובע אם היא תזכה לציות נורמטיבי או רק לציות אינסטרומנטלי מפחד.</w:t>
       </w:r>
     </w:p>
     <w:p>
@@ -1435,7 +1622,7 @@
           <w:szCs w:val="24"/>
           <w:rtl/>
         </w:rPr>
-        <w:t xml:space="preserve">שני ממצאים נוספים חשובים למחקר הנוכחי. פרנקה ואחרים </w:t>
+        <w:t xml:space="preserve">ממצא נוסף חשוב למחקר הנוכחי. פרנקה ואחרים </w:t>
       </w:r>
       <w:r>
         <w:rPr>
@@ -1452,24 +1639,7 @@
           <w:szCs w:val="24"/>
           <w:rtl/>
         </w:rPr>
-        <w:t xml:space="preserve"> הראו בניסוי אקראי שתפיסת הלגיטימיות משתנה במהלך המאסר: בית הסוהר הרגיל פגע בה, ומה שהסביר את הפגיעה היה ריבוי חוויות שליליות ודלות סביבתית. מכאן שהזמן שאדם שוהה במוסד אינו ניטרלי, ושהמרכיבים המעצבים את הרווחה הנפשית הם גם המרכיבים המעצבים את הלגיטימיות. ון הול ואחרים </w:t>
-      </w:r>
-      <w:r>
-        <w:rPr>
-          <w:rFonts w:ascii="Times New Roman" w:cs="Times New Roman" w:eastAsia="Times New Roman" w:hAnsi="Times New Roman"/>
-          <w:sz w:val="24"/>
-          <w:szCs w:val="24"/>
-        </w:rPr>
-        <w:t xml:space="preserve">(van Hall et al., 2025)</w:t>
-      </w:r>
-      <w:r>
-        <w:rPr>
-          <w:rFonts w:ascii="David" w:cs="David" w:eastAsia="David" w:hAnsi="David"/>
-          <w:sz w:val="24"/>
-          <w:szCs w:val="24"/>
-          <w:rtl/>
-        </w:rPr>
-        <w:t xml:space="preserve"> הוסיפו שהלגיטימיות שנבנית בבית הסוהר "נשפכת" החוצה: אסירים שחשו שהסגל נהג בהם בהוגנות תפסו גם את קצין המבחן שלהם כהוגן יותר, וסיכוייהם להיות מורשעים שוב בתוך שנה היו נמוכים יותר. סקירת ההיקף של ראיין וברגין </w:t>
+        <w:t xml:space="preserve"> הראו בניסוי אקראי שתפיסת הלגיטימיות משתנה במהלך המאסר: בית הסוהר הרגיל פגע בה, ומה שהסביר את הפגיעה היה ריבוי חוויות שליליות ודלות סביבתית. מכאן שהזמן שאדם שוהה במוסד אינו ניטרלי, ושהמרכיבים המעצבים את הרווחה הנפשית הם גם המרכיבים המעצבים את הלגיטימיות. סקירת ההיקף של ראיין וברגין </w:t>
       </w:r>
       <w:r>
         <w:rPr>
@@ -1647,7 +1817,7 @@
           <w:sz w:val="24"/>
           <w:szCs w:val="24"/>
         </w:rPr>
-        <w:t xml:space="preserve">(Beijersbergen et al., 2014; Sargeant et al., 2026)</w:t>
+        <w:t xml:space="preserve">(Sargeant et al., 2026)</w:t>
       </w:r>
       <w:r>
         <w:rPr>
@@ -2851,24 +3021,24 @@
           <w:szCs w:val="24"/>
           <w:rtl/>
         </w:rPr>
-        <w:t xml:space="preserve">לגיטימיות של הסגל. הסולם כולל שלושה פריטים: "אני יכול לדבר עם הסוהרים באגף אם אני מודאג או עצוב", "הסוהרים באגף מתייחסים אליי בכבוד" ו"אני מרוצה מהטיפול בבקשות שלי". שלושת הפריטים מבטאים שלושה מרכיבים של צדק פרוצדורלי במודל של טיילר </w:t>
-      </w:r>
-      <w:r>
-        <w:rPr>
-          <w:rFonts w:ascii="Times New Roman" w:cs="Times New Roman" w:eastAsia="Times New Roman" w:hAnsi="Times New Roman"/>
-          <w:sz w:val="24"/>
-          <w:szCs w:val="24"/>
-        </w:rPr>
-        <w:t xml:space="preserve">(Tyler, 1990)</w:t>
-      </w:r>
-      <w:r>
-        <w:rPr>
-          <w:rFonts w:ascii="David" w:cs="David" w:eastAsia="David" w:hAnsi="David"/>
-          <w:sz w:val="24"/>
-          <w:szCs w:val="24"/>
-          <w:rtl/>
-        </w:rPr>
-        <w:t xml:space="preserve">: נגישות ומתן קול, יחס מכבד, והוגנות בטיפול בבקשות. בסקר המקורי מהימנות הסולם הייתה </w:t>
+        <w:t xml:space="preserve">לגיטימיות של הסגל. הסולם כולל שלושה פריטים: "אני יכול לדבר עם הסוהרים באגף אם אני מודאג או עצוב", "הסוהרים באגף מתייחסים אליי בכבוד" ו"אני מרוצה מהטיפול בבקשות שלי". שלושת הפריטים מבטאים שלושה מהתנאים ללגיטימיות שזיהו ספרקס ובוטומס </w:t>
+      </w:r>
+      <w:r>
+        <w:rPr>
+          <w:rFonts w:ascii="Times New Roman" w:cs="Times New Roman" w:eastAsia="Times New Roman" w:hAnsi="Times New Roman"/>
+          <w:sz w:val="24"/>
+          <w:szCs w:val="24"/>
+        </w:rPr>
+        <w:t xml:space="preserve">(Sparks &amp; Bottoms, 1995)</w:t>
+      </w:r>
+      <w:r>
+        <w:rPr>
+          <w:rFonts w:ascii="David" w:cs="David" w:eastAsia="David" w:hAnsi="David"/>
+          <w:sz w:val="24"/>
+          <w:szCs w:val="24"/>
+          <w:rtl/>
+        </w:rPr>
+        <w:t xml:space="preserve">: נגישות של הסגל ואיכות אנושית בשגרה, יחס מכבד, והוגנות פרוצדורלית בטיפול בבקשות. בסקר המקורי מהימנות הסולם הייתה </w:t>
       </w:r>
       <w:r>
         <w:rPr>
@@ -10353,15 +10523,15 @@
           <w:szCs w:val="24"/>
           <w:rtl/>
         </w:rPr>
-        <w:t xml:space="preserve"> הוחלט להשאירו, משום שהטיפול בבקשות הוא ליבת ההוגנות הפרוצדורלית במודל של טיילר </w:t>
-      </w:r>
-      <w:r>
-        <w:rPr>
-          <w:rFonts w:ascii="Times New Roman" w:cs="Times New Roman" w:eastAsia="Times New Roman" w:hAnsi="Times New Roman"/>
-          <w:sz w:val="24"/>
-          <w:szCs w:val="24"/>
-        </w:rPr>
-        <w:t xml:space="preserve">(Tyler, 1990)</w:t>
+        <w:t xml:space="preserve"> הוחלט להשאירו, משום שהטיפול בבקשות הוא ליבת ההוגנות הפרוצדורלית אצל ספרקס ובוטומס </w:t>
+      </w:r>
+      <w:r>
+        <w:rPr>
+          <w:rFonts w:ascii="Times New Roman" w:cs="Times New Roman" w:eastAsia="Times New Roman" w:hAnsi="Times New Roman"/>
+          <w:sz w:val="24"/>
+          <w:szCs w:val="24"/>
+        </w:rPr>
+        <w:t xml:space="preserve">(Sparks &amp; Bottoms, 1995)</w:t>
       </w:r>
       <w:r>
         <w:rPr>
@@ -12441,24 +12611,24 @@
           <w:szCs w:val="24"/>
           <w:rtl/>
         </w:rPr>
-        <w:t xml:space="preserve">). ממצא זה מתיישב עם עבודתו של טיילר </w:t>
-      </w:r>
-      <w:r>
-        <w:rPr>
-          <w:rFonts w:ascii="Times New Roman" w:cs="Times New Roman" w:eastAsia="Times New Roman" w:hAnsi="Times New Roman"/>
-          <w:sz w:val="24"/>
-          <w:szCs w:val="24"/>
-        </w:rPr>
-        <w:t xml:space="preserve">(Tyler, 1990)</w:t>
-      </w:r>
-      <w:r>
-        <w:rPr>
-          <w:rFonts w:ascii="David" w:cs="David" w:eastAsia="David" w:hAnsi="David"/>
-          <w:sz w:val="24"/>
-          <w:szCs w:val="24"/>
-          <w:rtl/>
-        </w:rPr>
-        <w:t xml:space="preserve"> על מתן קול כמרכיב הצדק הפרוצדורלי, ועם הממצא האוסטרלי שלפיו איכות היחסים עם הסגל היא המנגנון שדרכו צדק פרוצדורלי מתורגם לרווחה לאורך זמן </w:t>
+        <w:t xml:space="preserve">). ממצא זה מתיישב עם הדגש של ספרקס ובוטומס </w:t>
+      </w:r>
+      <w:r>
+        <w:rPr>
+          <w:rFonts w:ascii="Times New Roman" w:cs="Times New Roman" w:eastAsia="Times New Roman" w:hAnsi="Times New Roman"/>
+          <w:sz w:val="24"/>
+          <w:szCs w:val="24"/>
+        </w:rPr>
+        <w:t xml:space="preserve">(Sparks &amp; Bottoms, 1995)</w:t>
+      </w:r>
+      <w:r>
+        <w:rPr>
+          <w:rFonts w:ascii="David" w:cs="David" w:eastAsia="David" w:hAnsi="David"/>
+          <w:sz w:val="24"/>
+          <w:szCs w:val="24"/>
+          <w:rtl/>
+        </w:rPr>
+        <w:t xml:space="preserve"> על האיכות האנושית של שגרת היום כתנאי ללגיטימיות, ועם הממצא האוסטרלי שלפיו איכות היחסים עם הסגל היא המנגנון שדרכו צדק פרוצדורלי מתורגם לרווחה לאורך זמן </w:t>
       </w:r>
       <w:r>
         <w:rPr>
@@ -13602,41 +13772,58 @@
           <w:szCs w:val="24"/>
           <w:rtl/>
         </w:rPr>
-        <w:t xml:space="preserve">המחקר ביקש לבחון באיזו מידה קיים קשר בין רווחה נפשית לבין תפיסת הלגיטימיות של סגל הכליאה בקרב אסירים שפוטים בישראל. הוא נשען על המודל של טיילר </w:t>
-      </w:r>
-      <w:r>
-        <w:rPr>
-          <w:rFonts w:ascii="Times New Roman" w:cs="Times New Roman" w:eastAsia="Times New Roman" w:hAnsi="Times New Roman"/>
-          <w:sz w:val="24"/>
-          <w:szCs w:val="24"/>
-        </w:rPr>
-        <w:t xml:space="preserve">(Tyler, 1990)</w:t>
-      </w:r>
-      <w:r>
-        <w:rPr>
-          <w:rFonts w:ascii="David" w:cs="David" w:eastAsia="David" w:hAnsi="David"/>
-          <w:sz w:val="24"/>
-          <w:szCs w:val="24"/>
-          <w:rtl/>
-        </w:rPr>
-        <w:t xml:space="preserve">, שלפיו הציות לסמכות נובע מתפיסתה כלגיטימית, ועל ספרות ההסתגלות למאסר שתיארה את הפגיעה ברווחה הנפשית כחלק בלתי נפרד מחוויית הכליאה </w:t>
-      </w:r>
-      <w:r>
-        <w:rPr>
-          <w:rFonts w:ascii="Times New Roman" w:cs="Times New Roman" w:eastAsia="Times New Roman" w:hAnsi="Times New Roman"/>
-          <w:sz w:val="24"/>
-          <w:szCs w:val="24"/>
-        </w:rPr>
-        <w:t xml:space="preserve">(Sykes, 1958; Liebling &amp; Maruna, 2005)</w:t>
-      </w:r>
-      <w:r>
-        <w:rPr>
-          <w:rFonts w:ascii="David" w:cs="David" w:eastAsia="David" w:hAnsi="David"/>
-          <w:sz w:val="24"/>
-          <w:szCs w:val="24"/>
-          <w:rtl/>
-        </w:rPr>
-        <w:t xml:space="preserve">. הנתונים נלקחו מקובץ סינתטי המבוסס על סקר תנאי המחיה של שירות בתי הסוהר (ועקנין, </w:t>
+        <w:t xml:space="preserve">המחקר ביקש לבחון באיזו מידה קיים קשר בין רווחה נפשית לבין תפיסת הלגיטימיות של סגל הכליאה בקרב אסירים שפוטים בישראל. הוא נשען על תאוריית הלגיטימיות בבתי סוהר של ספרקס ובוטומס </w:t>
+      </w:r>
+      <w:r>
+        <w:rPr>
+          <w:rFonts w:ascii="Times New Roman" w:cs="Times New Roman" w:eastAsia="Times New Roman" w:hAnsi="Times New Roman"/>
+          <w:sz w:val="24"/>
+          <w:szCs w:val="24"/>
+        </w:rPr>
+        <w:t xml:space="preserve">(Sparks &amp; Bottoms, 1995)</w:t>
+      </w:r>
+      <w:r>
+        <w:rPr>
+          <w:rFonts w:ascii="David" w:cs="David" w:eastAsia="David" w:hAnsi="David"/>
+          <w:sz w:val="24"/>
+          <w:szCs w:val="24"/>
+          <w:rtl/>
+        </w:rPr>
+        <w:t xml:space="preserve">, שלפיה הציות לסמכות נובע מתפיסתה כהוגנת, ועל ספרות ההסתגלות למאסר שתיארה את הפגיעה ברווחה הנפשית כחלק בלתי נפרד מחוויית הכליאה (דוידסקו וולק, </w:t>
+      </w:r>
+      <w:r>
+        <w:rPr>
+          <w:rFonts w:ascii="Times New Roman" w:cs="Times New Roman" w:eastAsia="Times New Roman" w:hAnsi="Times New Roman"/>
+          <w:sz w:val="24"/>
+          <w:szCs w:val="24"/>
+        </w:rPr>
+        <w:t xml:space="preserve">2015</w:t>
+      </w:r>
+      <w:r>
+        <w:rPr>
+          <w:rFonts w:ascii="David" w:cs="David" w:eastAsia="David" w:hAnsi="David"/>
+          <w:sz w:val="24"/>
+          <w:szCs w:val="24"/>
+          <w:rtl/>
+        </w:rPr>
+        <w:t xml:space="preserve">; יפתח-שרצקי והראל, </w:t>
+      </w:r>
+      <w:r>
+        <w:rPr>
+          <w:rFonts w:ascii="Times New Roman" w:cs="Times New Roman" w:eastAsia="Times New Roman" w:hAnsi="Times New Roman"/>
+          <w:sz w:val="24"/>
+          <w:szCs w:val="24"/>
+        </w:rPr>
+        <w:t xml:space="preserve">2024</w:t>
+      </w:r>
+      <w:r>
+        <w:rPr>
+          <w:rFonts w:ascii="David" w:cs="David" w:eastAsia="David" w:hAnsi="David"/>
+          <w:sz w:val="24"/>
+          <w:szCs w:val="24"/>
+          <w:rtl/>
+        </w:rPr>
+        <w:t xml:space="preserve">). הנתונים נלקחו מקובץ סינתטי המבוסס על סקר תנאי המחיה של שירות בתי הסוהר (ועקנין, </w:t>
       </w:r>
       <w:r>
         <w:rPr>
@@ -13757,24 +13944,7 @@
           <w:szCs w:val="24"/>
           <w:rtl/>
         </w:rPr>
-        <w:t xml:space="preserve">הקשר החיובי שנמצא עולה בקנה אחד עם המחקר ההולנדי, שבו יחס הוגן מצד הסוהרים ניבא פחות בעיות נפשיות בהמשך המאסר </w:t>
-      </w:r>
-      <w:r>
-        <w:rPr>
-          <w:rFonts w:ascii="Times New Roman" w:cs="Times New Roman" w:eastAsia="Times New Roman" w:hAnsi="Times New Roman"/>
-          <w:sz w:val="24"/>
-          <w:szCs w:val="24"/>
-        </w:rPr>
-        <w:t xml:space="preserve">(Beijersbergen et al., 2014)</w:t>
-      </w:r>
-      <w:r>
-        <w:rPr>
-          <w:rFonts w:ascii="David" w:cs="David" w:eastAsia="David" w:hAnsi="David"/>
-          <w:sz w:val="24"/>
-          <w:szCs w:val="24"/>
-          <w:rtl/>
-        </w:rPr>
-        <w:t xml:space="preserve">, ועם המחקר האוסטרלי, שבו צדק פרוצדורלי ניבא רווחה גבוהה יותר דרך איכות היחסים עם הסגל </w:t>
+        <w:t xml:space="preserve">הקשר החיובי שנמצא עולה בקנה אחד עם המחקר האוסטרלי, שבו צדק פרוצדורלי ניבא רווחה גבוהה יותר דרך איכות היחסים עם הסגל, ועם המחקר ההולנדי שקדם לו, שבו יחס הוגן מצד הסוהרים ניבא פחות בעיות נפשיות בהמשך המאסר </w:t>
       </w:r>
       <w:r>
         <w:rPr>
@@ -13842,24 +14012,41 @@
           <w:szCs w:val="24"/>
           <w:rtl/>
         </w:rPr>
-        <w:t xml:space="preserve">הממצא מתיישב גם עם הטענה של ליבלינג </w:t>
-      </w:r>
-      <w:r>
-        <w:rPr>
-          <w:rFonts w:ascii="Times New Roman" w:cs="Times New Roman" w:eastAsia="Times New Roman" w:hAnsi="Times New Roman"/>
-          <w:sz w:val="24"/>
-          <w:szCs w:val="24"/>
-        </w:rPr>
-        <w:t xml:space="preserve">(Liebling, 2004)</w:t>
-      </w:r>
-      <w:r>
-        <w:rPr>
-          <w:rFonts w:ascii="David" w:cs="David" w:eastAsia="David" w:hAnsi="David"/>
-          <w:sz w:val="24"/>
-          <w:szCs w:val="24"/>
-          <w:rtl/>
-        </w:rPr>
-        <w:t xml:space="preserve"> שממדים כמו כבוד, אנושיות ויחסים עם הסגל מתואמים עם רמת המצוקה של האסירים, ועם ממצאיהם של פרנקה ואחרים </w:t>
+        <w:t xml:space="preserve">הממצא מתיישב גם עם מסגרת איכות החיים המוסרית, שלפיה כבוד, אנושיות ויחסים עם הסגל הם הממדים שחשובים ביותר לאסירים (</w:t>
+      </w:r>
+      <w:r>
+        <w:rPr>
+          <w:rFonts w:ascii="Times New Roman" w:cs="Times New Roman" w:eastAsia="Times New Roman" w:hAnsi="Times New Roman"/>
+          <w:sz w:val="24"/>
+          <w:szCs w:val="24"/>
+        </w:rPr>
+        <w:t xml:space="preserve">Liebling, 2004</w:t>
+      </w:r>
+      <w:r>
+        <w:rPr>
+          <w:rFonts w:ascii="David" w:cs="David" w:eastAsia="David" w:hAnsi="David"/>
+          <w:sz w:val="24"/>
+          <w:szCs w:val="24"/>
+          <w:rtl/>
+        </w:rPr>
+        <w:t xml:space="preserve">, כפי שמצוטט אצל </w:t>
+      </w:r>
+      <w:r>
+        <w:rPr>
+          <w:rFonts w:ascii="Times New Roman" w:cs="Times New Roman" w:eastAsia="Times New Roman" w:hAnsi="Times New Roman"/>
+          <w:sz w:val="24"/>
+          <w:szCs w:val="24"/>
+        </w:rPr>
+        <w:t xml:space="preserve">Auty &amp; Liebling, 2024</w:t>
+      </w:r>
+      <w:r>
+        <w:rPr>
+          <w:rFonts w:ascii="David" w:cs="David" w:eastAsia="David" w:hAnsi="David"/>
+          <w:sz w:val="24"/>
+          <w:szCs w:val="24"/>
+          <w:rtl/>
+        </w:rPr>
+        <w:t xml:space="preserve">), ועם ממצאיהם של פרנקה ואחרים </w:t>
       </w:r>
       <w:r>
         <w:rPr>
@@ -13910,7 +14097,7 @@
           <w:szCs w:val="24"/>
           <w:rtl/>
         </w:rPr>
-        <w:t xml:space="preserve"> נקודות ברווחה בין השפוטים ברמת הלגיטימיות הנמוכה לאלו ברמה הגבוהה, מקבל משמעות מעשית לאור הסף שזיהו אוטי וליבלינג </w:t>
+        <w:t xml:space="preserve"> נקודות ברווחה בין השפוטים ברמת הלגיטימיות הנמוכה לאלו ברמה הגבוהה, מקבל משמעות מעשית לאור הספים שזיהו אוטי וליבלינג </w:t>
       </w:r>
       <w:r>
         <w:rPr>
@@ -13927,24 +14114,24 @@
           <w:szCs w:val="24"/>
           <w:rtl/>
         </w:rPr>
-        <w:t xml:space="preserve">: מתחת לרמה מסוימת של יחסים בין סגל לאסירים עולים באופן חד שיעורי הפגיעה העצמית והאלימות. הממצא האמריקני שלפיו צדק פרוצדורלי קשור לפחות מחשבות אובדניות </w:t>
-      </w:r>
-      <w:r>
-        <w:rPr>
-          <w:rFonts w:ascii="Times New Roman" w:cs="Times New Roman" w:eastAsia="Times New Roman" w:hAnsi="Times New Roman"/>
-          <w:sz w:val="24"/>
-          <w:szCs w:val="24"/>
-        </w:rPr>
-        <w:t xml:space="preserve">(Abderhalden &amp; Alward, 2024)</w:t>
-      </w:r>
-      <w:r>
-        <w:rPr>
-          <w:rFonts w:ascii="David" w:cs="David" w:eastAsia="David" w:hAnsi="David"/>
-          <w:sz w:val="24"/>
-          <w:szCs w:val="24"/>
-          <w:rtl/>
-        </w:rPr>
-        <w:t xml:space="preserve"> מצביע על אותו כיוון.</w:t>
+        <w:t xml:space="preserve">: מתחת לרמה מסוימת של יחסים בין סגל לאסירים עולים באופן חד שיעורי הפגיעה העצמית והאלימות. הממצא הישראלי שלפיו רווחה נפשית סובייקטיבית של אסירים עולה בעקבות התערבות קבוצתית (שני ואחרים, </w:t>
+      </w:r>
+      <w:r>
+        <w:rPr>
+          <w:rFonts w:ascii="Times New Roman" w:cs="Times New Roman" w:eastAsia="Times New Roman" w:hAnsi="Times New Roman"/>
+          <w:sz w:val="24"/>
+          <w:szCs w:val="24"/>
+        </w:rPr>
+        <w:t xml:space="preserve">2024</w:t>
+      </w:r>
+      <w:r>
+        <w:rPr>
+          <w:rFonts w:ascii="David" w:cs="David" w:eastAsia="David" w:hAnsi="David"/>
+          <w:sz w:val="24"/>
+          <w:szCs w:val="24"/>
+          <w:rtl/>
+        </w:rPr>
+        <w:t xml:space="preserve">) מלמד שמדובר במשתנה שאפשר להשפיע עליו, ולא בתכונה קבועה של האסיר.</w:t>
       </w:r>
     </w:p>
     <w:p>
@@ -14151,24 +14338,58 @@
           <w:szCs w:val="24"/>
           <w:rtl/>
         </w:rPr>
-        <w:t xml:space="preserve">. ייתכן שההבדל משקף מדיניות של יחס מכבד באגפים הפליליים בישראל, וייתכן שהוא משקף רצייה חברתית בשאלון שהועבר על ידי מנהלי האגפים עצמם. שני ההסברים אינם מוציאים זה את זה. ממצאי ון הול ואחרים </w:t>
-      </w:r>
-      <w:r>
-        <w:rPr>
-          <w:rFonts w:ascii="Times New Roman" w:cs="Times New Roman" w:eastAsia="Times New Roman" w:hAnsi="Times New Roman"/>
-          <w:sz w:val="24"/>
-          <w:szCs w:val="24"/>
-        </w:rPr>
-        <w:t xml:space="preserve">(van Hall et al., 2025)</w:t>
-      </w:r>
-      <w:r>
-        <w:rPr>
-          <w:rFonts w:ascii="David" w:cs="David" w:eastAsia="David" w:hAnsi="David"/>
-          <w:sz w:val="24"/>
-          <w:szCs w:val="24"/>
-          <w:rtl/>
-        </w:rPr>
-        <w:t xml:space="preserve"> בדבר ה"שפיכה" של הלגיטימיות אל מחוץ לחומות מלמדים שהשקעה בלגיטימיות באגף היא גם השקעה בשיקום, וזהו בדיוק הקשר שהסקר הישראלי זיהה בין לגיטימיות לפעילויות השיקום.</w:t>
+        <w:t xml:space="preserve">. ייתכן שההבדל משקף מדיניות של יחס מכבד באגפים הפליליים בישראל, וייתכן שהוא משקף רצייה חברתית בשאלון שהועבר על ידי מנהלי האגפים עצמם. שני ההסברים אינם מוציאים זה את זה. ממצא ישראלי תומך בהסבר הראשון: בראיונות עם </w:t>
+      </w:r>
+      <w:r>
+        <w:rPr>
+          <w:rFonts w:ascii="Times New Roman" w:cs="Times New Roman" w:eastAsia="Times New Roman" w:hAnsi="Times New Roman"/>
+          <w:sz w:val="24"/>
+          <w:szCs w:val="24"/>
+        </w:rPr>
+        <w:t xml:space="preserve">17</w:t>
+      </w:r>
+      <w:r>
+        <w:rPr>
+          <w:rFonts w:ascii="David" w:cs="David" w:eastAsia="David" w:hAnsi="David"/>
+          <w:sz w:val="24"/>
+          <w:szCs w:val="24"/>
+          <w:rtl/>
+        </w:rPr>
+        <w:t xml:space="preserve"> אסירים משוחררים שסיימו בהצלחה פיקוח ברשות לשיקום האסיר, חלקם תיארו את הכלא עצמו כמסגרת משקמת, וההתייחסות של רובם לעתיד הייתה אופטימית (פלד-לסקוב ותימור, </w:t>
+      </w:r>
+      <w:r>
+        <w:rPr>
+          <w:rFonts w:ascii="Times New Roman" w:cs="Times New Roman" w:eastAsia="Times New Roman" w:hAnsi="Times New Roman"/>
+          <w:sz w:val="24"/>
+          <w:szCs w:val="24"/>
+        </w:rPr>
+        <w:t xml:space="preserve">2024</w:t>
+      </w:r>
+      <w:r>
+        <w:rPr>
+          <w:rFonts w:ascii="David" w:cs="David" w:eastAsia="David" w:hAnsi="David"/>
+          <w:sz w:val="24"/>
+          <w:szCs w:val="24"/>
+          <w:rtl/>
+        </w:rPr>
+        <w:t xml:space="preserve">). ממצאיו של שניטקר </w:t>
+      </w:r>
+      <w:r>
+        <w:rPr>
+          <w:rFonts w:ascii="Times New Roman" w:cs="Times New Roman" w:eastAsia="Times New Roman" w:hAnsi="Times New Roman"/>
+          <w:sz w:val="24"/>
+          <w:szCs w:val="24"/>
+        </w:rPr>
+        <w:t xml:space="preserve">(Schnittker, 2025)</w:t>
+      </w:r>
+      <w:r>
+        <w:rPr>
+          <w:rFonts w:ascii="David" w:cs="David" w:eastAsia="David" w:hAnsi="David"/>
+          <w:sz w:val="24"/>
+          <w:szCs w:val="24"/>
+          <w:rtl/>
+        </w:rPr>
+        <w:t xml:space="preserve">, שלפיהם יחסי כבוד ואמון עם הסגל ממשיכים להשפיע על הרווחה גם בשנה שאחרי השחרור, מלמדים שהשקעה בלגיטימיות באגף היא גם השקעה בשיקום, וזהו בדיוק הקשר שהסקר הישראלי זיהה בין לגיטימיות לפעילויות השיקום.</w:t>
       </w:r>
     </w:p>
     <w:p>
@@ -14205,15 +14426,15 @@
           <w:szCs w:val="24"/>
           <w:rtl/>
         </w:rPr>
-        <w:t xml:space="preserve">מהממצאים נגזרות כמה המלצות מעשיות. הראשונה היא סינון שגרתי של רווחה נפשית בשתי נקודות זמן, בקליטה לאגף ושלושה חודשים לאחריה, שהן נקודות הזמן שבהן נמדדה המצוקה במחקר ההולנדי </w:t>
-      </w:r>
-      <w:r>
-        <w:rPr>
-          <w:rFonts w:ascii="Times New Roman" w:cs="Times New Roman" w:eastAsia="Times New Roman" w:hAnsi="Times New Roman"/>
-          <w:sz w:val="24"/>
-          <w:szCs w:val="24"/>
-        </w:rPr>
-        <w:t xml:space="preserve">(Beijersbergen et al., 2014)</w:t>
+        <w:t xml:space="preserve">מהממצאים נגזרות כמה המלצות מעשיות. הראשונה היא סינון שגרתי של רווחה נפשית בשתי נקודות זמן, בקליטה לאגף ושלושה חודשים לאחריה, שהן נקודות הזמן שבהן נמדדה המצוקה במחקר ההולנדי שעליו נשענו סרג'נט ואחרים </w:t>
+      </w:r>
+      <w:r>
+        <w:rPr>
+          <w:rFonts w:ascii="Times New Roman" w:cs="Times New Roman" w:eastAsia="Times New Roman" w:hAnsi="Times New Roman"/>
+          <w:sz w:val="24"/>
+          <w:szCs w:val="24"/>
+        </w:rPr>
+        <w:t xml:space="preserve">(Sargeant et al., 2026)</w:t>
       </w:r>
       <w:r>
         <w:rPr>
@@ -14239,15 +14460,15 @@
           <w:szCs w:val="24"/>
           <w:rtl/>
         </w:rPr>
-        <w:t xml:space="preserve"> יכולים לשמש לכך כפי שהם. השנייה נובעת מהממצא שהפריט הקשור ביותר לרווחה הוא האפשרות לדבר עם הסוהרים: לקבוע לכל סוהר אגף שעת קבלה שבועית קבועה שבה אסירים יכולים לפנות אליו שלא בדחיפות, ולתעד את הפניות. השלישית היא הכשרת סוהרי אגף בעקרונות הצדק הפרוצדורלי, לתת לאסיר לומר את דברו לפני החלטה ולהסביר את ההחלטה גם כשהיא שלילית, בהתאם למודל של טיילר </w:t>
-      </w:r>
-      <w:r>
-        <w:rPr>
-          <w:rFonts w:ascii="Times New Roman" w:cs="Times New Roman" w:eastAsia="Times New Roman" w:hAnsi="Times New Roman"/>
-          <w:sz w:val="24"/>
-          <w:szCs w:val="24"/>
-        </w:rPr>
-        <w:t xml:space="preserve">(Tyler, 1990)</w:t>
+        <w:t xml:space="preserve"> יכולים לשמש לכך כפי שהם. השנייה נובעת מהממצא שהפריט הקשור ביותר לרווחה הוא האפשרות לדבר עם הסוהרים: לקבוע לכל סוהר אגף שעת קבלה שבועית קבועה שבה אסירים יכולים לפנות אליו שלא בדחיפות, ולתעד את הפניות. השלישית היא הכשרת סוהרי אגף בעקרונות הצדק הפרוצדורלי, לתת לאסיר לומר את דברו לפני החלטה ולהסביר את ההחלטה גם כשהיא שלילית, בהתאם לתנאים שזיהו ספרקס ובוטומס </w:t>
+      </w:r>
+      <w:r>
+        <w:rPr>
+          <w:rFonts w:ascii="Times New Roman" w:cs="Times New Roman" w:eastAsia="Times New Roman" w:hAnsi="Times New Roman"/>
+          <w:sz w:val="24"/>
+          <w:szCs w:val="24"/>
+        </w:rPr>
+        <w:t xml:space="preserve">(Sparks &amp; Bottoms, 1995)</w:t>
       </w:r>
       <w:r>
         <w:rPr>
@@ -14378,15 +14599,15 @@
           <w:szCs w:val="24"/>
           <w:rtl/>
         </w:rPr>
-        <w:t xml:space="preserve">המגבלה השנייה נוגעת למערך. המחקר הוא מחקר חתך מתאמי, ולכן אינו יכול להכריע בכיוון הקשר: האם הרווחה הנפשית משפיעה על תפיסת הלגיטימיות, האם יחס לגיטימי משפר את הרווחה, או האם משתנה שלישי כמו תנאי האגף מסביר את שניהם. המחקרים ההולנדי והאוסטרלי הראו שאפשר לענות על שאלה זו רק במערך אורך עם שתי מדידות לפחות </w:t>
-      </w:r>
-      <w:r>
-        <w:rPr>
-          <w:rFonts w:ascii="Times New Roman" w:cs="Times New Roman" w:eastAsia="Times New Roman" w:hAnsi="Times New Roman"/>
-          <w:sz w:val="24"/>
-          <w:szCs w:val="24"/>
-        </w:rPr>
-        <w:t xml:space="preserve">(Beijersbergen et al., 2014; Sargeant et al., 2026)</w:t>
+        <w:t xml:space="preserve">המגבלה השנייה נוגעת למערך. המחקר הוא מחקר חתך מתאמי, ולכן אינו יכול להכריע בכיוון הקשר: האם הרווחה הנפשית משפיעה על תפיסת הלגיטימיות, האם יחס לגיטימי משפר את הרווחה, או האם משתנה שלישי כמו תנאי האגף מסביר את שניהם. המחקר האוסטרלי הראה שאפשר לענות על שאלה זו רק במערך אורך עם שתי מדידות לפחות </w:t>
+      </w:r>
+      <w:r>
+        <w:rPr>
+          <w:rFonts w:ascii="Times New Roman" w:cs="Times New Roman" w:eastAsia="Times New Roman" w:hAnsi="Times New Roman"/>
+          <w:sz w:val="24"/>
+          <w:szCs w:val="24"/>
+        </w:rPr>
+        <w:t xml:space="preserve">(Sargeant et al., 2026)</w:t>
       </w:r>
       <w:r>
         <w:rPr>
@@ -14707,48 +14928,41 @@
           <w:szCs w:val="24"/>
           <w:rtl/>
         </w:rPr>
-        <w:t xml:space="preserve">בן צבי, ק' וכרמל, ת' (</w:t>
-      </w:r>
-      <w:r>
-        <w:rPr>
-          <w:rFonts w:ascii="Times New Roman" w:cs="Times New Roman" w:eastAsia="Times New Roman" w:hAnsi="Times New Roman"/>
-          <w:sz w:val="24"/>
-          <w:szCs w:val="24"/>
-        </w:rPr>
-        <w:t xml:space="preserve">2013</w:t>
-      </w:r>
-      <w:r>
-        <w:rPr>
-          <w:rFonts w:ascii="David" w:cs="David" w:eastAsia="David" w:hAnsi="David"/>
-          <w:sz w:val="24"/>
-          <w:szCs w:val="24"/>
-          <w:rtl/>
-        </w:rPr>
-        <w:t xml:space="preserve">). אלימות כלואה: הקשר בין רמת צפיפות בבתי סוהר פליליים בישראל לרמת האלימות הפיזית. צוהר לבית הסוהר, </w:t>
-      </w:r>
-      <w:r>
-        <w:rPr>
-          <w:rFonts w:ascii="Times New Roman" w:cs="Times New Roman" w:eastAsia="Times New Roman" w:hAnsi="Times New Roman"/>
-          <w:sz w:val="24"/>
-          <w:szCs w:val="24"/>
-        </w:rPr>
-        <w:t xml:space="preserve">15,</w:t>
-      </w:r>
-      <w:r>
-        <w:rPr>
-          <w:rFonts w:ascii="Times New Roman" w:cs="Times New Roman" w:eastAsia="Times New Roman" w:hAnsi="Times New Roman"/>
-          <w:sz w:val="24"/>
-          <w:szCs w:val="24"/>
-        </w:rPr>
-        <w:t xml:space="preserve"> </w:t>
-      </w:r>
-      <w:r>
-        <w:rPr>
-          <w:rFonts w:ascii="Times New Roman" w:cs="Times New Roman" w:eastAsia="Times New Roman" w:hAnsi="Times New Roman"/>
-          <w:sz w:val="24"/>
-          <w:szCs w:val="24"/>
-        </w:rPr>
-        <w:t xml:space="preserve">28-44.</w:t>
+        <w:t xml:space="preserve">דוידסקו, ע' וולק, ד' (</w:t>
+      </w:r>
+      <w:r>
+        <w:rPr>
+          <w:rFonts w:ascii="Times New Roman" w:cs="Times New Roman" w:eastAsia="Times New Roman" w:hAnsi="Times New Roman"/>
+          <w:sz w:val="24"/>
+          <w:szCs w:val="24"/>
+        </w:rPr>
+        <w:t xml:space="preserve">2015</w:t>
+      </w:r>
+      <w:r>
+        <w:rPr>
+          <w:rFonts w:ascii="David" w:cs="David" w:eastAsia="David" w:hAnsi="David"/>
+          <w:sz w:val="24"/>
+          <w:szCs w:val="24"/>
+          <w:rtl/>
+        </w:rPr>
+        <w:t xml:space="preserve">). תנאי כליאה של אסירים: בין רווחה לנוקשות [סקירת ספרות, פרסום מס' </w:t>
+      </w:r>
+      <w:r>
+        <w:rPr>
+          <w:rFonts w:ascii="Times New Roman" w:cs="Times New Roman" w:eastAsia="Times New Roman" w:hAnsi="Times New Roman"/>
+          <w:sz w:val="24"/>
+          <w:szCs w:val="24"/>
+        </w:rPr>
+        <w:t xml:space="preserve">LR-02-2015</w:t>
+      </w:r>
+      <w:r>
+        <w:rPr>
+          <w:rFonts w:ascii="David" w:cs="David" w:eastAsia="David" w:hAnsi="David"/>
+          <w:sz w:val="24"/>
+          <w:szCs w:val="24"/>
+          <w:rtl/>
+        </w:rPr>
+        <w:t xml:space="preserve">]. שירות בתי הסוהר, מחלקת מחקר ואסטרטגיה.</w:t>
       </w:r>
     </w:p>
     <w:p>
@@ -14765,41 +14979,48 @@
           <w:szCs w:val="24"/>
           <w:rtl/>
         </w:rPr>
-        <w:t xml:space="preserve">דוידסקו, ע' וולק, ד' (</w:t>
-      </w:r>
-      <w:r>
-        <w:rPr>
-          <w:rFonts w:ascii="Times New Roman" w:cs="Times New Roman" w:eastAsia="Times New Roman" w:hAnsi="Times New Roman"/>
-          <w:sz w:val="24"/>
-          <w:szCs w:val="24"/>
-        </w:rPr>
-        <w:t xml:space="preserve">2015</w:t>
-      </w:r>
-      <w:r>
-        <w:rPr>
-          <w:rFonts w:ascii="David" w:cs="David" w:eastAsia="David" w:hAnsi="David"/>
-          <w:sz w:val="24"/>
-          <w:szCs w:val="24"/>
-          <w:rtl/>
-        </w:rPr>
-        <w:t xml:space="preserve">). תנאי כליאה של אסירים: בין רווחה לנוקשות [סקירת ספרות, פרסום מס' </w:t>
-      </w:r>
-      <w:r>
-        <w:rPr>
-          <w:rFonts w:ascii="Times New Roman" w:cs="Times New Roman" w:eastAsia="Times New Roman" w:hAnsi="Times New Roman"/>
-          <w:sz w:val="24"/>
-          <w:szCs w:val="24"/>
-        </w:rPr>
-        <w:t xml:space="preserve">LR-02-2015</w:t>
-      </w:r>
-      <w:r>
-        <w:rPr>
-          <w:rFonts w:ascii="David" w:cs="David" w:eastAsia="David" w:hAnsi="David"/>
-          <w:sz w:val="24"/>
-          <w:szCs w:val="24"/>
-          <w:rtl/>
-        </w:rPr>
-        <w:t xml:space="preserve">]. שירות בתי הסוהר, מחלקת מחקר ואסטרטגיה.</w:t>
+        <w:t xml:space="preserve">ועקנין, י' (</w:t>
+      </w:r>
+      <w:r>
+        <w:rPr>
+          <w:rFonts w:ascii="Times New Roman" w:cs="Times New Roman" w:eastAsia="Times New Roman" w:hAnsi="Times New Roman"/>
+          <w:sz w:val="24"/>
+          <w:szCs w:val="24"/>
+        </w:rPr>
+        <w:t xml:space="preserve">2024</w:t>
+      </w:r>
+      <w:r>
+        <w:rPr>
+          <w:rFonts w:ascii="David" w:cs="David" w:eastAsia="David" w:hAnsi="David"/>
+          <w:sz w:val="24"/>
+          <w:szCs w:val="24"/>
+          <w:rtl/>
+        </w:rPr>
+        <w:t xml:space="preserve">). בין שיקום ללגיטימיות: התפקיד של לגיטימיות בקשר שבין שביעות רצון מתנאי המחיה לשביעות רצון מפעילות חטו"ש בקרב כלואים פליליים בישראל. צוהר לבית הסוהר: מחקרים בכליאה, ביטחון ואכיפה, </w:t>
+      </w:r>
+      <w:r>
+        <w:rPr>
+          <w:rFonts w:ascii="Times New Roman" w:cs="Times New Roman" w:eastAsia="Times New Roman" w:hAnsi="Times New Roman"/>
+          <w:sz w:val="24"/>
+          <w:szCs w:val="24"/>
+        </w:rPr>
+        <w:t xml:space="preserve">22,</w:t>
+      </w:r>
+      <w:r>
+        <w:rPr>
+          <w:rFonts w:ascii="Times New Roman" w:cs="Times New Roman" w:eastAsia="Times New Roman" w:hAnsi="Times New Roman"/>
+          <w:sz w:val="24"/>
+          <w:szCs w:val="24"/>
+        </w:rPr>
+        <w:t xml:space="preserve"> </w:t>
+      </w:r>
+      <w:r>
+        <w:rPr>
+          <w:rFonts w:ascii="Times New Roman" w:cs="Times New Roman" w:eastAsia="Times New Roman" w:hAnsi="Times New Roman"/>
+          <w:sz w:val="24"/>
+          <w:szCs w:val="24"/>
+        </w:rPr>
+        <w:t xml:space="preserve">62-77.</w:t>
       </w:r>
     </w:p>
     <w:p>
@@ -14824,40 +15045,16 @@
           <w:sz w:val="24"/>
           <w:szCs w:val="24"/>
         </w:rPr>
-        <w:t xml:space="preserve">2024</w:t>
-      </w:r>
-      <w:r>
-        <w:rPr>
-          <w:rFonts w:ascii="David" w:cs="David" w:eastAsia="David" w:hAnsi="David"/>
-          <w:sz w:val="24"/>
-          <w:szCs w:val="24"/>
-          <w:rtl/>
-        </w:rPr>
-        <w:t xml:space="preserve">). בין שיקום ללגיטימיות: התפקיד של לגיטימיות בקשר שבין שביעות רצון מתנאי המחיה לשביעות רצון מפעילות חטו"ש בקרב כלואים פליליים בישראל. צוהר לבית הסוהר: מחקרים בכליאה, ביטחון ואכיפה, </w:t>
-      </w:r>
-      <w:r>
-        <w:rPr>
-          <w:rFonts w:ascii="Times New Roman" w:cs="Times New Roman" w:eastAsia="Times New Roman" w:hAnsi="Times New Roman"/>
-          <w:sz w:val="24"/>
-          <w:szCs w:val="24"/>
-        </w:rPr>
-        <w:t xml:space="preserve">22,</w:t>
-      </w:r>
-      <w:r>
-        <w:rPr>
-          <w:rFonts w:ascii="Times New Roman" w:cs="Times New Roman" w:eastAsia="Times New Roman" w:hAnsi="Times New Roman"/>
-          <w:sz w:val="24"/>
-          <w:szCs w:val="24"/>
-        </w:rPr>
-        <w:t xml:space="preserve"> </w:t>
-      </w:r>
-      <w:r>
-        <w:rPr>
-          <w:rFonts w:ascii="Times New Roman" w:cs="Times New Roman" w:eastAsia="Times New Roman" w:hAnsi="Times New Roman"/>
-          <w:sz w:val="24"/>
-          <w:szCs w:val="24"/>
-        </w:rPr>
-        <w:t xml:space="preserve">62-77.</w:t>
+        <w:t xml:space="preserve">2025,</w:t>
+      </w:r>
+      <w:r>
+        <w:rPr>
+          <w:rFonts w:ascii="David" w:cs="David" w:eastAsia="David" w:hAnsi="David"/>
+          <w:sz w:val="24"/>
+          <w:szCs w:val="24"/>
+          <w:rtl/>
+        </w:rPr>
+        <w:t xml:space="preserve"> ינואר). אפקטיביות תוכניות התקון בשב"ס [מצגת הרצאה]. כנס מחקר שב"ס, שירות בתי הסוהר.</w:t>
       </w:r>
     </w:p>
     <w:p>
@@ -14930,39 +15127,234 @@
     </w:p>
     <w:p>
       <w:pPr>
+        <w:bidi/>
         <w:spacing w:after="120" w:line="360"/>
-        <w:ind w:left="709" w:hanging="709"/>
-        <w:jc w:val="left"/>
+        <w:ind w:start="709" w:hanging="709"/>
+        <w:jc w:val="right"/>
       </w:pPr>
       <w:r>
         <w:rPr>
-          <w:rFonts w:ascii="Times New Roman" w:cs="Times New Roman" w:eastAsia="Times New Roman" w:hAnsi="Times New Roman"/>
-          <w:i w:val="false"/>
-          <w:iCs w:val="false"/>
-          <w:sz w:val="24"/>
-          <w:szCs w:val="24"/>
-        </w:rPr>
-        <w:t xml:space="preserve">Abderhalden, F. P., &amp; Alward, L. (2024). Jailed individuals' perceptions of procedural justice and suicidal ideation: An empirical examination. </w:t>
-      </w:r>
-      <w:r>
-        <w:rPr>
-          <w:rFonts w:ascii="Times New Roman" w:cs="Times New Roman" w:eastAsia="Times New Roman" w:hAnsi="Times New Roman"/>
-          <w:i/>
-          <w:iCs/>
-          <w:sz w:val="24"/>
-          <w:szCs w:val="24"/>
-        </w:rPr>
-        <w:t xml:space="preserve">Crime &amp; Delinquency, 70</w:t>
-      </w:r>
-      <w:r>
-        <w:rPr>
-          <w:rFonts w:ascii="Times New Roman" w:cs="Times New Roman" w:eastAsia="Times New Roman" w:hAnsi="Times New Roman"/>
-          <w:i w:val="false"/>
-          <w:iCs w:val="false"/>
-          <w:sz w:val="24"/>
-          <w:szCs w:val="24"/>
-        </w:rPr>
-        <w:t xml:space="preserve">(2), 414-440. https://doi.org/10.1177/00111287221106942</w:t>
+          <w:rFonts w:ascii="David" w:cs="David" w:eastAsia="David" w:hAnsi="David"/>
+          <w:sz w:val="24"/>
+          <w:szCs w:val="24"/>
+          <w:rtl/>
+        </w:rPr>
+        <w:t xml:space="preserve">יפתח-שרצקי, א' והראל, ש' (</w:t>
+      </w:r>
+      <w:r>
+        <w:rPr>
+          <w:rFonts w:ascii="Times New Roman" w:cs="Times New Roman" w:eastAsia="Times New Roman" w:hAnsi="Times New Roman"/>
+          <w:sz w:val="24"/>
+          <w:szCs w:val="24"/>
+        </w:rPr>
+        <w:t xml:space="preserve">2024</w:t>
+      </w:r>
+      <w:r>
+        <w:rPr>
+          <w:rFonts w:ascii="David" w:cs="David" w:eastAsia="David" w:hAnsi="David"/>
+          <w:sz w:val="24"/>
+          <w:szCs w:val="24"/>
+          <w:rtl/>
+        </w:rPr>
+        <w:t xml:space="preserve">). צללים מאחורי הסורגים: תסמינים פוסט טראומטיים, ויסות רגשי שלילי והשלכתם על תפקודם של אסירים בכלא. צוהר לבית הסוהר: מחקרים בכליאה, ביטחון ואכיפה, </w:t>
+      </w:r>
+      <w:r>
+        <w:rPr>
+          <w:rFonts w:ascii="Times New Roman" w:cs="Times New Roman" w:eastAsia="Times New Roman" w:hAnsi="Times New Roman"/>
+          <w:sz w:val="24"/>
+          <w:szCs w:val="24"/>
+        </w:rPr>
+        <w:t xml:space="preserve">22,</w:t>
+      </w:r>
+      <w:r>
+        <w:rPr>
+          <w:rFonts w:ascii="Times New Roman" w:cs="Times New Roman" w:eastAsia="Times New Roman" w:hAnsi="Times New Roman"/>
+          <w:sz w:val="24"/>
+          <w:szCs w:val="24"/>
+        </w:rPr>
+        <w:t xml:space="preserve"> </w:t>
+      </w:r>
+      <w:r>
+        <w:rPr>
+          <w:rFonts w:ascii="Times New Roman" w:cs="Times New Roman" w:eastAsia="Times New Roman" w:hAnsi="Times New Roman"/>
+          <w:sz w:val="24"/>
+          <w:szCs w:val="24"/>
+        </w:rPr>
+        <w:t xml:space="preserve">130-157.</w:t>
+      </w:r>
+    </w:p>
+    <w:p>
+      <w:pPr>
+        <w:bidi/>
+        <w:spacing w:after="120" w:line="360"/>
+        <w:ind w:start="709" w:hanging="709"/>
+        <w:jc w:val="right"/>
+      </w:pPr>
+      <w:r>
+        <w:rPr>
+          <w:rFonts w:ascii="David" w:cs="David" w:eastAsia="David" w:hAnsi="David"/>
+          <w:sz w:val="24"/>
+          <w:szCs w:val="24"/>
+          <w:rtl/>
+        </w:rPr>
+        <w:t xml:space="preserve">נחשון דהן, מ' וכץ, ע' (</w:t>
+      </w:r>
+      <w:r>
+        <w:rPr>
+          <w:rFonts w:ascii="Times New Roman" w:cs="Times New Roman" w:eastAsia="Times New Roman" w:hAnsi="Times New Roman"/>
+          <w:sz w:val="24"/>
+          <w:szCs w:val="24"/>
+        </w:rPr>
+        <w:t xml:space="preserve">2024</w:t>
+      </w:r>
+      <w:r>
+        <w:rPr>
+          <w:rFonts w:ascii="David" w:cs="David" w:eastAsia="David" w:hAnsi="David"/>
+          <w:sz w:val="24"/>
+          <w:szCs w:val="24"/>
+          <w:rtl/>
+        </w:rPr>
+        <w:t xml:space="preserve">). מוטיבציה ללמידה בקרב אסירים: האם תמיכה בצרכים פסיכולוגיים של אסירים במרכז החינוך מביאה למוטיבציה אוטונומית ללמידה ולהתמדה בה? צוהר לבית הסוהר: מחקרים בכליאה, ביטחון ואכיפה, </w:t>
+      </w:r>
+      <w:r>
+        <w:rPr>
+          <w:rFonts w:ascii="Times New Roman" w:cs="Times New Roman" w:eastAsia="Times New Roman" w:hAnsi="Times New Roman"/>
+          <w:sz w:val="24"/>
+          <w:szCs w:val="24"/>
+        </w:rPr>
+        <w:t xml:space="preserve">22,</w:t>
+      </w:r>
+      <w:r>
+        <w:rPr>
+          <w:rFonts w:ascii="Times New Roman" w:cs="Times New Roman" w:eastAsia="Times New Roman" w:hAnsi="Times New Roman"/>
+          <w:sz w:val="24"/>
+          <w:szCs w:val="24"/>
+        </w:rPr>
+        <w:t xml:space="preserve"> </w:t>
+      </w:r>
+      <w:r>
+        <w:rPr>
+          <w:rFonts w:ascii="Times New Roman" w:cs="Times New Roman" w:eastAsia="Times New Roman" w:hAnsi="Times New Roman"/>
+          <w:sz w:val="24"/>
+          <w:szCs w:val="24"/>
+        </w:rPr>
+        <w:t xml:space="preserve">106-129.</w:t>
+      </w:r>
+    </w:p>
+    <w:p>
+      <w:pPr>
+        <w:bidi/>
+        <w:spacing w:after="120" w:line="360"/>
+        <w:ind w:start="709" w:hanging="709"/>
+        <w:jc w:val="right"/>
+      </w:pPr>
+      <w:r>
+        <w:rPr>
+          <w:rFonts w:ascii="David" w:cs="David" w:eastAsia="David" w:hAnsi="David"/>
+          <w:sz w:val="24"/>
+          <w:szCs w:val="24"/>
+          <w:rtl/>
+        </w:rPr>
+        <w:t xml:space="preserve">פלד-לסקוב, ר' ותימור, א' (</w:t>
+      </w:r>
+      <w:r>
+        <w:rPr>
+          <w:rFonts w:ascii="Times New Roman" w:cs="Times New Roman" w:eastAsia="Times New Roman" w:hAnsi="Times New Roman"/>
+          <w:sz w:val="24"/>
+          <w:szCs w:val="24"/>
+        </w:rPr>
+        <w:t xml:space="preserve">2024</w:t>
+      </w:r>
+      <w:r>
+        <w:rPr>
+          <w:rFonts w:ascii="David" w:cs="David" w:eastAsia="David" w:hAnsi="David"/>
+          <w:sz w:val="24"/>
+          <w:szCs w:val="24"/>
+          <w:rtl/>
+        </w:rPr>
+        <w:t xml:space="preserve">). אל החיים "מאחורי הסורגים": תהליכי שיקום בעיני אסירים משוחררים. צוהר לבית הסוהר: מחקרים בכליאה, ביטחון ואכיפה, </w:t>
+      </w:r>
+      <w:r>
+        <w:rPr>
+          <w:rFonts w:ascii="Times New Roman" w:cs="Times New Roman" w:eastAsia="Times New Roman" w:hAnsi="Times New Roman"/>
+          <w:sz w:val="24"/>
+          <w:szCs w:val="24"/>
+        </w:rPr>
+        <w:t xml:space="preserve">22,</w:t>
+      </w:r>
+      <w:r>
+        <w:rPr>
+          <w:rFonts w:ascii="Times New Roman" w:cs="Times New Roman" w:eastAsia="Times New Roman" w:hAnsi="Times New Roman"/>
+          <w:sz w:val="24"/>
+          <w:szCs w:val="24"/>
+        </w:rPr>
+        <w:t xml:space="preserve"> </w:t>
+      </w:r>
+      <w:r>
+        <w:rPr>
+          <w:rFonts w:ascii="Times New Roman" w:cs="Times New Roman" w:eastAsia="Times New Roman" w:hAnsi="Times New Roman"/>
+          <w:sz w:val="24"/>
+          <w:szCs w:val="24"/>
+        </w:rPr>
+        <w:t xml:space="preserve">43-61.</w:t>
+      </w:r>
+    </w:p>
+    <w:p>
+      <w:pPr>
+        <w:bidi/>
+        <w:spacing w:after="120" w:line="360"/>
+        <w:ind w:start="709" w:hanging="709"/>
+        <w:jc w:val="right"/>
+      </w:pPr>
+      <w:r>
+        <w:rPr>
+          <w:rFonts w:ascii="David" w:cs="David" w:eastAsia="David" w:hAnsi="David"/>
+          <w:sz w:val="24"/>
+          <w:szCs w:val="24"/>
+          <w:rtl/>
+        </w:rPr>
+        <w:t xml:space="preserve">שני, נ', חמלניצקי, מ', תימור, א' ואידיסיס, י' (</w:t>
+      </w:r>
+      <w:r>
+        <w:rPr>
+          <w:rFonts w:ascii="Times New Roman" w:cs="Times New Roman" w:eastAsia="Times New Roman" w:hAnsi="Times New Roman"/>
+          <w:sz w:val="24"/>
+          <w:szCs w:val="24"/>
+        </w:rPr>
+        <w:t xml:space="preserve">2024</w:t>
+      </w:r>
+      <w:r>
+        <w:rPr>
+          <w:rFonts w:ascii="David" w:cs="David" w:eastAsia="David" w:hAnsi="David"/>
+          <w:sz w:val="24"/>
+          <w:szCs w:val="24"/>
+          <w:rtl/>
+        </w:rPr>
+        <w:t xml:space="preserve">). איזה מין טיפול: התרומה של השתתפות בקבוצה פסיכו-חינוכית מורחבת מכינה לטיפול ייעודי בפוגעים מינית להפחתה של מתח נפשי, להעלאת רווחה נפשית סובייקטיבית ולהגברה של מיקוד שליטה פנימי. צוהר לבית הסוהר: מחקרים בכליאה, ביטחון ואכיפה, </w:t>
+      </w:r>
+      <w:r>
+        <w:rPr>
+          <w:rFonts w:ascii="Times New Roman" w:cs="Times New Roman" w:eastAsia="Times New Roman" w:hAnsi="Times New Roman"/>
+          <w:sz w:val="24"/>
+          <w:szCs w:val="24"/>
+        </w:rPr>
+        <w:t xml:space="preserve">22,</w:t>
+      </w:r>
+      <w:r>
+        <w:rPr>
+          <w:rFonts w:ascii="Times New Roman" w:cs="Times New Roman" w:eastAsia="Times New Roman" w:hAnsi="Times New Roman"/>
+          <w:sz w:val="24"/>
+          <w:szCs w:val="24"/>
+        </w:rPr>
+        <w:t xml:space="preserve"> </w:t>
+      </w:r>
+      <w:r>
+        <w:rPr>
+          <w:rFonts w:ascii="Times New Roman" w:cs="Times New Roman" w:eastAsia="Times New Roman" w:hAnsi="Times New Roman"/>
+          <w:sz w:val="24"/>
+          <w:szCs w:val="24"/>
+        </w:rPr>
+        <w:t xml:space="preserve">158-171.</w:t>
       </w:r>
     </w:p>
     <w:p>
@@ -15016,7 +15408,7 @@
           <w:sz w:val="24"/>
           <w:szCs w:val="24"/>
         </w:rPr>
-        <w:t xml:space="preserve">Beijersbergen, K. A., Dirkzwager, A. J. E., Eichelsheim, V. I., van der Laan, P. H., &amp; Nieuwbeerta, P. (2014). Procedural justice and prisoners' mental health problems: A longitudinal study. </w:t>
+        <w:t xml:space="preserve">Beijersbergen, K. A., Dirkzwager, A. J. E., Molleman, T., van der Laan, P. H., &amp; Nieuwbeerta, P. (2015). Procedural justice in prison: The importance of staff characteristics. </w:t>
       </w:r>
       <w:r>
         <w:rPr>
@@ -15026,7 +15418,7 @@
           <w:sz w:val="24"/>
           <w:szCs w:val="24"/>
         </w:rPr>
-        <w:t xml:space="preserve">Criminal Behaviour and Mental Health, 24</w:t>
+        <w:t xml:space="preserve">International Journal of Offender Therapy and Comparative Criminology, 59</w:t>
       </w:r>
       <w:r>
         <w:rPr>
@@ -15036,7 +15428,7 @@
           <w:sz w:val="24"/>
           <w:szCs w:val="24"/>
         </w:rPr>
-        <w:t xml:space="preserve">(2), 100-112. https://doi.org/10.1002/cbm.1881</w:t>
+        <w:t xml:space="preserve">(4), 337-358. https://doi.org/10.1177/0306624X13512767</w:t>
       </w:r>
     </w:p>
     <w:p>
@@ -15053,7 +15445,7 @@
           <w:sz w:val="24"/>
           <w:szCs w:val="24"/>
         </w:rPr>
-        <w:t xml:space="preserve">Beijersbergen, K. A., Dirkzwager, A. J. E., Molleman, T., van der Laan, P. H., &amp; Nieuwbeerta, P. (2015). Procedural justice in prison: The importance of staff characteristics. </w:t>
+        <w:t xml:space="preserve">Brunton-Smith, I., &amp; McCarthy, D. J. (2016). Prison legitimacy and procedural fairness: A multilevel examination of prisoners in England and Wales. </w:t>
       </w:r>
       <w:r>
         <w:rPr>
@@ -15063,7 +15455,7 @@
           <w:sz w:val="24"/>
           <w:szCs w:val="24"/>
         </w:rPr>
-        <w:t xml:space="preserve">International Journal of Offender Therapy and Comparative Criminology, 59</w:t>
+        <w:t xml:space="preserve">Justice Quarterly, 33</w:t>
       </w:r>
       <w:r>
         <w:rPr>
@@ -15073,7 +15465,7 @@
           <w:sz w:val="24"/>
           <w:szCs w:val="24"/>
         </w:rPr>
-        <w:t xml:space="preserve">(4), 337-358. https://doi.org/10.1177/0306624X13512767</w:t>
+        <w:t xml:space="preserve">(6), 1029-1054. https://doi.org/10.1080/07418825.2015.1023215</w:t>
       </w:r>
     </w:p>
     <w:p>
@@ -15090,7 +15482,7 @@
           <w:sz w:val="24"/>
           <w:szCs w:val="24"/>
         </w:rPr>
-        <w:t xml:space="preserve">Brunton-Smith, I., &amp; McCarthy, D. J. (2016). Prison legitimacy and procedural fairness: A multilevel examination of prisoners in England and Wales. </w:t>
+        <w:t xml:space="preserve">Franke, D., Bierie, D., &amp; MacKenzie, D. L. (2010). Legitimacy in corrections: A randomized experiment comparing a boot camp with a prison. </w:t>
       </w:r>
       <w:r>
         <w:rPr>
@@ -15100,7 +15492,7 @@
           <w:sz w:val="24"/>
           <w:szCs w:val="24"/>
         </w:rPr>
-        <w:t xml:space="preserve">Justice Quarterly, 33</w:t>
+        <w:t xml:space="preserve">Criminology &amp; Public Policy, 9</w:t>
       </w:r>
       <w:r>
         <w:rPr>
@@ -15110,7 +15502,7 @@
           <w:sz w:val="24"/>
           <w:szCs w:val="24"/>
         </w:rPr>
-        <w:t xml:space="preserve">(6), 1029-1054. https://doi.org/10.1080/07418825.2015.1023215</w:t>
+        <w:t xml:space="preserve">(1), 89-117. https://doi.org/10.1111/j.1745-9133.2010.00613.x</w:t>
       </w:r>
     </w:p>
     <w:p>
@@ -15127,7 +15519,7 @@
           <w:sz w:val="24"/>
           <w:szCs w:val="24"/>
         </w:rPr>
-        <w:t xml:space="preserve">Franke, D., Bierie, D., &amp; MacKenzie, D. L. (2010). Legitimacy in corrections: A randomized experiment comparing a boot camp with a prison. </w:t>
+        <w:t xml:space="preserve">Hacin, R., &amp; Meško, G. (2018). Prisoners' perception of legitimacy of the prison staff: A qualitative study in Slovene prisons. </w:t>
       </w:r>
       <w:r>
         <w:rPr>
@@ -15137,7 +15529,7 @@
           <w:sz w:val="24"/>
           <w:szCs w:val="24"/>
         </w:rPr>
-        <w:t xml:space="preserve">Criminology &amp; Public Policy, 9</w:t>
+        <w:t xml:space="preserve">International Journal of Offender Therapy and Comparative Criminology, 62</w:t>
       </w:r>
       <w:r>
         <w:rPr>
@@ -15147,7 +15539,7 @@
           <w:sz w:val="24"/>
           <w:szCs w:val="24"/>
         </w:rPr>
-        <w:t xml:space="preserve">(1), 89-117. https://doi.org/10.1111/j.1745-9133.2010.00613.x</w:t>
+        <w:t xml:space="preserve">(13), 4332-4350. https://doi.org/10.1177/0306624X18758896</w:t>
       </w:r>
     </w:p>
     <w:p>
@@ -15164,7 +15556,7 @@
           <w:sz w:val="24"/>
           <w:szCs w:val="24"/>
         </w:rPr>
-        <w:t xml:space="preserve">Hacin, R., &amp; Meško, G. (2018). Prisoners' perception of legitimacy of the prison staff: A qualitative study in Slovene prisons. </w:t>
+        <w:t xml:space="preserve">Ryan, C., &amp; Bergin, M. (2022). Procedural justice and legitimacy in prisons: A review of extant empirical literature. </w:t>
       </w:r>
       <w:r>
         <w:rPr>
@@ -15174,7 +15566,7 @@
           <w:sz w:val="24"/>
           <w:szCs w:val="24"/>
         </w:rPr>
-        <w:t xml:space="preserve">International Journal of Offender Therapy and Comparative Criminology, 62</w:t>
+        <w:t xml:space="preserve">Criminal Justice and Behavior, 49</w:t>
       </w:r>
       <w:r>
         <w:rPr>
@@ -15184,7 +15576,7 @@
           <w:sz w:val="24"/>
           <w:szCs w:val="24"/>
         </w:rPr>
-        <w:t xml:space="preserve">(13), 4332-4350. https://doi.org/10.1177/0306624X18758896</w:t>
+        <w:t xml:space="preserve">(2), 143-163. https://doi.org/10.1177/00938548211053367</w:t>
       </w:r>
     </w:p>
     <w:p>
@@ -15201,7 +15593,7 @@
           <w:sz w:val="24"/>
           <w:szCs w:val="24"/>
         </w:rPr>
-        <w:t xml:space="preserve">Liebling, A. (2004). </w:t>
+        <w:t xml:space="preserve">Sargeant, E., Murphy, K., Barkworth, J., &amp; Howard, M. v. A. (2026). Procedural justice and mental well-being in prisons: The mediating roles of staff relationships and prison safety. </w:t>
       </w:r>
       <w:r>
         <w:rPr>
@@ -15211,7 +15603,7 @@
           <w:sz w:val="24"/>
           <w:szCs w:val="24"/>
         </w:rPr>
-        <w:t xml:space="preserve">Prisons and their moral performance: A study of values, quality, and prison life</w:t>
+        <w:t xml:space="preserve">Criminal Justice and Behavior, 53</w:t>
       </w:r>
       <w:r>
         <w:rPr>
@@ -15221,7 +15613,7 @@
           <w:sz w:val="24"/>
           <w:szCs w:val="24"/>
         </w:rPr>
-        <w:t xml:space="preserve">. Oxford University Press.</w:t>
+        <w:t xml:space="preserve">(5), 619-639. https://doi.org/10.1177/00938548251400649</w:t>
       </w:r>
     </w:p>
     <w:p>
@@ -15238,7 +15630,7 @@
           <w:sz w:val="24"/>
           <w:szCs w:val="24"/>
         </w:rPr>
-        <w:t xml:space="preserve">Liebling, A., &amp; Maruna, S. (Eds.). (2005). </w:t>
+        <w:t xml:space="preserve">Schnittker, J. (2025). Trusting relationships in prison and well-being after release. </w:t>
       </w:r>
       <w:r>
         <w:rPr>
@@ -15248,7 +15640,7 @@
           <w:sz w:val="24"/>
           <w:szCs w:val="24"/>
         </w:rPr>
-        <w:t xml:space="preserve">The effects of imprisonment</w:t>
+        <w:t xml:space="preserve">SSM - Mental Health, 8</w:t>
       </w:r>
       <w:r>
         <w:rPr>
@@ -15258,7 +15650,7 @@
           <w:sz w:val="24"/>
           <w:szCs w:val="24"/>
         </w:rPr>
-        <w:t xml:space="preserve">. Willan.</w:t>
+        <w:t xml:space="preserve">, Article 100539. https://doi.org/10.1016/j.ssmmh.2025.100539</w:t>
       </w:r>
     </w:p>
     <w:p>
@@ -15275,7 +15667,7 @@
           <w:sz w:val="24"/>
           <w:szCs w:val="24"/>
         </w:rPr>
-        <w:t xml:space="preserve">Ryan, C., &amp; Bergin, M. (2022). Procedural justice and legitimacy in prisons: A review of extant empirical literature. </w:t>
+        <w:t xml:space="preserve">Sparks, J. R., &amp; Bottoms, A. E. (1995). Legitimacy and order in prisons. </w:t>
       </w:r>
       <w:r>
         <w:rPr>
@@ -15285,7 +15677,7 @@
           <w:sz w:val="24"/>
           <w:szCs w:val="24"/>
         </w:rPr>
-        <w:t xml:space="preserve">Criminal Justice and Behavior, 49</w:t>
+        <w:t xml:space="preserve">British Journal of Sociology, 46</w:t>
       </w:r>
       <w:r>
         <w:rPr>
@@ -15295,7 +15687,7 @@
           <w:sz w:val="24"/>
           <w:szCs w:val="24"/>
         </w:rPr>
-        <w:t xml:space="preserve">(2), 143-163. https://doi.org/10.1177/00938548211053367</w:t>
+        <w:t xml:space="preserve">(1), 45-62. https://doi.org/10.2307/591622</w:t>
       </w:r>
     </w:p>
     <w:p>
@@ -15312,7 +15704,7 @@
           <w:sz w:val="24"/>
           <w:szCs w:val="24"/>
         </w:rPr>
-        <w:t xml:space="preserve">Sargeant, E., Murphy, K., Barkworth, J., &amp; Howard, M. v. A. (2026). Procedural justice and mental well-being in prisons: The mediating roles of staff relationships and prison safety. </w:t>
+        <w:t xml:space="preserve">Van Ginneken, E. F. J. C., Palmen, H., Bosma, A. Q., &amp; Sentse, M. (2019). Bearing the weight of imprisonment: The relationship between prison climate and well-being. </w:t>
       </w:r>
       <w:r>
         <w:rPr>
@@ -15322,7 +15714,7 @@
           <w:sz w:val="24"/>
           <w:szCs w:val="24"/>
         </w:rPr>
-        <w:t xml:space="preserve">Criminal Justice and Behavior, 53</w:t>
+        <w:t xml:space="preserve">Criminal Justice and Behavior, 46</w:t>
       </w:r>
       <w:r>
         <w:rPr>
@@ -15332,229 +15724,7 @@
           <w:sz w:val="24"/>
           <w:szCs w:val="24"/>
         </w:rPr>
-        <w:t xml:space="preserve">(5), 619-639. https://doi.org/10.1177/00938548251400649</w:t>
-      </w:r>
-    </w:p>
-    <w:p>
-      <w:pPr>
-        <w:spacing w:after="120" w:line="360"/>
-        <w:ind w:left="709" w:hanging="709"/>
-        <w:jc w:val="left"/>
-      </w:pPr>
-      <w:r>
-        <w:rPr>
-          <w:rFonts w:ascii="Times New Roman" w:cs="Times New Roman" w:eastAsia="Times New Roman" w:hAnsi="Times New Roman"/>
-          <w:i w:val="false"/>
-          <w:iCs w:val="false"/>
-          <w:sz w:val="24"/>
-          <w:szCs w:val="24"/>
-        </w:rPr>
-        <w:t xml:space="preserve">Schnittker, J. (2025). Trusting relationships in prison and well-being after release. </w:t>
-      </w:r>
-      <w:r>
-        <w:rPr>
-          <w:rFonts w:ascii="Times New Roman" w:cs="Times New Roman" w:eastAsia="Times New Roman" w:hAnsi="Times New Roman"/>
-          <w:i/>
-          <w:iCs/>
-          <w:sz w:val="24"/>
-          <w:szCs w:val="24"/>
-        </w:rPr>
-        <w:t xml:space="preserve">SSM - Mental Health, 8</w:t>
-      </w:r>
-      <w:r>
-        <w:rPr>
-          <w:rFonts w:ascii="Times New Roman" w:cs="Times New Roman" w:eastAsia="Times New Roman" w:hAnsi="Times New Roman"/>
-          <w:i w:val="false"/>
-          <w:iCs w:val="false"/>
-          <w:sz w:val="24"/>
-          <w:szCs w:val="24"/>
-        </w:rPr>
-        <w:t xml:space="preserve">, Article 100539. https://doi.org/10.1016/j.ssmmh.2025.100539</w:t>
-      </w:r>
-    </w:p>
-    <w:p>
-      <w:pPr>
-        <w:spacing w:after="120" w:line="360"/>
-        <w:ind w:left="709" w:hanging="709"/>
-        <w:jc w:val="left"/>
-      </w:pPr>
-      <w:r>
-        <w:rPr>
-          <w:rFonts w:ascii="Times New Roman" w:cs="Times New Roman" w:eastAsia="Times New Roman" w:hAnsi="Times New Roman"/>
-          <w:i w:val="false"/>
-          <w:iCs w:val="false"/>
-          <w:sz w:val="24"/>
-          <w:szCs w:val="24"/>
-        </w:rPr>
-        <w:t xml:space="preserve">Sparks, J. R., &amp; Bottoms, A. E. (1995). Legitimacy and order in prisons. </w:t>
-      </w:r>
-      <w:r>
-        <w:rPr>
-          <w:rFonts w:ascii="Times New Roman" w:cs="Times New Roman" w:eastAsia="Times New Roman" w:hAnsi="Times New Roman"/>
-          <w:i/>
-          <w:iCs/>
-          <w:sz w:val="24"/>
-          <w:szCs w:val="24"/>
-        </w:rPr>
-        <w:t xml:space="preserve">British Journal of Sociology, 46</w:t>
-      </w:r>
-      <w:r>
-        <w:rPr>
-          <w:rFonts w:ascii="Times New Roman" w:cs="Times New Roman" w:eastAsia="Times New Roman" w:hAnsi="Times New Roman"/>
-          <w:i w:val="false"/>
-          <w:iCs w:val="false"/>
-          <w:sz w:val="24"/>
-          <w:szCs w:val="24"/>
-        </w:rPr>
-        <w:t xml:space="preserve">(1), 45-62. https://doi.org/10.2307/591622</w:t>
-      </w:r>
-    </w:p>
-    <w:p>
-      <w:pPr>
-        <w:spacing w:after="120" w:line="360"/>
-        <w:ind w:left="709" w:hanging="709"/>
-        <w:jc w:val="left"/>
-      </w:pPr>
-      <w:r>
-        <w:rPr>
-          <w:rFonts w:ascii="Times New Roman" w:cs="Times New Roman" w:eastAsia="Times New Roman" w:hAnsi="Times New Roman"/>
-          <w:i w:val="false"/>
-          <w:iCs w:val="false"/>
-          <w:sz w:val="24"/>
-          <w:szCs w:val="24"/>
-        </w:rPr>
-        <w:t xml:space="preserve">Sykes, G. M. (1958). </w:t>
-      </w:r>
-      <w:r>
-        <w:rPr>
-          <w:rFonts w:ascii="Times New Roman" w:cs="Times New Roman" w:eastAsia="Times New Roman" w:hAnsi="Times New Roman"/>
-          <w:i/>
-          <w:iCs/>
-          <w:sz w:val="24"/>
-          <w:szCs w:val="24"/>
-        </w:rPr>
-        <w:t xml:space="preserve">The society of captives: A study of a maximum security prison</w:t>
-      </w:r>
-      <w:r>
-        <w:rPr>
-          <w:rFonts w:ascii="Times New Roman" w:cs="Times New Roman" w:eastAsia="Times New Roman" w:hAnsi="Times New Roman"/>
-          <w:i w:val="false"/>
-          <w:iCs w:val="false"/>
-          <w:sz w:val="24"/>
-          <w:szCs w:val="24"/>
-        </w:rPr>
-        <w:t xml:space="preserve">. Princeton University Press.</w:t>
-      </w:r>
-    </w:p>
-    <w:p>
-      <w:pPr>
-        <w:spacing w:after="120" w:line="360"/>
-        <w:ind w:left="709" w:hanging="709"/>
-        <w:jc w:val="left"/>
-      </w:pPr>
-      <w:r>
-        <w:rPr>
-          <w:rFonts w:ascii="Times New Roman" w:cs="Times New Roman" w:eastAsia="Times New Roman" w:hAnsi="Times New Roman"/>
-          <w:i w:val="false"/>
-          <w:iCs w:val="false"/>
-          <w:sz w:val="24"/>
-          <w:szCs w:val="24"/>
-        </w:rPr>
-        <w:t xml:space="preserve">Tyler, T. R. (1990). </w:t>
-      </w:r>
-      <w:r>
-        <w:rPr>
-          <w:rFonts w:ascii="Times New Roman" w:cs="Times New Roman" w:eastAsia="Times New Roman" w:hAnsi="Times New Roman"/>
-          <w:i/>
-          <w:iCs/>
-          <w:sz w:val="24"/>
-          <w:szCs w:val="24"/>
-        </w:rPr>
-        <w:t xml:space="preserve">Why people obey the law</w:t>
-      </w:r>
-      <w:r>
-        <w:rPr>
-          <w:rFonts w:ascii="Times New Roman" w:cs="Times New Roman" w:eastAsia="Times New Roman" w:hAnsi="Times New Roman"/>
-          <w:i w:val="false"/>
-          <w:iCs w:val="false"/>
-          <w:sz w:val="24"/>
-          <w:szCs w:val="24"/>
-        </w:rPr>
-        <w:t xml:space="preserve">. Yale University Press.</w:t>
-      </w:r>
-    </w:p>
-    <w:p>
-      <w:pPr>
-        <w:spacing w:after="120" w:line="360"/>
-        <w:ind w:left="709" w:hanging="709"/>
-        <w:jc w:val="left"/>
-      </w:pPr>
-      <w:r>
-        <w:rPr>
-          <w:rFonts w:ascii="Times New Roman" w:cs="Times New Roman" w:eastAsia="Times New Roman" w:hAnsi="Times New Roman"/>
-          <w:i w:val="false"/>
-          <w:iCs w:val="false"/>
-          <w:sz w:val="24"/>
-          <w:szCs w:val="24"/>
-        </w:rPr>
-        <w:t xml:space="preserve">Van Ginneken, E. F. J. C., Palmen, H., Bosma, A. Q., &amp; Sentse, M. (2019). Bearing the weight of imprisonment: The relationship between prison climate and well-being. </w:t>
-      </w:r>
-      <w:r>
-        <w:rPr>
-          <w:rFonts w:ascii="Times New Roman" w:cs="Times New Roman" w:eastAsia="Times New Roman" w:hAnsi="Times New Roman"/>
-          <w:i/>
-          <w:iCs/>
-          <w:sz w:val="24"/>
-          <w:szCs w:val="24"/>
-        </w:rPr>
-        <w:t xml:space="preserve">Criminal Justice and Behavior, 46</w:t>
-      </w:r>
-      <w:r>
-        <w:rPr>
-          <w:rFonts w:ascii="Times New Roman" w:cs="Times New Roman" w:eastAsia="Times New Roman" w:hAnsi="Times New Roman"/>
-          <w:i w:val="false"/>
-          <w:iCs w:val="false"/>
-          <w:sz w:val="24"/>
-          <w:szCs w:val="24"/>
-        </w:rPr>
         <w:t xml:space="preserve">(10), 1385-1404. https://doi.org/10.1177/0093854819867373</w:t>
-      </w:r>
-    </w:p>
-    <w:p>
-      <w:pPr>
-        <w:spacing w:after="120" w:line="360"/>
-        <w:ind w:left="709" w:hanging="709"/>
-        <w:jc w:val="left"/>
-      </w:pPr>
-      <w:r>
-        <w:rPr>
-          <w:rFonts w:ascii="Times New Roman" w:cs="Times New Roman" w:eastAsia="Times New Roman" w:hAnsi="Times New Roman"/>
-          <w:i w:val="false"/>
-          <w:iCs w:val="false"/>
-          <w:sz w:val="24"/>
-          <w:szCs w:val="24"/>
-        </w:rPr>
-        <w:t xml:space="preserve">van Hall, M., Baker, T., Nieuwbeerta, P., &amp; Dirkzwager, A. J. E. (2025). Procedural justice spill-over and recidivism after release from prison. </w:t>
-      </w:r>
-      <w:r>
-        <w:rPr>
-          <w:rFonts w:ascii="Times New Roman" w:cs="Times New Roman" w:eastAsia="Times New Roman" w:hAnsi="Times New Roman"/>
-          <w:i/>
-          <w:iCs/>
-          <w:sz w:val="24"/>
-          <w:szCs w:val="24"/>
-        </w:rPr>
-        <w:t xml:space="preserve">Crime &amp; Delinquency</w:t>
-      </w:r>
-      <w:r>
-        <w:rPr>
-          <w:rFonts w:ascii="Times New Roman" w:cs="Times New Roman" w:eastAsia="Times New Roman" w:hAnsi="Times New Roman"/>
-          <w:i w:val="false"/>
-          <w:iCs w:val="false"/>
-          <w:sz w:val="24"/>
-          <w:szCs w:val="24"/>
-        </w:rPr>
-        <w:t xml:space="preserve">. Advance online publication. https://doi.org/10.1177/00111287241248104</w:t>
       </w:r>
     </w:p>
     <w:p>

</xml_diff>

<commit_message>
Add four verified sources to the seminar paper
Co-Authored-By: Claude Fable 5.1 <noreply@anthropic.com>
Claude-Session: https://claude.ai/code/session_01KHo5ZcKCUwhCAvyoKeeMWs
</commit_message>
<xml_diff>
--- a/seminar/סמינריון_רווחה_נפשית_ולגיטימיות.docx
+++ b/seminar/סמינריון_רווחה_נפשית_ולגיטימיות.docx
@@ -692,6 +692,40 @@
           <w:szCs w:val="24"/>
           <w:rtl/>
         </w:rPr>
+        <w:t xml:space="preserve">). בעקבות פסיקת בג"ץ הפך השחרור המנהלי לכלי המרכזי לצמצום הצפיפות, וכיום משתחררים מדי שנה אלפי אסירים חודשים רבים לפני תום עונשם בלי שמסוכנותם נבחנת, ולעיתים בלי שידעו את מועד שחרורם עד ליום השחרור עצמו (גזל-אייל ומרזוק-מקלדה, </w:t>
+      </w:r>
+      <w:r>
+        <w:rPr>
+          <w:rFonts w:ascii="Times New Roman" w:cs="Times New Roman" w:eastAsia="Times New Roman" w:hAnsi="Times New Roman"/>
+          <w:sz w:val="24"/>
+          <w:szCs w:val="24"/>
+        </w:rPr>
+        <w:t xml:space="preserve">2023</w:t>
+      </w:r>
+      <w:r>
+        <w:rPr>
+          <w:rFonts w:ascii="David" w:cs="David" w:eastAsia="David" w:hAnsi="David"/>
+          <w:sz w:val="24"/>
+          <w:szCs w:val="24"/>
+          <w:rtl/>
+        </w:rPr>
+        <w:t xml:space="preserve">). המשפט הישראלי גם אינו קובע בחקיקה ראשית את תכליות הכליאה, והוא משלב תפיסה שלפיה העונש מתמצה בשלילת החירות עם רטוריקה שמכירה בסבל נוסף כחלק מהמאסר (דגן, </w:t>
+      </w:r>
+      <w:r>
+        <w:rPr>
+          <w:rFonts w:ascii="Times New Roman" w:cs="Times New Roman" w:eastAsia="Times New Roman" w:hAnsi="Times New Roman"/>
+          <w:sz w:val="24"/>
+          <w:szCs w:val="24"/>
+        </w:rPr>
+        <w:t xml:space="preserve">2021</w:t>
+      </w:r>
+      <w:r>
+        <w:rPr>
+          <w:rFonts w:ascii="David" w:cs="David" w:eastAsia="David" w:hAnsi="David"/>
+          <w:sz w:val="24"/>
+          <w:szCs w:val="24"/>
+          <w:rtl/>
+        </w:rPr>
         <w:t xml:space="preserve">). ענף המחקר של שירות בתי הסוהר מקדם בשנים האחרונות מדיניות מבוססת נתונים, ובכלל זה הערכה שיטתית של תוכניות התקון (ועקנין, </w:t>
       </w:r>
       <w:r>
@@ -1381,6 +1415,40 @@
           <w:szCs w:val="24"/>
           <w:rtl/>
         </w:rPr>
+        <w:t xml:space="preserve">). גם בקרב </w:t>
+      </w:r>
+      <w:r>
+        <w:rPr>
+          <w:rFonts w:ascii="Times New Roman" w:cs="Times New Roman" w:eastAsia="Times New Roman" w:hAnsi="Times New Roman"/>
+          <w:sz w:val="24"/>
+          <w:szCs w:val="24"/>
+        </w:rPr>
+        <w:t xml:space="preserve">102</w:t>
+      </w:r>
+      <w:r>
+        <w:rPr>
+          <w:rFonts w:ascii="David" w:cs="David" w:eastAsia="David" w:hAnsi="David"/>
+          <w:sz w:val="24"/>
+          <w:szCs w:val="24"/>
+          <w:rtl/>
+        </w:rPr>
+        <w:t xml:space="preserve"> אסירים משוחררים שטופלו ברשות לשיקום האסיר נמצא שהרווחה הנפשית הסובייקטיבית, שנמדדה בשביעות רצון מהחיים וברגשות חיוביים ושליליים, קשורה חיובית לתמיכה חברתית ולהתמודדות דתית חיובית (מורלי ואחרים, </w:t>
+      </w:r>
+      <w:r>
+        <w:rPr>
+          <w:rFonts w:ascii="Times New Roman" w:cs="Times New Roman" w:eastAsia="Times New Roman" w:hAnsi="Times New Roman"/>
+          <w:sz w:val="24"/>
+          <w:szCs w:val="24"/>
+        </w:rPr>
+        <w:t xml:space="preserve">2019</w:t>
+      </w:r>
+      <w:r>
+        <w:rPr>
+          <w:rFonts w:ascii="David" w:cs="David" w:eastAsia="David" w:hAnsi="David"/>
+          <w:sz w:val="24"/>
+          <w:szCs w:val="24"/>
+          <w:rtl/>
+        </w:rPr>
         <w:t xml:space="preserve">). כיוון ההשפעה במחקרים אלו הוא מיחס הסגל ומההתערבות אל הרווחה. המחקר הנוכחי בוחן את הכיוון ההפוך, הרווחה הנפשית כמנבאת של תפיסת הסגל, ומכיוון שהוא מתאמי, אין בו כדי להכריע בין השניים אלא לבחון אם הקשר קיים בישראל ומה עוצמתו.</w:t>
       </w:r>
     </w:p>
@@ -1656,7 +1724,24 @@
           <w:szCs w:val="24"/>
           <w:rtl/>
         </w:rPr>
-        <w:t xml:space="preserve"> סיכמה את הספרות סביב שני צירים, מה מעצב את הלגיטימיות וכיצד היא קשורה לציות, והצביעה על כך שרוב המחקרים נערכו במדינות מערביות מעטות.</w:t>
+        <w:t xml:space="preserve"> סיכמה את הספרות סביב שני צירים, מה מעצב את הלגיטימיות וכיצד היא קשורה לציות, והצביעה על כך שרוב המחקרים נערכו במדינות מערביות מעטות. ביקורת עדכנית על הגישה הפרוצדורלית טוענת שהיא נשענת יותר מדי על יחס הוגן של הסוהרים ופחות מדי על מנגנוני השתתפות של אסירים בקבלת החלטות, שיכולים לקרב את ערכי המוסד לערכי האסירים וליצור ציות נורמטיבי יציב יותר </w:t>
+      </w:r>
+      <w:r>
+        <w:rPr>
+          <w:rFonts w:ascii="Times New Roman" w:cs="Times New Roman" w:eastAsia="Times New Roman" w:hAnsi="Times New Roman"/>
+          <w:sz w:val="24"/>
+          <w:szCs w:val="24"/>
+        </w:rPr>
+        <w:t xml:space="preserve">(Deambrogio, 2025)</w:t>
+      </w:r>
+      <w:r>
+        <w:rPr>
+          <w:rFonts w:ascii="David" w:cs="David" w:eastAsia="David" w:hAnsi="David"/>
+          <w:sz w:val="24"/>
+          <w:szCs w:val="24"/>
+          <w:rtl/>
+        </w:rPr>
+        <w:t xml:space="preserve">.</w:t>
       </w:r>
     </w:p>
     <w:p>
@@ -14372,7 +14457,41 @@
           <w:szCs w:val="24"/>
           <w:rtl/>
         </w:rPr>
-        <w:t xml:space="preserve">). ממצאיו של שניטקר </w:t>
+        <w:t xml:space="preserve">). ההקשר המשפטי מחזק את משמעות הממצא: כשמועד השחרור נקבע למעשה לפי מקום פנוי ולא לפי גזר הדין (גזל-אייל ומרזוק-מקלדה, </w:t>
+      </w:r>
+      <w:r>
+        <w:rPr>
+          <w:rFonts w:ascii="Times New Roman" w:cs="Times New Roman" w:eastAsia="Times New Roman" w:hAnsi="Times New Roman"/>
+          <w:sz w:val="24"/>
+          <w:szCs w:val="24"/>
+        </w:rPr>
+        <w:t xml:space="preserve">2023</w:t>
+      </w:r>
+      <w:r>
+        <w:rPr>
+          <w:rFonts w:ascii="David" w:cs="David" w:eastAsia="David" w:hAnsi="David"/>
+          <w:sz w:val="24"/>
+          <w:szCs w:val="24"/>
+          <w:rtl/>
+        </w:rPr>
+        <w:t xml:space="preserve">), וכשתכליות הכליאה אינן קבועות בחקיקה (דגן, </w:t>
+      </w:r>
+      <w:r>
+        <w:rPr>
+          <w:rFonts w:ascii="Times New Roman" w:cs="Times New Roman" w:eastAsia="Times New Roman" w:hAnsi="Times New Roman"/>
+          <w:sz w:val="24"/>
+          <w:szCs w:val="24"/>
+        </w:rPr>
+        <w:t xml:space="preserve">2021</w:t>
+      </w:r>
+      <w:r>
+        <w:rPr>
+          <w:rFonts w:ascii="David" w:cs="David" w:eastAsia="David" w:hAnsi="David"/>
+          <w:sz w:val="24"/>
+          <w:szCs w:val="24"/>
+          <w:rtl/>
+        </w:rPr>
+        <w:t xml:space="preserve">), יחס הסגל באגף נותר אחד ממרכיבי ההוגנות המעטים שהאסיר חווה ישירות. ממצאיו של שניטקר </w:t>
       </w:r>
       <w:r>
         <w:rPr>
@@ -14389,7 +14508,24 @@
           <w:szCs w:val="24"/>
           <w:rtl/>
         </w:rPr>
-        <w:t xml:space="preserve">, שלפיהם יחסי כבוד ואמון עם הסגל ממשיכים להשפיע על הרווחה גם בשנה שאחרי השחרור, מלמדים שהשקעה בלגיטימיות באגף היא גם השקעה בשיקום, וזהו בדיוק הקשר שהסקר הישראלי זיהה בין לגיטימיות לפעילויות השיקום.</w:t>
+        <w:t xml:space="preserve">, שלפיהם יחסי כבוד ואמון עם הסגל ממשיכים להשפיע על הרווחה גם בשנה שאחרי השחרור, יחד עם הממצא הישראלי על תרומת התמיכה החברתית לרווחתם של אסירים משוחררים (מורלי ואחרים, </w:t>
+      </w:r>
+      <w:r>
+        <w:rPr>
+          <w:rFonts w:ascii="Times New Roman" w:cs="Times New Roman" w:eastAsia="Times New Roman" w:hAnsi="Times New Roman"/>
+          <w:sz w:val="24"/>
+          <w:szCs w:val="24"/>
+        </w:rPr>
+        <w:t xml:space="preserve">2019</w:t>
+      </w:r>
+      <w:r>
+        <w:rPr>
+          <w:rFonts w:ascii="David" w:cs="David" w:eastAsia="David" w:hAnsi="David"/>
+          <w:sz w:val="24"/>
+          <w:szCs w:val="24"/>
+          <w:rtl/>
+        </w:rPr>
+        <w:t xml:space="preserve">), מלמדים שהשקעה בלגיטימיות באגף היא גם השקעה בשיקום, וזהו בדיוק הקשר שהסקר הישראלי זיהה בין לגיטימיות לפעילויות השיקום.</w:t>
       </w:r>
     </w:p>
     <w:p>
@@ -14511,7 +14647,24 @@
           <w:szCs w:val="24"/>
           <w:rtl/>
         </w:rPr>
-        <w:t xml:space="preserve">.</w:t>
+        <w:t xml:space="preserve">. החמישית, בעקבות הביקורת על הגישה הפרוצדורלית </w:t>
+      </w:r>
+      <w:r>
+        <w:rPr>
+          <w:rFonts w:ascii="Times New Roman" w:cs="Times New Roman" w:eastAsia="Times New Roman" w:hAnsi="Times New Roman"/>
+          <w:sz w:val="24"/>
+          <w:szCs w:val="24"/>
+        </w:rPr>
+        <w:t xml:space="preserve">(Deambrogio, 2025)</w:t>
+      </w:r>
+      <w:r>
+        <w:rPr>
+          <w:rFonts w:ascii="David" w:cs="David" w:eastAsia="David" w:hAnsi="David"/>
+          <w:sz w:val="24"/>
+          <w:szCs w:val="24"/>
+          <w:rtl/>
+        </w:rPr>
+        <w:t xml:space="preserve">, היא הקמת נציגות אסירים אגפית שנפגשת עם מנהל האגף אחת לחודש ומעלה נושאים לשיפור, כך שהלגיטימיות תישען לא רק על יחס הוגן של הסגל אלא גם על השתתפות.</w:t>
       </w:r>
     </w:p>
     <w:p>
@@ -14928,41 +15081,32 @@
           <w:szCs w:val="24"/>
           <w:rtl/>
         </w:rPr>
-        <w:t xml:space="preserve">דוידסקו, ע' וולק, ד' (</w:t>
-      </w:r>
-      <w:r>
-        <w:rPr>
-          <w:rFonts w:ascii="Times New Roman" w:cs="Times New Roman" w:eastAsia="Times New Roman" w:hAnsi="Times New Roman"/>
-          <w:sz w:val="24"/>
-          <w:szCs w:val="24"/>
-        </w:rPr>
-        <w:t xml:space="preserve">2015</w:t>
-      </w:r>
-      <w:r>
-        <w:rPr>
-          <w:rFonts w:ascii="David" w:cs="David" w:eastAsia="David" w:hAnsi="David"/>
-          <w:sz w:val="24"/>
-          <w:szCs w:val="24"/>
-          <w:rtl/>
-        </w:rPr>
-        <w:t xml:space="preserve">). תנאי כליאה של אסירים: בין רווחה לנוקשות [סקירת ספרות, פרסום מס' </w:t>
-      </w:r>
-      <w:r>
-        <w:rPr>
-          <w:rFonts w:ascii="Times New Roman" w:cs="Times New Roman" w:eastAsia="Times New Roman" w:hAnsi="Times New Roman"/>
-          <w:sz w:val="24"/>
-          <w:szCs w:val="24"/>
-        </w:rPr>
-        <w:t xml:space="preserve">LR-02-2015</w:t>
-      </w:r>
-      <w:r>
-        <w:rPr>
-          <w:rFonts w:ascii="David" w:cs="David" w:eastAsia="David" w:hAnsi="David"/>
-          <w:sz w:val="24"/>
-          <w:szCs w:val="24"/>
-          <w:rtl/>
-        </w:rPr>
-        <w:t xml:space="preserve">]. שירות בתי הסוהר, מחלקת מחקר ואסטרטגיה.</w:t>
+        <w:t xml:space="preserve">גזל-אייל, א' ומרזוק-מקלדה, פ' (</w:t>
+      </w:r>
+      <w:r>
+        <w:rPr>
+          <w:rFonts w:ascii="Times New Roman" w:cs="Times New Roman" w:eastAsia="Times New Roman" w:hAnsi="Times New Roman"/>
+          <w:sz w:val="24"/>
+          <w:szCs w:val="24"/>
+        </w:rPr>
+        <w:t xml:space="preserve">2023</w:t>
+      </w:r>
+      <w:r>
+        <w:rPr>
+          <w:rFonts w:ascii="David" w:cs="David" w:eastAsia="David" w:hAnsi="David"/>
+          <w:sz w:val="24"/>
+          <w:szCs w:val="24"/>
+          <w:rtl/>
+        </w:rPr>
+        <w:t xml:space="preserve">). מהפכת השחרור המנהלי: ממדיניות כליאה מבוססת ביקוש למדיניות מבוססת היצע. עיוני משפט, מז, </w:t>
+      </w:r>
+      <w:r>
+        <w:rPr>
+          <w:rFonts w:ascii="Times New Roman" w:cs="Times New Roman" w:eastAsia="Times New Roman" w:hAnsi="Times New Roman"/>
+          <w:sz w:val="24"/>
+          <w:szCs w:val="24"/>
+        </w:rPr>
+        <w:t xml:space="preserve">57-123.</w:t>
       </w:r>
     </w:p>
     <w:p>
@@ -14979,48 +15123,32 @@
           <w:szCs w:val="24"/>
           <w:rtl/>
         </w:rPr>
-        <w:t xml:space="preserve">ועקנין, י' (</w:t>
-      </w:r>
-      <w:r>
-        <w:rPr>
-          <w:rFonts w:ascii="Times New Roman" w:cs="Times New Roman" w:eastAsia="Times New Roman" w:hAnsi="Times New Roman"/>
-          <w:sz w:val="24"/>
-          <w:szCs w:val="24"/>
-        </w:rPr>
-        <w:t xml:space="preserve">2024</w:t>
-      </w:r>
-      <w:r>
-        <w:rPr>
-          <w:rFonts w:ascii="David" w:cs="David" w:eastAsia="David" w:hAnsi="David"/>
-          <w:sz w:val="24"/>
-          <w:szCs w:val="24"/>
-          <w:rtl/>
-        </w:rPr>
-        <w:t xml:space="preserve">). בין שיקום ללגיטימיות: התפקיד של לגיטימיות בקשר שבין שביעות רצון מתנאי המחיה לשביעות רצון מפעילות חטו"ש בקרב כלואים פליליים בישראל. צוהר לבית הסוהר: מחקרים בכליאה, ביטחון ואכיפה, </w:t>
-      </w:r>
-      <w:r>
-        <w:rPr>
-          <w:rFonts w:ascii="Times New Roman" w:cs="Times New Roman" w:eastAsia="Times New Roman" w:hAnsi="Times New Roman"/>
-          <w:sz w:val="24"/>
-          <w:szCs w:val="24"/>
-        </w:rPr>
-        <w:t xml:space="preserve">22,</w:t>
-      </w:r>
-      <w:r>
-        <w:rPr>
-          <w:rFonts w:ascii="Times New Roman" w:cs="Times New Roman" w:eastAsia="Times New Roman" w:hAnsi="Times New Roman"/>
-          <w:sz w:val="24"/>
-          <w:szCs w:val="24"/>
-        </w:rPr>
-        <w:t xml:space="preserve"> </w:t>
-      </w:r>
-      <w:r>
-        <w:rPr>
-          <w:rFonts w:ascii="Times New Roman" w:cs="Times New Roman" w:eastAsia="Times New Roman" w:hAnsi="Times New Roman"/>
-          <w:sz w:val="24"/>
-          <w:szCs w:val="24"/>
-        </w:rPr>
-        <w:t xml:space="preserve">62-77.</w:t>
+        <w:t xml:space="preserve">דגן, נ' (</w:t>
+      </w:r>
+      <w:r>
+        <w:rPr>
+          <w:rFonts w:ascii="Times New Roman" w:cs="Times New Roman" w:eastAsia="Times New Roman" w:hAnsi="Times New Roman"/>
+          <w:sz w:val="24"/>
+          <w:szCs w:val="24"/>
+        </w:rPr>
+        <w:t xml:space="preserve">2021</w:t>
+      </w:r>
+      <w:r>
+        <w:rPr>
+          <w:rFonts w:ascii="David" w:cs="David" w:eastAsia="David" w:hAnsi="David"/>
+          <w:sz w:val="24"/>
+          <w:szCs w:val="24"/>
+          <w:rtl/>
+        </w:rPr>
+        <w:t xml:space="preserve">). שני מושגים של שלילת חירות: היחס בין שיקולי הענישה לתכליות הכליאה והשפעתו על זכויות האסיר. חוקים, טו, </w:t>
+      </w:r>
+      <w:r>
+        <w:rPr>
+          <w:rFonts w:ascii="Times New Roman" w:cs="Times New Roman" w:eastAsia="Times New Roman" w:hAnsi="Times New Roman"/>
+          <w:sz w:val="24"/>
+          <w:szCs w:val="24"/>
+        </w:rPr>
+        <w:t xml:space="preserve">9-48.</w:t>
       </w:r>
     </w:p>
     <w:p>
@@ -15037,24 +15165,41 @@
           <w:szCs w:val="24"/>
           <w:rtl/>
         </w:rPr>
-        <w:t xml:space="preserve">ועקנין, י' (</w:t>
-      </w:r>
-      <w:r>
-        <w:rPr>
-          <w:rFonts w:ascii="Times New Roman" w:cs="Times New Roman" w:eastAsia="Times New Roman" w:hAnsi="Times New Roman"/>
-          <w:sz w:val="24"/>
-          <w:szCs w:val="24"/>
-        </w:rPr>
-        <w:t xml:space="preserve">2025,</w:t>
-      </w:r>
-      <w:r>
-        <w:rPr>
-          <w:rFonts w:ascii="David" w:cs="David" w:eastAsia="David" w:hAnsi="David"/>
-          <w:sz w:val="24"/>
-          <w:szCs w:val="24"/>
-          <w:rtl/>
-        </w:rPr>
-        <w:t xml:space="preserve"> ינואר). אפקטיביות תוכניות התקון בשב"ס [מצגת הרצאה]. כנס מחקר שב"ס, שירות בתי הסוהר.</w:t>
+        <w:t xml:space="preserve">דוידסקו, ע' וולק, ד' (</w:t>
+      </w:r>
+      <w:r>
+        <w:rPr>
+          <w:rFonts w:ascii="Times New Roman" w:cs="Times New Roman" w:eastAsia="Times New Roman" w:hAnsi="Times New Roman"/>
+          <w:sz w:val="24"/>
+          <w:szCs w:val="24"/>
+        </w:rPr>
+        <w:t xml:space="preserve">2015</w:t>
+      </w:r>
+      <w:r>
+        <w:rPr>
+          <w:rFonts w:ascii="David" w:cs="David" w:eastAsia="David" w:hAnsi="David"/>
+          <w:sz w:val="24"/>
+          <w:szCs w:val="24"/>
+          <w:rtl/>
+        </w:rPr>
+        <w:t xml:space="preserve">). תנאי כליאה של אסירים: בין רווחה לנוקשות [סקירת ספרות, פרסום מס' </w:t>
+      </w:r>
+      <w:r>
+        <w:rPr>
+          <w:rFonts w:ascii="Times New Roman" w:cs="Times New Roman" w:eastAsia="Times New Roman" w:hAnsi="Times New Roman"/>
+          <w:sz w:val="24"/>
+          <w:szCs w:val="24"/>
+        </w:rPr>
+        <w:t xml:space="preserve">LR-02-2015</w:t>
+      </w:r>
+      <w:r>
+        <w:rPr>
+          <w:rFonts w:ascii="David" w:cs="David" w:eastAsia="David" w:hAnsi="David"/>
+          <w:sz w:val="24"/>
+          <w:szCs w:val="24"/>
+          <w:rtl/>
+        </w:rPr>
+        <w:t xml:space="preserve">]. שירות בתי הסוהר, מחלקת מחקר ואסטרטגיה.</w:t>
       </w:r>
     </w:p>
     <w:p>
@@ -15079,16 +15224,40 @@
           <w:sz w:val="24"/>
           <w:szCs w:val="24"/>
         </w:rPr>
-        <w:t xml:space="preserve">2026</w:t>
-      </w:r>
-      <w:r>
-        <w:rPr>
-          <w:rFonts w:ascii="David" w:cs="David" w:eastAsia="David" w:hAnsi="David"/>
-          <w:sz w:val="24"/>
-          <w:szCs w:val="24"/>
-          <w:rtl/>
-        </w:rPr>
-        <w:t xml:space="preserve">). סקר תנאי מחיה באגפים פליליים: מערך נתונים סינתטי להוראה, ספר משתנים ובנק שאלות מחקר [חומרי קורס]. סמינריון תנאי כליאה של אסירים פליליים בישראל ובעולם, המכללה האקדמית אשקלון.</w:t>
+        <w:t xml:space="preserve">2024</w:t>
+      </w:r>
+      <w:r>
+        <w:rPr>
+          <w:rFonts w:ascii="David" w:cs="David" w:eastAsia="David" w:hAnsi="David"/>
+          <w:sz w:val="24"/>
+          <w:szCs w:val="24"/>
+          <w:rtl/>
+        </w:rPr>
+        <w:t xml:space="preserve">). בין שיקום ללגיטימיות: התפקיד של לגיטימיות בקשר שבין שביעות רצון מתנאי המחיה לשביעות רצון מפעילות חטו"ש בקרב כלואים פליליים בישראל. צוהר לבית הסוהר: מחקרים בכליאה, ביטחון ואכיפה, </w:t>
+      </w:r>
+      <w:r>
+        <w:rPr>
+          <w:rFonts w:ascii="Times New Roman" w:cs="Times New Roman" w:eastAsia="Times New Roman" w:hAnsi="Times New Roman"/>
+          <w:sz w:val="24"/>
+          <w:szCs w:val="24"/>
+        </w:rPr>
+        <w:t xml:space="preserve">22,</w:t>
+      </w:r>
+      <w:r>
+        <w:rPr>
+          <w:rFonts w:ascii="Times New Roman" w:cs="Times New Roman" w:eastAsia="Times New Roman" w:hAnsi="Times New Roman"/>
+          <w:sz w:val="24"/>
+          <w:szCs w:val="24"/>
+        </w:rPr>
+        <w:t xml:space="preserve"> </w:t>
+      </w:r>
+      <w:r>
+        <w:rPr>
+          <w:rFonts w:ascii="Times New Roman" w:cs="Times New Roman" w:eastAsia="Times New Roman" w:hAnsi="Times New Roman"/>
+          <w:sz w:val="24"/>
+          <w:szCs w:val="24"/>
+        </w:rPr>
+        <w:t xml:space="preserve">62-77.</w:t>
       </w:r>
     </w:p>
     <w:p>
@@ -15105,24 +15274,24 @@
           <w:szCs w:val="24"/>
           <w:rtl/>
         </w:rPr>
-        <w:t xml:space="preserve">יכימוביץ-כהן, נ' (</w:t>
-      </w:r>
-      <w:r>
-        <w:rPr>
-          <w:rFonts w:ascii="Times New Roman" w:cs="Times New Roman" w:eastAsia="Times New Roman" w:hAnsi="Times New Roman"/>
-          <w:sz w:val="24"/>
-          <w:szCs w:val="24"/>
-        </w:rPr>
-        <w:t xml:space="preserve">2020</w:t>
-      </w:r>
-      <w:r>
-        <w:rPr>
-          <w:rFonts w:ascii="David" w:cs="David" w:eastAsia="David" w:hAnsi="David"/>
-          <w:sz w:val="24"/>
-          <w:szCs w:val="24"/>
-          <w:rtl/>
-        </w:rPr>
-        <w:t xml:space="preserve">). סוגיות בכליאה בישראל. הכנסת, מרכז המחקר והמידע.</w:t>
+        <w:t xml:space="preserve">ועקנין, י' (</w:t>
+      </w:r>
+      <w:r>
+        <w:rPr>
+          <w:rFonts w:ascii="Times New Roman" w:cs="Times New Roman" w:eastAsia="Times New Roman" w:hAnsi="Times New Roman"/>
+          <w:sz w:val="24"/>
+          <w:szCs w:val="24"/>
+        </w:rPr>
+        <w:t xml:space="preserve">2025,</w:t>
+      </w:r>
+      <w:r>
+        <w:rPr>
+          <w:rFonts w:ascii="David" w:cs="David" w:eastAsia="David" w:hAnsi="David"/>
+          <w:sz w:val="24"/>
+          <w:szCs w:val="24"/>
+          <w:rtl/>
+        </w:rPr>
+        <w:t xml:space="preserve"> ינואר). אפקטיביות תוכניות התקון בשב"ס [מצגת הרצאה]. כנס מחקר שב"ס, שירות בתי הסוהר.</w:t>
       </w:r>
     </w:p>
     <w:p>
@@ -15139,48 +15308,24 @@
           <w:szCs w:val="24"/>
           <w:rtl/>
         </w:rPr>
-        <w:t xml:space="preserve">יפתח-שרצקי, א' והראל, ש' (</w:t>
-      </w:r>
-      <w:r>
-        <w:rPr>
-          <w:rFonts w:ascii="Times New Roman" w:cs="Times New Roman" w:eastAsia="Times New Roman" w:hAnsi="Times New Roman"/>
-          <w:sz w:val="24"/>
-          <w:szCs w:val="24"/>
-        </w:rPr>
-        <w:t xml:space="preserve">2024</w:t>
-      </w:r>
-      <w:r>
-        <w:rPr>
-          <w:rFonts w:ascii="David" w:cs="David" w:eastAsia="David" w:hAnsi="David"/>
-          <w:sz w:val="24"/>
-          <w:szCs w:val="24"/>
-          <w:rtl/>
-        </w:rPr>
-        <w:t xml:space="preserve">). צללים מאחורי הסורגים: תסמינים פוסט טראומטיים, ויסות רגשי שלילי והשלכתם על תפקודם של אסירים בכלא. צוהר לבית הסוהר: מחקרים בכליאה, ביטחון ואכיפה, </w:t>
-      </w:r>
-      <w:r>
-        <w:rPr>
-          <w:rFonts w:ascii="Times New Roman" w:cs="Times New Roman" w:eastAsia="Times New Roman" w:hAnsi="Times New Roman"/>
-          <w:sz w:val="24"/>
-          <w:szCs w:val="24"/>
-        </w:rPr>
-        <w:t xml:space="preserve">22,</w:t>
-      </w:r>
-      <w:r>
-        <w:rPr>
-          <w:rFonts w:ascii="Times New Roman" w:cs="Times New Roman" w:eastAsia="Times New Roman" w:hAnsi="Times New Roman"/>
-          <w:sz w:val="24"/>
-          <w:szCs w:val="24"/>
-        </w:rPr>
-        <w:t xml:space="preserve"> </w:t>
-      </w:r>
-      <w:r>
-        <w:rPr>
-          <w:rFonts w:ascii="Times New Roman" w:cs="Times New Roman" w:eastAsia="Times New Roman" w:hAnsi="Times New Roman"/>
-          <w:sz w:val="24"/>
-          <w:szCs w:val="24"/>
-        </w:rPr>
-        <w:t xml:space="preserve">130-157.</w:t>
+        <w:t xml:space="preserve">ועקנין, י' (</w:t>
+      </w:r>
+      <w:r>
+        <w:rPr>
+          <w:rFonts w:ascii="Times New Roman" w:cs="Times New Roman" w:eastAsia="Times New Roman" w:hAnsi="Times New Roman"/>
+          <w:sz w:val="24"/>
+          <w:szCs w:val="24"/>
+        </w:rPr>
+        <w:t xml:space="preserve">2026</w:t>
+      </w:r>
+      <w:r>
+        <w:rPr>
+          <w:rFonts w:ascii="David" w:cs="David" w:eastAsia="David" w:hAnsi="David"/>
+          <w:sz w:val="24"/>
+          <w:szCs w:val="24"/>
+          <w:rtl/>
+        </w:rPr>
+        <w:t xml:space="preserve">). סקר תנאי מחיה באגפים פליליים: מערך נתונים סינתטי להוראה, ספר משתנים ובנק שאלות מחקר [חומרי קורס]. סמינריון תנאי כליאה של אסירים פליליים בישראל ובעולם, המכללה האקדמית אשקלון.</w:t>
       </w:r>
     </w:p>
     <w:p>
@@ -15197,48 +15342,24 @@
           <w:szCs w:val="24"/>
           <w:rtl/>
         </w:rPr>
-        <w:t xml:space="preserve">נחשון דהן, מ' וכץ, ע' (</w:t>
-      </w:r>
-      <w:r>
-        <w:rPr>
-          <w:rFonts w:ascii="Times New Roman" w:cs="Times New Roman" w:eastAsia="Times New Roman" w:hAnsi="Times New Roman"/>
-          <w:sz w:val="24"/>
-          <w:szCs w:val="24"/>
-        </w:rPr>
-        <w:t xml:space="preserve">2024</w:t>
-      </w:r>
-      <w:r>
-        <w:rPr>
-          <w:rFonts w:ascii="David" w:cs="David" w:eastAsia="David" w:hAnsi="David"/>
-          <w:sz w:val="24"/>
-          <w:szCs w:val="24"/>
-          <w:rtl/>
-        </w:rPr>
-        <w:t xml:space="preserve">). מוטיבציה ללמידה בקרב אסירים: האם תמיכה בצרכים פסיכולוגיים של אסירים במרכז החינוך מביאה למוטיבציה אוטונומית ללמידה ולהתמדה בה? צוהר לבית הסוהר: מחקרים בכליאה, ביטחון ואכיפה, </w:t>
-      </w:r>
-      <w:r>
-        <w:rPr>
-          <w:rFonts w:ascii="Times New Roman" w:cs="Times New Roman" w:eastAsia="Times New Roman" w:hAnsi="Times New Roman"/>
-          <w:sz w:val="24"/>
-          <w:szCs w:val="24"/>
-        </w:rPr>
-        <w:t xml:space="preserve">22,</w:t>
-      </w:r>
-      <w:r>
-        <w:rPr>
-          <w:rFonts w:ascii="Times New Roman" w:cs="Times New Roman" w:eastAsia="Times New Roman" w:hAnsi="Times New Roman"/>
-          <w:sz w:val="24"/>
-          <w:szCs w:val="24"/>
-        </w:rPr>
-        <w:t xml:space="preserve"> </w:t>
-      </w:r>
-      <w:r>
-        <w:rPr>
-          <w:rFonts w:ascii="Times New Roman" w:cs="Times New Roman" w:eastAsia="Times New Roman" w:hAnsi="Times New Roman"/>
-          <w:sz w:val="24"/>
-          <w:szCs w:val="24"/>
-        </w:rPr>
-        <w:t xml:space="preserve">106-129.</w:t>
+        <w:t xml:space="preserve">יכימוביץ-כהן, נ' (</w:t>
+      </w:r>
+      <w:r>
+        <w:rPr>
+          <w:rFonts w:ascii="Times New Roman" w:cs="Times New Roman" w:eastAsia="Times New Roman" w:hAnsi="Times New Roman"/>
+          <w:sz w:val="24"/>
+          <w:szCs w:val="24"/>
+        </w:rPr>
+        <w:t xml:space="preserve">2020</w:t>
+      </w:r>
+      <w:r>
+        <w:rPr>
+          <w:rFonts w:ascii="David" w:cs="David" w:eastAsia="David" w:hAnsi="David"/>
+          <w:sz w:val="24"/>
+          <w:szCs w:val="24"/>
+          <w:rtl/>
+        </w:rPr>
+        <w:t xml:space="preserve">). סוגיות בכליאה בישראל. הכנסת, מרכז המחקר והמידע.</w:t>
       </w:r>
     </w:p>
     <w:p>
@@ -15255,7 +15376,7 @@
           <w:szCs w:val="24"/>
           <w:rtl/>
         </w:rPr>
-        <w:t xml:space="preserve">פלד-לסקוב, ר' ותימור, א' (</w:t>
+        <w:t xml:space="preserve">יפתח-שרצקי, א' והראל, ש' (</w:t>
       </w:r>
       <w:r>
         <w:rPr>
@@ -15272,7 +15393,7 @@
           <w:szCs w:val="24"/>
           <w:rtl/>
         </w:rPr>
-        <w:t xml:space="preserve">). אל החיים "מאחורי הסורגים": תהליכי שיקום בעיני אסירים משוחררים. צוהר לבית הסוהר: מחקרים בכליאה, ביטחון ואכיפה, </w:t>
+        <w:t xml:space="preserve">). צללים מאחורי הסורגים: תסמינים פוסט טראומטיים, ויסות רגשי שלילי והשלכתם על תפקודם של אסירים בכלא. צוהר לבית הסוהר: מחקרים בכליאה, ביטחון ואכיפה, </w:t>
       </w:r>
       <w:r>
         <w:rPr>
@@ -15296,7 +15417,7 @@
           <w:sz w:val="24"/>
           <w:szCs w:val="24"/>
         </w:rPr>
-        <w:t xml:space="preserve">43-61.</w:t>
+        <w:t xml:space="preserve">130-157.</w:t>
       </w:r>
     </w:p>
     <w:p>
@@ -15313,6 +15434,180 @@
           <w:szCs w:val="24"/>
           <w:rtl/>
         </w:rPr>
+        <w:t xml:space="preserve">מורלי, י', שער-אפודי, ר' ואבו-ריא, ה' (</w:t>
+      </w:r>
+      <w:r>
+        <w:rPr>
+          <w:rFonts w:ascii="Times New Roman" w:cs="Times New Roman" w:eastAsia="Times New Roman" w:hAnsi="Times New Roman"/>
+          <w:sz w:val="24"/>
+          <w:szCs w:val="24"/>
+        </w:rPr>
+        <w:t xml:space="preserve">2019</w:t>
+      </w:r>
+      <w:r>
+        <w:rPr>
+          <w:rFonts w:ascii="David" w:cs="David" w:eastAsia="David" w:hAnsi="David"/>
+          <w:sz w:val="24"/>
+          <w:szCs w:val="24"/>
+          <w:rtl/>
+        </w:rPr>
+        <w:t xml:space="preserve">). ניצחון הרוח: התמודדות דתית ותמיכה חברתית כמנבאים רווחה נפשית בקרב אסירים משוחררים. צוהר לבית הסוהר, </w:t>
+      </w:r>
+      <w:r>
+        <w:rPr>
+          <w:rFonts w:ascii="Times New Roman" w:cs="Times New Roman" w:eastAsia="Times New Roman" w:hAnsi="Times New Roman"/>
+          <w:sz w:val="24"/>
+          <w:szCs w:val="24"/>
+        </w:rPr>
+        <w:t xml:space="preserve">20,</w:t>
+      </w:r>
+      <w:r>
+        <w:rPr>
+          <w:rFonts w:ascii="Times New Roman" w:cs="Times New Roman" w:eastAsia="Times New Roman" w:hAnsi="Times New Roman"/>
+          <w:sz w:val="24"/>
+          <w:szCs w:val="24"/>
+        </w:rPr>
+        <w:t xml:space="preserve"> </w:t>
+      </w:r>
+      <w:r>
+        <w:rPr>
+          <w:rFonts w:ascii="Times New Roman" w:cs="Times New Roman" w:eastAsia="Times New Roman" w:hAnsi="Times New Roman"/>
+          <w:sz w:val="24"/>
+          <w:szCs w:val="24"/>
+        </w:rPr>
+        <w:t xml:space="preserve">71-89.</w:t>
+      </w:r>
+    </w:p>
+    <w:p>
+      <w:pPr>
+        <w:bidi/>
+        <w:spacing w:after="120" w:line="360"/>
+        <w:ind w:start="709" w:hanging="709"/>
+        <w:jc w:val="right"/>
+      </w:pPr>
+      <w:r>
+        <w:rPr>
+          <w:rFonts w:ascii="David" w:cs="David" w:eastAsia="David" w:hAnsi="David"/>
+          <w:sz w:val="24"/>
+          <w:szCs w:val="24"/>
+          <w:rtl/>
+        </w:rPr>
+        <w:t xml:space="preserve">נחשון דהן, מ' וכץ, ע' (</w:t>
+      </w:r>
+      <w:r>
+        <w:rPr>
+          <w:rFonts w:ascii="Times New Roman" w:cs="Times New Roman" w:eastAsia="Times New Roman" w:hAnsi="Times New Roman"/>
+          <w:sz w:val="24"/>
+          <w:szCs w:val="24"/>
+        </w:rPr>
+        <w:t xml:space="preserve">2024</w:t>
+      </w:r>
+      <w:r>
+        <w:rPr>
+          <w:rFonts w:ascii="David" w:cs="David" w:eastAsia="David" w:hAnsi="David"/>
+          <w:sz w:val="24"/>
+          <w:szCs w:val="24"/>
+          <w:rtl/>
+        </w:rPr>
+        <w:t xml:space="preserve">). מוטיבציה ללמידה בקרב אסירים: האם תמיכה בצרכים פסיכולוגיים של אסירים במרכז החינוך מביאה למוטיבציה אוטונומית ללמידה ולהתמדה בה? צוהר לבית הסוהר: מחקרים בכליאה, ביטחון ואכיפה, </w:t>
+      </w:r>
+      <w:r>
+        <w:rPr>
+          <w:rFonts w:ascii="Times New Roman" w:cs="Times New Roman" w:eastAsia="Times New Roman" w:hAnsi="Times New Roman"/>
+          <w:sz w:val="24"/>
+          <w:szCs w:val="24"/>
+        </w:rPr>
+        <w:t xml:space="preserve">22,</w:t>
+      </w:r>
+      <w:r>
+        <w:rPr>
+          <w:rFonts w:ascii="Times New Roman" w:cs="Times New Roman" w:eastAsia="Times New Roman" w:hAnsi="Times New Roman"/>
+          <w:sz w:val="24"/>
+          <w:szCs w:val="24"/>
+        </w:rPr>
+        <w:t xml:space="preserve"> </w:t>
+      </w:r>
+      <w:r>
+        <w:rPr>
+          <w:rFonts w:ascii="Times New Roman" w:cs="Times New Roman" w:eastAsia="Times New Roman" w:hAnsi="Times New Roman"/>
+          <w:sz w:val="24"/>
+          <w:szCs w:val="24"/>
+        </w:rPr>
+        <w:t xml:space="preserve">106-129.</w:t>
+      </w:r>
+    </w:p>
+    <w:p>
+      <w:pPr>
+        <w:bidi/>
+        <w:spacing w:after="120" w:line="360"/>
+        <w:ind w:start="709" w:hanging="709"/>
+        <w:jc w:val="right"/>
+      </w:pPr>
+      <w:r>
+        <w:rPr>
+          <w:rFonts w:ascii="David" w:cs="David" w:eastAsia="David" w:hAnsi="David"/>
+          <w:sz w:val="24"/>
+          <w:szCs w:val="24"/>
+          <w:rtl/>
+        </w:rPr>
+        <w:t xml:space="preserve">פלד-לסקוב, ר' ותימור, א' (</w:t>
+      </w:r>
+      <w:r>
+        <w:rPr>
+          <w:rFonts w:ascii="Times New Roman" w:cs="Times New Roman" w:eastAsia="Times New Roman" w:hAnsi="Times New Roman"/>
+          <w:sz w:val="24"/>
+          <w:szCs w:val="24"/>
+        </w:rPr>
+        <w:t xml:space="preserve">2024</w:t>
+      </w:r>
+      <w:r>
+        <w:rPr>
+          <w:rFonts w:ascii="David" w:cs="David" w:eastAsia="David" w:hAnsi="David"/>
+          <w:sz w:val="24"/>
+          <w:szCs w:val="24"/>
+          <w:rtl/>
+        </w:rPr>
+        <w:t xml:space="preserve">). אל החיים "מאחורי הסורגים": תהליכי שיקום בעיני אסירים משוחררים. צוהר לבית הסוהר: מחקרים בכליאה, ביטחון ואכיפה, </w:t>
+      </w:r>
+      <w:r>
+        <w:rPr>
+          <w:rFonts w:ascii="Times New Roman" w:cs="Times New Roman" w:eastAsia="Times New Roman" w:hAnsi="Times New Roman"/>
+          <w:sz w:val="24"/>
+          <w:szCs w:val="24"/>
+        </w:rPr>
+        <w:t xml:space="preserve">22,</w:t>
+      </w:r>
+      <w:r>
+        <w:rPr>
+          <w:rFonts w:ascii="Times New Roman" w:cs="Times New Roman" w:eastAsia="Times New Roman" w:hAnsi="Times New Roman"/>
+          <w:sz w:val="24"/>
+          <w:szCs w:val="24"/>
+        </w:rPr>
+        <w:t xml:space="preserve"> </w:t>
+      </w:r>
+      <w:r>
+        <w:rPr>
+          <w:rFonts w:ascii="Times New Roman" w:cs="Times New Roman" w:eastAsia="Times New Roman" w:hAnsi="Times New Roman"/>
+          <w:sz w:val="24"/>
+          <w:szCs w:val="24"/>
+        </w:rPr>
+        <w:t xml:space="preserve">43-61.</w:t>
+      </w:r>
+    </w:p>
+    <w:p>
+      <w:pPr>
+        <w:bidi/>
+        <w:spacing w:after="120" w:line="360"/>
+        <w:ind w:start="709" w:hanging="709"/>
+        <w:jc w:val="right"/>
+      </w:pPr>
+      <w:r>
+        <w:rPr>
+          <w:rFonts w:ascii="David" w:cs="David" w:eastAsia="David" w:hAnsi="David"/>
+          <w:sz w:val="24"/>
+          <w:szCs w:val="24"/>
+          <w:rtl/>
+        </w:rPr>
         <w:t xml:space="preserve">שני, נ', חמלניצקי, מ', תימור, א' ואידיסיס, י' (</w:t>
       </w:r>
       <w:r>
@@ -15466,6 +15761,43 @@
           <w:szCs w:val="24"/>
         </w:rPr>
         <w:t xml:space="preserve">(6), 1029-1054. https://doi.org/10.1080/07418825.2015.1023215</w:t>
+      </w:r>
+    </w:p>
+    <w:p>
+      <w:pPr>
+        <w:spacing w:after="120" w:line="360"/>
+        <w:ind w:left="709" w:hanging="709"/>
+        <w:jc w:val="left"/>
+      </w:pPr>
+      <w:r>
+        <w:rPr>
+          <w:rFonts w:ascii="Times New Roman" w:cs="Times New Roman" w:eastAsia="Times New Roman" w:hAnsi="Times New Roman"/>
+          <w:i w:val="false"/>
+          <w:iCs w:val="false"/>
+          <w:sz w:val="24"/>
+          <w:szCs w:val="24"/>
+        </w:rPr>
+        <w:t xml:space="preserve">Deambrogio, C. (2025). Procedural justice and prison legitimacy: Towards a democratic model of inmate participation. </w:t>
+      </w:r>
+      <w:r>
+        <w:rPr>
+          <w:rFonts w:ascii="Times New Roman" w:cs="Times New Roman" w:eastAsia="Times New Roman" w:hAnsi="Times New Roman"/>
+          <w:i/>
+          <w:iCs/>
+          <w:sz w:val="24"/>
+          <w:szCs w:val="24"/>
+        </w:rPr>
+        <w:t xml:space="preserve">Oxford Journal of Legal Studies, 45</w:t>
+      </w:r>
+      <w:r>
+        <w:rPr>
+          <w:rFonts w:ascii="Times New Roman" w:cs="Times New Roman" w:eastAsia="Times New Roman" w:hAnsi="Times New Roman"/>
+          <w:i w:val="false"/>
+          <w:iCs w:val="false"/>
+          <w:sz w:val="24"/>
+          <w:szCs w:val="24"/>
+        </w:rPr>
+        <w:t xml:space="preserve">(3), 801-820. https://doi.org/10.1093/ojls/gqaf013</w:t>
       </w:r>
     </w:p>
     <w:p>

</xml_diff>

<commit_message>
Update AI disclosure per lecturer's instructions
Co-Authored-By: Claude Fable 5.1 <noreply@anthropic.com>
Claude-Session: https://claude.ai/code/session_01KHo5ZcKCUwhCAvyoKeeMWs
</commit_message>
<xml_diff>
--- a/seminar/סמינריון_רווחה_נפשית_ולגיטימיות.docx
+++ b/seminar/סמינריון_רווחה_נפשית_ולגיטימיות.docx
@@ -14945,7 +14945,24 @@
           <w:szCs w:val="24"/>
           <w:rtl/>
         </w:rPr>
-        <w:t xml:space="preserve">בכתיבת עבודה זו נעשה שימוש בכלי בינה מלאכותית לצורכי עריכה לשונית, עזרה בתרגום התקציר לאנגלית, עזרה בבניית הסינטקס של הניתוחים הסטטיסטיים ב-</w:t>
+        <w:t xml:space="preserve">בהתאם להנחיית מרצה הקורס, קובץ הנתונים הסינתטי והקודבוק הועלו ל-</w:t>
+      </w:r>
+      <w:r>
+        <w:rPr>
+          <w:rFonts w:ascii="Times New Roman" w:cs="Times New Roman" w:eastAsia="Times New Roman" w:hAnsi="Times New Roman"/>
+          <w:sz w:val="24"/>
+          <w:szCs w:val="24"/>
+        </w:rPr>
+        <w:t xml:space="preserve">ChatGPT</w:t>
+      </w:r>
+      <w:r>
+        <w:rPr>
+          <w:rFonts w:ascii="David" w:cs="David" w:eastAsia="David" w:hAnsi="David"/>
+          <w:sz w:val="24"/>
+          <w:szCs w:val="24"/>
+          <w:rtl/>
+        </w:rPr>
+        <w:t xml:space="preserve">, והוזנה בו הפקודה שנמסרה בקורס: כתיבת סינטקס פשוט ל-</w:t>
       </w:r>
       <w:r>
         <w:rPr>
@@ -14962,7 +14979,41 @@
           <w:szCs w:val="24"/>
           <w:rtl/>
         </w:rPr>
-        <w:t xml:space="preserve"> ועזרה באיתור מקורות. בחירת שאלות המחקר, קריאת המקורות, הרצת הניתוחים, פירוש הממצאים והמסקנות הם של הכותבות.</w:t>
+        <w:t xml:space="preserve"> לבחינת שאלת המחקר, הכולל סטטיסטיקה תיאורית של המשתנים, פירוט הרכב משתנה הלגיטימיות, מתאמים או ניתוח שונות, רגרסיה וקידוד מחדש של משתני טקסט במידת הצורך, תוך הבחנה בין מתאם פירסון לספירמן לפי סוג המשתנים, ובלי מבחנים מיותרים ובלי פקודות טעינה או שמירה של קבצים. הסינטקס שהתקבל הורץ ב-</w:t>
+      </w:r>
+      <w:r>
+        <w:rPr>
+          <w:rFonts w:ascii="Times New Roman" w:cs="Times New Roman" w:eastAsia="Times New Roman" w:hAnsi="Times New Roman"/>
+          <w:sz w:val="24"/>
+          <w:szCs w:val="24"/>
+        </w:rPr>
+        <w:t xml:space="preserve">SPSS</w:t>
+      </w:r>
+      <w:r>
+        <w:rPr>
+          <w:rFonts w:ascii="David" w:cs="David" w:eastAsia="David" w:hAnsi="David"/>
+          <w:sz w:val="24"/>
+          <w:szCs w:val="24"/>
+          <w:rtl/>
+        </w:rPr>
+        <w:t xml:space="preserve"> על ידי הכותבות, והפלטים שבנספח א' הם תוצריו.</w:t>
+      </w:r>
+    </w:p>
+    <w:p>
+      <w:pPr>
+        <w:bidi/>
+        <w:spacing w:after="120" w:line="360"/>
+        <w:ind w:firstLine="567"/>
+        <w:jc w:val="both"/>
+      </w:pPr>
+      <w:r>
+        <w:rPr>
+          <w:rFonts w:ascii="David" w:cs="David" w:eastAsia="David" w:hAnsi="David"/>
+          <w:sz w:val="24"/>
+          <w:szCs w:val="24"/>
+          <w:rtl/>
+        </w:rPr>
+        <w:t xml:space="preserve">נוסף על כך נעשה שימוש בכלי בינה מלאכותית לצורכי עריכה לשונית, תרגום התקציר לאנגלית, סיוע באיתור מקורות ובעיצוב המסמך. בחירת שאלת המחקר, קריאת המקורות, פירוש הממצאים והמסקנות הם של הכותבות.</w:t>
       </w:r>
     </w:p>
     <w:p>

</xml_diff>

<commit_message>
Polish wording for two-author paper
Co-Authored-By: Claude Fable 5.1 <noreply@anthropic.com>
Claude-Session: https://claude.ai/code/session_01KHo5ZcKCUwhCAvyoKeeMWs
</commit_message>
<xml_diff>
--- a/seminar/סמינריון_רווחה_נפשית_ולגיטימיות.docx
+++ b/seminar/סמינריון_רווחה_נפשית_ולגיטימיות.docx
@@ -11713,7 +11713,7 @@
           <w:szCs w:val="24"/>
           <w:rtl/>
         </w:rPr>
-        <w:t xml:space="preserve">). התפלגות הלגיטימיות מוטה שמאלה באופן ניכר, ושני מבחני הנורמליות מובהקים. בשל גודל המדגם מבחנים אלו רגישים גם לסטיות קטנות, ומקדמי הצורה נמצאים בטווח שבו מתאם פירסון עדיין תקף, אך כדי להיות בטוחות חושב לצדו גם מתאם ספירמן.</w:t>
+        <w:t xml:space="preserve">). התפלגות הלגיטימיות מוטה שמאלה באופן ניכר, ושני מבחני הנורמליות מובהקים. בשל גודל המדגם מבחנים אלו רגישים גם לסטיות קטנות, ומקדמי הצורה נמצאים בטווח שבו מתאם פירסון עדיין תקף, אך כדי לחזק את הביטחון בממצא חושב לצדו גם מתאם ספירמן.</w:t>
       </w:r>
     </w:p>
     <w:p>
@@ -11750,24 +11750,7 @@
           <w:szCs w:val="24"/>
           <w:rtl/>
         </w:rPr>
-        <w:t xml:space="preserve">כדי לבחון את השערה </w:t>
-      </w:r>
-      <w:r>
-        <w:rPr>
-          <w:rFonts w:ascii="Times New Roman" w:cs="Times New Roman" w:eastAsia="Times New Roman" w:hAnsi="Times New Roman"/>
-          <w:sz w:val="24"/>
-          <w:szCs w:val="24"/>
-        </w:rPr>
-        <w:t xml:space="preserve">1</w:t>
-      </w:r>
-      <w:r>
-        <w:rPr>
-          <w:rFonts w:ascii="David" w:cs="David" w:eastAsia="David" w:hAnsi="David"/>
-          <w:sz w:val="24"/>
-          <w:szCs w:val="24"/>
-          <w:rtl/>
-        </w:rPr>
-        <w:t xml:space="preserve"> חושבו מתאמי פירסון וספירמן בין ציון הרווחה הנפשית לציון הלגיטימיות, וכן מתאמי ספירמן בין הרווחה לכל אחד מפריטי הלגיטימיות. לוח </w:t>
+        <w:t xml:space="preserve">כדי לבחון את השערת המחקר חושבו מתאמי פירסון וספירמן בין ציון הרווחה הנפשית לציון הלגיטימיות, וכן מתאמי ספירמן בין הרווחה לכל אחד מפריטי הלגיטימיות. לוח </w:t>
       </w:r>
       <w:r>
         <w:rPr>

</xml_diff>

<commit_message>
Remove first-line indent from body paragraphs
Co-Authored-By: Claude Fable 5.1 <noreply@anthropic.com>
Claude-Session: https://claude.ai/code/session_01KHo5ZcKCUwhCAvyoKeeMWs
</commit_message>
<xml_diff>
--- a/seminar/סמינריון_רווחה_נפשית_ולגיטימיות.docx
+++ b/seminar/סמינריון_רווחה_נפשית_ולגיטימיות.docx
@@ -276,7 +276,6 @@
       <w:pPr>
         <w:bidi/>
         <w:spacing w:after="120" w:line="360"/>
-        <w:ind w:firstLine="567"/>
         <w:jc w:val="both"/>
       </w:pPr>
       <w:r>
@@ -479,7 +478,6 @@
       <w:pPr>
         <w:bidi/>
         <w:spacing w:after="120" w:line="360"/>
-        <w:ind w:firstLine="567"/>
         <w:jc w:val="both"/>
       </w:pPr>
       <w:r>
@@ -547,7 +545,6 @@
       <w:pPr>
         <w:bidi/>
         <w:spacing w:after="120" w:line="360"/>
-        <w:ind w:firstLine="567"/>
         <w:jc w:val="both"/>
       </w:pPr>
       <w:r>
@@ -818,7 +815,6 @@
       <w:pPr>
         <w:bidi/>
         <w:spacing w:after="120" w:line="360"/>
-        <w:ind w:firstLine="567"/>
         <w:jc w:val="both"/>
       </w:pPr>
       <w:r>
@@ -889,7 +885,6 @@
       <w:pPr>
         <w:bidi/>
         <w:spacing w:after="120" w:line="360"/>
-        <w:ind w:firstLine="567"/>
         <w:jc w:val="both"/>
       </w:pPr>
       <w:r>
@@ -946,7 +941,6 @@
       <w:pPr>
         <w:bidi/>
         <w:spacing w:after="120" w:line="360"/>
-        <w:ind w:firstLine="567"/>
         <w:jc w:val="both"/>
       </w:pPr>
       <w:r>
@@ -1014,7 +1008,6 @@
       <w:pPr>
         <w:bidi/>
         <w:spacing w:after="120" w:line="360"/>
-        <w:ind w:firstLine="567"/>
         <w:jc w:val="both"/>
       </w:pPr>
       <w:r>
@@ -1269,7 +1262,6 @@
       <w:pPr>
         <w:bidi/>
         <w:spacing w:after="120" w:line="360"/>
-        <w:ind w:firstLine="567"/>
         <w:jc w:val="both"/>
       </w:pPr>
       <w:r>
@@ -1476,7 +1468,6 @@
       <w:pPr>
         <w:bidi/>
         <w:spacing w:after="120" w:line="360"/>
-        <w:ind w:firstLine="567"/>
         <w:jc w:val="both"/>
       </w:pPr>
       <w:r>
@@ -1544,7 +1535,6 @@
       <w:pPr>
         <w:bidi/>
         <w:spacing w:after="120" w:line="360"/>
-        <w:ind w:firstLine="567"/>
         <w:jc w:val="both"/>
       </w:pPr>
       <w:r>
@@ -1680,7 +1670,6 @@
       <w:pPr>
         <w:bidi/>
         <w:spacing w:after="120" w:line="360"/>
-        <w:ind w:firstLine="567"/>
         <w:jc w:val="both"/>
       </w:pPr>
       <w:r>
@@ -1748,7 +1737,6 @@
       <w:pPr>
         <w:bidi/>
         <w:spacing w:after="120" w:line="360"/>
-        <w:ind w:firstLine="567"/>
         <w:jc w:val="both"/>
       </w:pPr>
       <w:r>
@@ -1955,7 +1943,6 @@
       <w:pPr>
         <w:bidi/>
         <w:spacing w:after="120" w:line="360"/>
-        <w:ind w:firstLine="567"/>
         <w:jc w:val="both"/>
       </w:pPr>
       <w:r>
@@ -2128,7 +2115,6 @@
       <w:pPr>
         <w:bidi/>
         <w:spacing w:after="120" w:line="360"/>
-        <w:ind w:firstLine="567"/>
         <w:jc w:val="both"/>
       </w:pPr>
       <w:r>
@@ -2315,7 +2301,6 @@
       <w:pPr>
         <w:bidi/>
         <w:spacing w:after="120" w:line="360"/>
-        <w:ind w:firstLine="567"/>
         <w:jc w:val="both"/>
       </w:pPr>
       <w:r>
@@ -2858,7 +2843,6 @@
       <w:pPr>
         <w:bidi/>
         <w:spacing w:after="120" w:line="360"/>
-        <w:ind w:firstLine="567"/>
         <w:jc w:val="both"/>
       </w:pPr>
       <w:r>
@@ -3096,7 +3080,6 @@
       <w:pPr>
         <w:bidi/>
         <w:spacing w:after="120" w:line="360"/>
-        <w:ind w:firstLine="567"/>
         <w:jc w:val="both"/>
       </w:pPr>
       <w:r>
@@ -3197,7 +3180,6 @@
       <w:pPr>
         <w:bidi/>
         <w:spacing w:after="120" w:line="360"/>
-        <w:ind w:firstLine="567"/>
         <w:jc w:val="both"/>
       </w:pPr>
       <w:r>
@@ -3281,7 +3263,6 @@
       <w:pPr>
         <w:bidi/>
         <w:spacing w:after="120" w:line="360"/>
-        <w:ind w:firstLine="567"/>
         <w:jc w:val="both"/>
       </w:pPr>
       <w:r>
@@ -3335,7 +3316,6 @@
       <w:pPr>
         <w:bidi/>
         <w:spacing w:after="120" w:line="360"/>
-        <w:ind w:firstLine="567"/>
         <w:jc w:val="both"/>
       </w:pPr>
       <w:r>
@@ -3406,7 +3386,6 @@
       <w:pPr>
         <w:bidi/>
         <w:spacing w:after="120" w:line="360"/>
-        <w:ind w:firstLine="567"/>
         <w:jc w:val="both"/>
       </w:pPr>
       <w:r>
@@ -3443,7 +3422,6 @@
       <w:pPr>
         <w:bidi/>
         <w:spacing w:after="120" w:line="360"/>
-        <w:ind w:firstLine="567"/>
         <w:jc w:val="both"/>
       </w:pPr>
       <w:r>
@@ -3979,7 +3957,6 @@
       <w:pPr>
         <w:bidi/>
         <w:spacing w:after="120" w:line="360"/>
-        <w:ind w:firstLine="567"/>
         <w:jc w:val="both"/>
       </w:pPr>
       <w:r>
@@ -6686,7 +6663,6 @@
       <w:pPr>
         <w:bidi/>
         <w:spacing w:after="120" w:line="360"/>
-        <w:ind w:firstLine="567"/>
         <w:jc w:val="both"/>
       </w:pPr>
       <w:r>
@@ -6791,7 +6767,6 @@
       <w:pPr>
         <w:bidi/>
         <w:spacing w:after="120" w:line="360"/>
-        <w:ind w:firstLine="567"/>
         <w:jc w:val="both"/>
       </w:pPr>
       <w:r>
@@ -8544,7 +8519,6 @@
       <w:pPr>
         <w:bidi/>
         <w:spacing w:after="120" w:line="360"/>
-        <w:ind w:firstLine="567"/>
         <w:jc w:val="both"/>
       </w:pPr>
       <w:r>
@@ -8734,7 +8708,6 @@
       <w:pPr>
         <w:bidi/>
         <w:spacing w:after="120" w:line="360"/>
-        <w:ind w:firstLine="567"/>
         <w:jc w:val="both"/>
       </w:pPr>
       <w:r>
@@ -10446,7 +10419,6 @@
       <w:pPr>
         <w:bidi/>
         <w:spacing w:after="120" w:line="360"/>
-        <w:ind w:firstLine="567"/>
         <w:jc w:val="both"/>
       </w:pPr>
       <w:r>
@@ -10652,7 +10624,6 @@
       <w:pPr>
         <w:bidi/>
         <w:spacing w:after="120" w:line="360"/>
-        <w:ind w:firstLine="567"/>
         <w:jc w:val="both"/>
       </w:pPr>
       <w:r>
@@ -11601,7 +11572,6 @@
       <w:pPr>
         <w:bidi/>
         <w:spacing w:after="120" w:line="360"/>
-        <w:ind w:firstLine="567"/>
         <w:jc w:val="both"/>
       </w:pPr>
       <w:r>
@@ -11740,7 +11710,6 @@
       <w:pPr>
         <w:bidi/>
         <w:spacing w:after="120" w:line="360"/>
-        <w:ind w:firstLine="567"/>
         <w:jc w:val="both"/>
       </w:pPr>
       <w:r>
@@ -12601,7 +12570,6 @@
       <w:pPr>
         <w:bidi/>
         <w:spacing w:after="120" w:line="360"/>
-        <w:ind w:firstLine="567"/>
         <w:jc w:val="both"/>
       </w:pPr>
       <w:r>
@@ -13569,7 +13537,6 @@
       <w:pPr>
         <w:bidi/>
         <w:spacing w:after="120" w:line="360"/>
-        <w:ind w:firstLine="567"/>
         <w:jc w:val="both"/>
       </w:pPr>
       <w:r>
@@ -13722,7 +13689,6 @@
       <w:pPr>
         <w:bidi/>
         <w:spacing w:after="120" w:line="360"/>
-        <w:ind w:firstLine="567"/>
         <w:jc w:val="both"/>
       </w:pPr>
       <w:r>
@@ -13830,7 +13796,6 @@
       <w:pPr>
         <w:bidi/>
         <w:spacing w:after="120" w:line="360"/>
-        <w:ind w:firstLine="567"/>
         <w:jc w:val="both"/>
       </w:pPr>
       <w:r>
@@ -13931,7 +13896,6 @@
       <w:pPr>
         <w:bidi/>
         <w:spacing w:after="120" w:line="360"/>
-        <w:ind w:firstLine="567"/>
         <w:jc w:val="both"/>
       </w:pPr>
       <w:r>
@@ -14002,7 +13966,6 @@
       <w:pPr>
         <w:bidi/>
         <w:spacing w:after="120" w:line="360"/>
-        <w:ind w:firstLine="567"/>
         <w:jc w:val="both"/>
       </w:pPr>
       <w:r>
@@ -14070,7 +14033,6 @@
       <w:pPr>
         <w:bidi/>
         <w:spacing w:after="120" w:line="360"/>
-        <w:ind w:firstLine="567"/>
         <w:jc w:val="both"/>
       </w:pPr>
       <w:r>
@@ -14206,7 +14168,6 @@
       <w:pPr>
         <w:bidi/>
         <w:spacing w:after="120" w:line="360"/>
-        <w:ind w:firstLine="567"/>
         <w:jc w:val="both"/>
       </w:pPr>
       <w:r>
@@ -14311,7 +14272,6 @@
       <w:pPr>
         <w:bidi/>
         <w:spacing w:after="120" w:line="360"/>
-        <w:ind w:firstLine="567"/>
         <w:jc w:val="both"/>
       </w:pPr>
       <w:r>
@@ -14535,7 +14495,6 @@
       <w:pPr>
         <w:bidi/>
         <w:spacing w:after="120" w:line="360"/>
-        <w:ind w:firstLine="567"/>
         <w:jc w:val="both"/>
       </w:pPr>
       <w:r>
@@ -14674,7 +14633,6 @@
       <w:pPr>
         <w:bidi/>
         <w:spacing w:after="120" w:line="360"/>
-        <w:ind w:firstLine="567"/>
         <w:jc w:val="both"/>
       </w:pPr>
       <w:r>
@@ -14725,7 +14683,6 @@
       <w:pPr>
         <w:bidi/>
         <w:spacing w:after="120" w:line="360"/>
-        <w:ind w:firstLine="567"/>
         <w:jc w:val="both"/>
       </w:pPr>
       <w:r>
@@ -14793,7 +14750,6 @@
       <w:pPr>
         <w:bidi/>
         <w:spacing w:after="120" w:line="360"/>
-        <w:ind w:firstLine="567"/>
         <w:jc w:val="both"/>
       </w:pPr>
       <w:r>
@@ -14847,7 +14803,6 @@
       <w:pPr>
         <w:bidi/>
         <w:spacing w:after="120" w:line="360"/>
-        <w:ind w:firstLine="567"/>
         <w:jc w:val="both"/>
       </w:pPr>
       <w:r>
@@ -14918,7 +14873,6 @@
       <w:pPr>
         <w:bidi/>
         <w:spacing w:after="120" w:line="360"/>
-        <w:ind w:firstLine="567"/>
         <w:jc w:val="both"/>
       </w:pPr>
       <w:r>
@@ -14986,7 +14940,6 @@
       <w:pPr>
         <w:bidi/>
         <w:spacing w:after="120" w:line="360"/>
-        <w:ind w:firstLine="567"/>
         <w:jc w:val="both"/>
       </w:pPr>
       <w:r>
@@ -15003,7 +14956,6 @@
       <w:pPr>
         <w:bidi/>
         <w:spacing w:after="120" w:line="360"/>
-        <w:ind w:firstLine="567"/>
         <w:jc w:val="both"/>
       </w:pPr>
       <w:r>

</xml_diff>

<commit_message>
Align citations and reference list with the college APA 7 guide
Co-Authored-By: Claude Fable 5.1 <noreply@anthropic.com>
Claude-Session: https://claude.ai/code/session_01KHo5ZcKCUwhCAvyoKeeMWs
</commit_message>
<xml_diff>
--- a/seminar/סמינריון_רווחה_נפשית_ולגיטימיות.docx
+++ b/seminar/סמינריון_רווחה_נפשית_ולגיטימיות.docx
@@ -487,24 +487,24 @@
           <w:szCs w:val="24"/>
           <w:rtl/>
         </w:rPr>
-        <w:t xml:space="preserve">בית הסוהר הוא מוסד שבו סמכות הסגל כמעט מוחלטת, ובכל זאת הסדר היומיומי באגף תלוי בשיתוף פעולה של האסירים. ספרקס ובוטומס </w:t>
-      </w:r>
-      <w:r>
-        <w:rPr>
-          <w:rFonts w:ascii="Times New Roman" w:cs="Times New Roman" w:eastAsia="Times New Roman" w:hAnsi="Times New Roman"/>
-          <w:sz w:val="24"/>
-          <w:szCs w:val="24"/>
-        </w:rPr>
-        <w:t xml:space="preserve">(Sparks &amp; Bottoms, 1995)</w:t>
-      </w:r>
-      <w:r>
-        <w:rPr>
-          <w:rFonts w:ascii="David" w:cs="David" w:eastAsia="David" w:hAnsi="David"/>
-          <w:sz w:val="24"/>
-          <w:szCs w:val="24"/>
-          <w:rtl/>
-        </w:rPr>
-        <w:t xml:space="preserve">, על בסיס עבודת שדה בשני בתי סוהר בביטחון מרבי באנגליה, טענו שסדר בבתי סוהר אינו מתקיים בכוח בלבד אלא נשען על תחושת האסירים שהמשטר שבו הם חיים הוגן, ושמי שמפעיל אותו ראוי לציות. תחושה זו היא מה שהספרות מכנה לגיטימיות: המידה שבה הכפופים לסמכות רואים בה סמכות שראוי לציית לה, ולא רק סמכות שאפשר להיענש על ידה (</w:t>
+        <w:t xml:space="preserve">בית הסוהר הוא מוסד שבו סמכות הסגל כמעט מוחלטת, ובכל זאת הסדר היומיומי באגף תלוי בשיתוף פעולה של האסירים. ספרקס ובוטומס (</w:t>
+      </w:r>
+      <w:r>
+        <w:rPr>
+          <w:rFonts w:ascii="Times New Roman" w:cs="Times New Roman" w:eastAsia="Times New Roman" w:hAnsi="Times New Roman"/>
+          <w:sz w:val="24"/>
+          <w:szCs w:val="24"/>
+        </w:rPr>
+        <w:t xml:space="preserve">1995</w:t>
+      </w:r>
+      <w:r>
+        <w:rPr>
+          <w:rFonts w:ascii="David" w:cs="David" w:eastAsia="David" w:hAnsi="David"/>
+          <w:sz w:val="24"/>
+          <w:szCs w:val="24"/>
+          <w:rtl/>
+        </w:rPr>
+        <w:t xml:space="preserve">), על בסיס עבודת שדה בשני בתי סוהר בביטחון מרבי באנגליה, טענו שסדר בבתי סוהר אינו מתקיים בכוח בלבד אלא נשען על תחושת האסירים שהמשטר שבו הם חיים הוגן, ושמי שמפעיל אותו ראוי לציות. תחושה זו היא מה שהספרות מכנה לגיטימיות: המידה שבה הכפופים לסמכות רואים בה סמכות שראוי לציית לה, ולא רק סמכות שאפשר להיענש על ידה (</w:t>
       </w:r>
       <w:r>
         <w:rPr>
@@ -521,7 +521,7 @@
           <w:szCs w:val="24"/>
           <w:rtl/>
         </w:rPr>
-        <w:t xml:space="preserve">, כפי שמצוטט אצל </w:t>
+        <w:t xml:space="preserve">, מצוטט אצל </w:t>
       </w:r>
       <w:r>
         <w:rPr>
@@ -672,7 +672,7 @@
           <w:szCs w:val="24"/>
           <w:rtl/>
         </w:rPr>
-        <w:t xml:space="preserve"> כפי שמצוטט אצל יכימוביץ-כהן, </w:t>
+        <w:t xml:space="preserve"> מצוטט אצל יכימוביץ-כהן, </w:t>
       </w:r>
       <w:r>
         <w:rPr>
@@ -967,7 +967,7 @@
           <w:szCs w:val="24"/>
           <w:rtl/>
         </w:rPr>
-        <w:t xml:space="preserve">, כפי שמצוטט אצל דוידסקו וולק, </w:t>
+        <w:t xml:space="preserve">, מצוטט אצל דוידסקו וולק, </w:t>
       </w:r>
       <w:r>
         <w:rPr>
@@ -1034,7 +1034,7 @@
           <w:szCs w:val="24"/>
           <w:rtl/>
         </w:rPr>
-        <w:t xml:space="preserve">, כפי שמצוטט אצל </w:t>
+        <w:t xml:space="preserve">, מצוטט אצל </w:t>
       </w:r>
       <w:r>
         <w:rPr>
@@ -1051,24 +1051,24 @@
           <w:szCs w:val="24"/>
           <w:rtl/>
         </w:rPr>
-        <w:t xml:space="preserve">). בהמשך לכך זיהו אוטי וליבלינג </w:t>
-      </w:r>
-      <w:r>
-        <w:rPr>
-          <w:rFonts w:ascii="Times New Roman" w:cs="Times New Roman" w:eastAsia="Times New Roman" w:hAnsi="Times New Roman"/>
-          <w:sz w:val="24"/>
-          <w:szCs w:val="24"/>
-        </w:rPr>
-        <w:t xml:space="preserve">(Auty &amp; Liebling, 2024)</w:t>
-      </w:r>
-      <w:r>
-        <w:rPr>
-          <w:rFonts w:ascii="David" w:cs="David" w:eastAsia="David" w:hAnsi="David"/>
-          <w:sz w:val="24"/>
-          <w:szCs w:val="24"/>
-          <w:rtl/>
-        </w:rPr>
-        <w:t xml:space="preserve">, על בסיס </w:t>
+        <w:t xml:space="preserve">). בהמשך לכך זיהו אוטי וליבלינג (</w:t>
+      </w:r>
+      <w:r>
+        <w:rPr>
+          <w:rFonts w:ascii="Times New Roman" w:cs="Times New Roman" w:eastAsia="Times New Roman" w:hAnsi="Times New Roman"/>
+          <w:sz w:val="24"/>
+          <w:szCs w:val="24"/>
+        </w:rPr>
+        <w:t xml:space="preserve">2024</w:t>
+      </w:r>
+      <w:r>
+        <w:rPr>
+          <w:rFonts w:ascii="David" w:cs="David" w:eastAsia="David" w:hAnsi="David"/>
+          <w:sz w:val="24"/>
+          <w:szCs w:val="24"/>
+          <w:rtl/>
+        </w:rPr>
+        <w:t xml:space="preserve">), על בסיס </w:t>
       </w:r>
       <w:r>
         <w:rPr>
@@ -1187,24 +1187,24 @@
           <w:szCs w:val="24"/>
           <w:rtl/>
         </w:rPr>
-        <w:t xml:space="preserve"> ובבתי סוהר שמתחת לסף התחתון נמצאו שיעורים גבוהים באופן מובהק של תקיפות, פגיעה עצמית ומקרי מוות. בהולנד בחנו ון גינקן ואחרים </w:t>
-      </w:r>
-      <w:r>
-        <w:rPr>
-          <w:rFonts w:ascii="Times New Roman" w:cs="Times New Roman" w:eastAsia="Times New Roman" w:hAnsi="Times New Roman"/>
-          <w:sz w:val="24"/>
-          <w:szCs w:val="24"/>
-        </w:rPr>
-        <w:t xml:space="preserve">(Van Ginneken et al., 2019)</w:t>
-      </w:r>
-      <w:r>
-        <w:rPr>
-          <w:rFonts w:ascii="David" w:cs="David" w:eastAsia="David" w:hAnsi="David"/>
-          <w:sz w:val="24"/>
-          <w:szCs w:val="24"/>
-          <w:rtl/>
-        </w:rPr>
-        <w:t xml:space="preserve"> את הקשר בין אקלים בית הסוהר לרווחה בקרב </w:t>
+        <w:t xml:space="preserve"> ובבתי סוהר שמתחת לסף התחתון נמצאו שיעורים גבוהים באופן מובהק של תקיפות, פגיעה עצמית ומקרי מוות. בהולנד בחנו ון גינקן ואחרים (</w:t>
+      </w:r>
+      <w:r>
+        <w:rPr>
+          <w:rFonts w:ascii="Times New Roman" w:cs="Times New Roman" w:eastAsia="Times New Roman" w:hAnsi="Times New Roman"/>
+          <w:sz w:val="24"/>
+          <w:szCs w:val="24"/>
+        </w:rPr>
+        <w:t xml:space="preserve">2019</w:t>
+      </w:r>
+      <w:r>
+        <w:rPr>
+          <w:rFonts w:ascii="David" w:cs="David" w:eastAsia="David" w:hAnsi="David"/>
+          <w:sz w:val="24"/>
+          <w:szCs w:val="24"/>
+          <w:rtl/>
+        </w:rPr>
+        <w:t xml:space="preserve">) את הקשר בין אקלים בית הסוהר לרווחה בקרב </w:t>
       </w:r>
       <w:r>
         <w:rPr>
@@ -1271,24 +1271,24 @@
           <w:szCs w:val="24"/>
           <w:rtl/>
         </w:rPr>
-        <w:t xml:space="preserve">הקשר בין יחס הסגל לרווחה נחקר גם במערכי אורך. באוסטרליה עקבו סרג'נט ואחרים </w:t>
-      </w:r>
-      <w:r>
-        <w:rPr>
-          <w:rFonts w:ascii="Times New Roman" w:cs="Times New Roman" w:eastAsia="Times New Roman" w:hAnsi="Times New Roman"/>
-          <w:sz w:val="24"/>
-          <w:szCs w:val="24"/>
-        </w:rPr>
-        <w:t xml:space="preserve">(Sargeant et al., 2026)</w:t>
-      </w:r>
-      <w:r>
-        <w:rPr>
-          <w:rFonts w:ascii="David" w:cs="David" w:eastAsia="David" w:hAnsi="David"/>
-          <w:sz w:val="24"/>
-          <w:szCs w:val="24"/>
-          <w:rtl/>
-        </w:rPr>
-        <w:t xml:space="preserve"> אחר אסירים בניו סאות' ויילס בשלוש נקודות זמן ומצאו שצדק פרוצדורלי קשור לרווחה נפשית גבוהה יותר. בנתוני החתך תיווכו את הקשר גם היחסים עם הסגל וגם תחושת הביטחון, אך בניתוח האורך רק היחסים עם הסגל תיווכו אותו, והחוקרים הסיקו שהכשרת סוהרים בצדק פרוצדורלי היא הדרך המעשית לשפר את רווחת האסירים. הם נשענו על מחקר הולנדי קודם, שבו תפיסת יחס הוגן מצד הסוהרים שלושה שבועות אחרי הקליטה ניבאה פחות בעיות נפשיות שלושה חודשים אחריה (</w:t>
+        <w:t xml:space="preserve">הקשר בין יחס הסגל לרווחה נחקר גם במערכי אורך. באוסטרליה עקבו סרג'נט ואחרים (</w:t>
+      </w:r>
+      <w:r>
+        <w:rPr>
+          <w:rFonts w:ascii="Times New Roman" w:cs="Times New Roman" w:eastAsia="Times New Roman" w:hAnsi="Times New Roman"/>
+          <w:sz w:val="24"/>
+          <w:szCs w:val="24"/>
+        </w:rPr>
+        <w:t xml:space="preserve">2026</w:t>
+      </w:r>
+      <w:r>
+        <w:rPr>
+          <w:rFonts w:ascii="David" w:cs="David" w:eastAsia="David" w:hAnsi="David"/>
+          <w:sz w:val="24"/>
+          <w:szCs w:val="24"/>
+          <w:rtl/>
+        </w:rPr>
+        <w:t xml:space="preserve">) אחר אסירים בניו סאות' ויילס בשלוש נקודות זמן ומצאו שצדק פרוצדורלי קשור לרווחה נפשית גבוהה יותר. בנתוני החתך תיווכו את הקשר גם היחסים עם הסגל וגם תחושת הביטחון, אך בניתוח האורך רק היחסים עם הסגל תיווכו אותו, והחוקרים הסיקו שהכשרת סוהרים בצדק פרוצדורלי היא הדרך המעשית לשפר את רווחת האסירים. הם נשענו על מחקר הולנדי קודם, שבו תפיסת יחס הוגן מצד הסוהרים שלושה שבועות אחרי הקליטה ניבאה פחות בעיות נפשיות שלושה חודשים אחריה (</w:t>
       </w:r>
       <w:r>
         <w:rPr>
@@ -1305,7 +1305,7 @@
           <w:szCs w:val="24"/>
           <w:rtl/>
         </w:rPr>
-        <w:t xml:space="preserve">, כפי שמצוטט אצל </w:t>
+        <w:t xml:space="preserve">, מצוטט אצל </w:t>
       </w:r>
       <w:r>
         <w:rPr>
@@ -1477,24 +1477,24 @@
           <w:szCs w:val="24"/>
           <w:rtl/>
         </w:rPr>
-        <w:t xml:space="preserve">הבסיס התאורטי של מחקרי הלגיטימיות בכליאה הונח על ידי ספרקס ובוטומס </w:t>
-      </w:r>
-      <w:r>
-        <w:rPr>
-          <w:rFonts w:ascii="Times New Roman" w:cs="Times New Roman" w:eastAsia="Times New Roman" w:hAnsi="Times New Roman"/>
-          <w:sz w:val="24"/>
-          <w:szCs w:val="24"/>
-        </w:rPr>
-        <w:t xml:space="preserve">(Sparks &amp; Bottoms, 1995)</w:t>
-      </w:r>
-      <w:r>
-        <w:rPr>
-          <w:rFonts w:ascii="David" w:cs="David" w:eastAsia="David" w:hAnsi="David"/>
-          <w:sz w:val="24"/>
-          <w:szCs w:val="24"/>
-          <w:rtl/>
-        </w:rPr>
-        <w:t xml:space="preserve">, שהעבירו אל בית הסוהר את תאוריות הלגיטימיות של ביתהם ושל טיילר. לפי טיילר, אנשים מצייתים לרשות בעיקר משום שהם תופסים אותה כלגיטימית, והלגיטימיות נבנית דרך צדק פרוצדורלי, כלומר דרך האופן שבו ההחלטות מתקבלות ולא רק דרך תוצאותיהן (</w:t>
+        <w:t xml:space="preserve">הבסיס התאורטי של מחקרי הלגיטימיות בכליאה הונח על ידי ספרקס ובוטומס (</w:t>
+      </w:r>
+      <w:r>
+        <w:rPr>
+          <w:rFonts w:ascii="Times New Roman" w:cs="Times New Roman" w:eastAsia="Times New Roman" w:hAnsi="Times New Roman"/>
+          <w:sz w:val="24"/>
+          <w:szCs w:val="24"/>
+        </w:rPr>
+        <w:t xml:space="preserve">1995</w:t>
+      </w:r>
+      <w:r>
+        <w:rPr>
+          <w:rFonts w:ascii="David" w:cs="David" w:eastAsia="David" w:hAnsi="David"/>
+          <w:sz w:val="24"/>
+          <w:szCs w:val="24"/>
+          <w:rtl/>
+        </w:rPr>
+        <w:t xml:space="preserve">), שהעבירו אל בית הסוהר את תאוריות הלגיטימיות של ביתהם ושל טיילר. לפי טיילר, אנשים מצייתים לרשות בעיקר משום שהם תופסים אותה כלגיטימית, והלגיטימיות נבנית דרך צדק פרוצדורלי, כלומר דרך האופן שבו ההחלטות מתקבלות ולא רק דרך תוצאותיהן (</w:t>
       </w:r>
       <w:r>
         <w:rPr>
@@ -1511,7 +1511,7 @@
           <w:szCs w:val="24"/>
           <w:rtl/>
         </w:rPr>
-        <w:t xml:space="preserve">, כפי שמצוטט אצל </w:t>
+        <w:t xml:space="preserve">, מצוטט אצל </w:t>
       </w:r>
       <w:r>
         <w:rPr>
@@ -1544,24 +1544,24 @@
           <w:szCs w:val="24"/>
           <w:rtl/>
         </w:rPr>
-        <w:t xml:space="preserve">הממצא האמפירי הרחב ביותר בתחום מגיע מאנגליה ומוויילס. ברנטון-סמית ומקארתי </w:t>
-      </w:r>
-      <w:r>
-        <w:rPr>
-          <w:rFonts w:ascii="Times New Roman" w:cs="Times New Roman" w:eastAsia="Times New Roman" w:hAnsi="Times New Roman"/>
-          <w:sz w:val="24"/>
-          <w:szCs w:val="24"/>
-        </w:rPr>
-        <w:t xml:space="preserve">(Brunton-Smith &amp; McCarthy, 2016)</w:t>
-      </w:r>
-      <w:r>
-        <w:rPr>
-          <w:rFonts w:ascii="David" w:cs="David" w:eastAsia="David" w:hAnsi="David"/>
-          <w:sz w:val="24"/>
-          <w:szCs w:val="24"/>
-          <w:rtl/>
-        </w:rPr>
-        <w:t xml:space="preserve"> ניתחו סקר של יותר מ</w:t>
+        <w:t xml:space="preserve">הממצא האמפירי הרחב ביותר בתחום מגיע מאנגליה ומוויילס. ברנטון-סמית ומקארתי (</w:t>
+      </w:r>
+      <w:r>
+        <w:rPr>
+          <w:rFonts w:ascii="Times New Roman" w:cs="Times New Roman" w:eastAsia="Times New Roman" w:hAnsi="Times New Roman"/>
+          <w:sz w:val="24"/>
+          <w:szCs w:val="24"/>
+        </w:rPr>
+        <w:t xml:space="preserve">2016</w:t>
+      </w:r>
+      <w:r>
+        <w:rPr>
+          <w:rFonts w:ascii="David" w:cs="David" w:eastAsia="David" w:hAnsi="David"/>
+          <w:sz w:val="24"/>
+          <w:szCs w:val="24"/>
+          <w:rtl/>
+        </w:rPr>
+        <w:t xml:space="preserve">) ניתחו סקר של יותר מ</w:t>
       </w:r>
       <w:r>
         <w:rPr>
@@ -1578,24 +1578,24 @@
           <w:szCs w:val="24"/>
           <w:rtl/>
         </w:rPr>
-        <w:t xml:space="preserve"> אסירים בניתוח רב-רמות ומצאו שההוגנות הפרוצדורלית היא המנבא החזק ביותר של לגיטימיות, ושקיימת שונות בלגיטימיות לפי מאפייני האסיר, לפי תנאי המחיה ובין בתי סוהר. בהולנד חיברו בייארסברגן ואחרים </w:t>
-      </w:r>
-      <w:r>
-        <w:rPr>
-          <w:rFonts w:ascii="Times New Roman" w:cs="Times New Roman" w:eastAsia="Times New Roman" w:hAnsi="Times New Roman"/>
-          <w:sz w:val="24"/>
-          <w:szCs w:val="24"/>
-        </w:rPr>
-        <w:t xml:space="preserve">(Beijersbergen et al., 2015)</w:t>
-      </w:r>
-      <w:r>
-        <w:rPr>
-          <w:rFonts w:ascii="David" w:cs="David" w:eastAsia="David" w:hAnsi="David"/>
-          <w:sz w:val="24"/>
-          <w:szCs w:val="24"/>
-          <w:rtl/>
-        </w:rPr>
-        <w:t xml:space="preserve"> נתוני </w:t>
+        <w:t xml:space="preserve"> אסירים בניתוח רב-רמות ומצאו שההוגנות הפרוצדורלית היא המנבא החזק ביותר של לגיטימיות, ושקיימת שונות בלגיטימיות לפי מאפייני האסיר, לפי תנאי המחיה ובין בתי סוהר. בהולנד חיברו בייארסברגן ואחרים (</w:t>
+      </w:r>
+      <w:r>
+        <w:rPr>
+          <w:rFonts w:ascii="Times New Roman" w:cs="Times New Roman" w:eastAsia="Times New Roman" w:hAnsi="Times New Roman"/>
+          <w:sz w:val="24"/>
+          <w:szCs w:val="24"/>
+        </w:rPr>
+        <w:t xml:space="preserve">2015</w:t>
+      </w:r>
+      <w:r>
+        <w:rPr>
+          <w:rFonts w:ascii="David" w:cs="David" w:eastAsia="David" w:hAnsi="David"/>
+          <w:sz w:val="24"/>
+          <w:szCs w:val="24"/>
+          <w:rtl/>
+        </w:rPr>
+        <w:t xml:space="preserve">) נתוני </w:t>
       </w:r>
       <w:r>
         <w:rPr>
@@ -1629,24 +1629,24 @@
           <w:szCs w:val="24"/>
           <w:rtl/>
         </w:rPr>
-        <w:t xml:space="preserve"> אנשי סגל, והראו שמאפייני הסגל ביחידה קשורים לתפיסת הצדק הפרוצדורלי של האסירים מעבר למאפייני האסירים עצמם. בסלובניה, האצין ומשקו </w:t>
-      </w:r>
-      <w:r>
-        <w:rPr>
-          <w:rFonts w:ascii="Times New Roman" w:cs="Times New Roman" w:eastAsia="Times New Roman" w:hAnsi="Times New Roman"/>
-          <w:sz w:val="24"/>
-          <w:szCs w:val="24"/>
-        </w:rPr>
-        <w:t xml:space="preserve">(Hacin &amp; Meško, 2018)</w:t>
-      </w:r>
-      <w:r>
-        <w:rPr>
-          <w:rFonts w:ascii="David" w:cs="David" w:eastAsia="David" w:hAnsi="David"/>
-          <w:sz w:val="24"/>
-          <w:szCs w:val="24"/>
-          <w:rtl/>
-        </w:rPr>
-        <w:t xml:space="preserve"> ערכו ראיונות מובנים עם </w:t>
+        <w:t xml:space="preserve"> אנשי סגל, והראו שמאפייני הסגל ביחידה קשורים לתפיסת הצדק הפרוצדורלי של האסירים מעבר למאפייני האסירים עצמם. בסלובניה, האצין ומשקו (</w:t>
+      </w:r>
+      <w:r>
+        <w:rPr>
+          <w:rFonts w:ascii="Times New Roman" w:cs="Times New Roman" w:eastAsia="Times New Roman" w:hAnsi="Times New Roman"/>
+          <w:sz w:val="24"/>
+          <w:szCs w:val="24"/>
+        </w:rPr>
+        <w:t xml:space="preserve">2018</w:t>
+      </w:r>
+      <w:r>
+        <w:rPr>
+          <w:rFonts w:ascii="David" w:cs="David" w:eastAsia="David" w:hAnsi="David"/>
+          <w:sz w:val="24"/>
+          <w:szCs w:val="24"/>
+          <w:rtl/>
+        </w:rPr>
+        <w:t xml:space="preserve">) ערכו ראיונות מובנים עם </w:t>
       </w:r>
       <w:r>
         <w:rPr>
@@ -1679,24 +1679,24 @@
           <w:szCs w:val="24"/>
           <w:rtl/>
         </w:rPr>
-        <w:t xml:space="preserve">ממצא נוסף חשוב למחקר הנוכחי. פרנקה ואחרים </w:t>
-      </w:r>
-      <w:r>
-        <w:rPr>
-          <w:rFonts w:ascii="Times New Roman" w:cs="Times New Roman" w:eastAsia="Times New Roman" w:hAnsi="Times New Roman"/>
-          <w:sz w:val="24"/>
-          <w:szCs w:val="24"/>
-        </w:rPr>
-        <w:t xml:space="preserve">(Franke et al., 2010)</w:t>
-      </w:r>
-      <w:r>
-        <w:rPr>
-          <w:rFonts w:ascii="David" w:cs="David" w:eastAsia="David" w:hAnsi="David"/>
-          <w:sz w:val="24"/>
-          <w:szCs w:val="24"/>
-          <w:rtl/>
-        </w:rPr>
-        <w:t xml:space="preserve"> הראו בניסוי אקראי שתפיסת הלגיטימיות משתנה במהלך המאסר: בית הסוהר הרגיל פגע בה, ומה שהסביר את הפגיעה היה ריבוי חוויות שליליות ודלות סביבתית. מכאן שהזמן שאדם שוהה במוסד אינו ניטרלי, ושהמרכיבים המעצבים את הרווחה הנפשית הם גם המרכיבים המעצבים את הלגיטימיות. סקירת ההיקף של ראיין וברגין </w:t>
+        <w:t xml:space="preserve">ממצא נוסף חשוב למחקר הנוכחי. פרנקה ואחרים (</w:t>
+      </w:r>
+      <w:r>
+        <w:rPr>
+          <w:rFonts w:ascii="Times New Roman" w:cs="Times New Roman" w:eastAsia="Times New Roman" w:hAnsi="Times New Roman"/>
+          <w:sz w:val="24"/>
+          <w:szCs w:val="24"/>
+        </w:rPr>
+        <w:t xml:space="preserve">2010</w:t>
+      </w:r>
+      <w:r>
+        <w:rPr>
+          <w:rFonts w:ascii="David" w:cs="David" w:eastAsia="David" w:hAnsi="David"/>
+          <w:sz w:val="24"/>
+          <w:szCs w:val="24"/>
+          <w:rtl/>
+        </w:rPr>
+        <w:t xml:space="preserve">) הראו בניסוי אקראי שתפיסת הלגיטימיות משתנה במהלך המאסר: בית הסוהר הרגיל פגע בה, ומה שהסביר את הפגיעה היה ריבוי חוויות שליליות ודלות סביבתית. מכאן שהזמן שאדם שוהה במוסד אינו ניטרלי, ושהמרכיבים המעצבים את הרווחה הנפשית הם גם המרכיבים המעצבים את הלגיטימיות. סקירת היקף עדכנית סיכמה את הספרות סביב שני צירים, מה מעצב את הלגיטימיות וכיצד היא קשורה לציות, והצביעה על כך שרוב המחקרים נערכו במדינות מערביות מעטות </w:t>
       </w:r>
       <w:r>
         <w:rPr>
@@ -1713,7 +1713,7 @@
           <w:szCs w:val="24"/>
           <w:rtl/>
         </w:rPr>
-        <w:t xml:space="preserve"> סיכמה את הספרות סביב שני צירים, מה מעצב את הלגיטימיות וכיצד היא קשורה לציות, והצביעה על כך שרוב המחקרים נערכו במדינות מערביות מעטות. ביקורת עדכנית על הגישה הפרוצדורלית טוענת שהיא נשענת יותר מדי על יחס הוגן של הסוהרים ופחות מדי על מנגנוני השתתפות של אסירים בקבלת החלטות, שיכולים לקרב את ערכי המוסד לערכי האסירים וליצור ציות נורמטיבי יציב יותר </w:t>
+        <w:t xml:space="preserve">. ביקורת עדכנית על הגישה הפרוצדורלית טוענת שהיא נשענת יותר מדי על יחס הוגן של הסוהרים ופחות מדי על מנגנוני השתתפות של אסירים בקבלת החלטות, שיכולים לקרב את ערכי המוסד לערכי האסירים וליצור ציות נורמטיבי יציב יותר </w:t>
       </w:r>
       <w:r>
         <w:rPr>
@@ -2003,7 +2003,7 @@
           <w:szCs w:val="24"/>
           <w:rtl/>
         </w:rPr>
-        <w:t xml:space="preserve"> מושפעים מרעש הסינתזה, ולכן כל תוצאה בעבודה זו היא תכונה של הקובץ הסינתטי ולא ממצא על אסירים אמיתיים (ועקנין, </w:t>
+        <w:t xml:space="preserve"> מושפעים מרעש הסינתזה, ולכן כל תוצאה בעבודה זו היא תכונה של הקובץ הסינתטי ולא ממצא על אסירים אמיתיים (י' ועקנין, חומרי הקורס, יולי </w:t>
       </w:r>
       <w:r>
         <w:rPr>
@@ -2277,7 +2277,7 @@
           <w:szCs w:val="24"/>
           <w:rtl/>
         </w:rPr>
-        <w:t xml:space="preserve"> עצורים; הפער הקטן מהמספרים שפורסמו נובע מתהליך הסינתזה (ועקנין, </w:t>
+        <w:t xml:space="preserve"> עצורים; הפער הקטן מהמספרים שפורסמו נובע מתהליך הסינתזה (י' ועקנין, חומרי הקורס, יולי </w:t>
       </w:r>
       <w:r>
         <w:rPr>
@@ -3089,24 +3089,24 @@
           <w:szCs w:val="24"/>
           <w:rtl/>
         </w:rPr>
-        <w:t xml:space="preserve">לגיטימיות של הסגל. הסולם כולל שלושה פריטים: "אני יכול לדבר עם הסוהרים באגף אם אני מודאג או עצוב", "הסוהרים באגף מתייחסים אליי בכבוד" ו"אני מרוצה מהטיפול בבקשות שלי". שלושת הפריטים מבטאים שלושה מהתנאים ללגיטימיות שזיהו ספרקס ובוטומס </w:t>
-      </w:r>
-      <w:r>
-        <w:rPr>
-          <w:rFonts w:ascii="Times New Roman" w:cs="Times New Roman" w:eastAsia="Times New Roman" w:hAnsi="Times New Roman"/>
-          <w:sz w:val="24"/>
-          <w:szCs w:val="24"/>
-        </w:rPr>
-        <w:t xml:space="preserve">(Sparks &amp; Bottoms, 1995)</w:t>
-      </w:r>
-      <w:r>
-        <w:rPr>
-          <w:rFonts w:ascii="David" w:cs="David" w:eastAsia="David" w:hAnsi="David"/>
-          <w:sz w:val="24"/>
-          <w:szCs w:val="24"/>
-          <w:rtl/>
-        </w:rPr>
-        <w:t xml:space="preserve">: נגישות של הסגל ואיכות אנושית בשגרה, יחס מכבד, והוגנות פרוצדורלית בטיפול בבקשות. בסקר המקורי מהימנות הסולם הייתה </w:t>
+        <w:t xml:space="preserve">לגיטימיות של הסגל. הסולם כולל שלושה פריטים: "אני יכול לדבר עם הסוהרים באגף אם אני מודאג או עצוב", "הסוהרים באגף מתייחסים אליי בכבוד" ו"אני מרוצה מהטיפול בבקשות שלי". שלושת הפריטים מבטאים שלושה מהתנאים ללגיטימיות שזיהו ספרקס ובוטומס (</w:t>
+      </w:r>
+      <w:r>
+        <w:rPr>
+          <w:rFonts w:ascii="Times New Roman" w:cs="Times New Roman" w:eastAsia="Times New Roman" w:hAnsi="Times New Roman"/>
+          <w:sz w:val="24"/>
+          <w:szCs w:val="24"/>
+        </w:rPr>
+        <w:t xml:space="preserve">1995</w:t>
+      </w:r>
+      <w:r>
+        <w:rPr>
+          <w:rFonts w:ascii="David" w:cs="David" w:eastAsia="David" w:hAnsi="David"/>
+          <w:sz w:val="24"/>
+          <w:szCs w:val="24"/>
+          <w:rtl/>
+        </w:rPr>
+        <w:t xml:space="preserve">): נגישות של הסגל ואיכות אנושית בשגרה, יחס מכבד, והוגנות פרוצדורלית בטיפול בבקשות. בסקר המקורי מהימנות הסולם הייתה </w:t>
       </w:r>
       <w:r>
         <w:rPr>
@@ -3148,15 +3148,16 @@
           <w:sz w:val="24"/>
           <w:szCs w:val="24"/>
         </w:rPr>
-        <w:t xml:space="preserve">2024,</w:t>
-      </w:r>
-      <w:r>
-        <w:rPr>
-          <w:rFonts w:ascii="Times New Roman" w:cs="Times New Roman" w:eastAsia="Times New Roman" w:hAnsi="Times New Roman"/>
-          <w:sz w:val="24"/>
-          <w:szCs w:val="24"/>
-        </w:rPr>
-        <w:t xml:space="preserve"> </w:t>
+        <w:t xml:space="preserve">2024</w:t>
+      </w:r>
+      <w:r>
+        <w:rPr>
+          <w:rFonts w:ascii="David" w:cs="David" w:eastAsia="David" w:hAnsi="David"/>
+          <w:sz w:val="24"/>
+          <w:szCs w:val="24"/>
+          <w:rtl/>
+        </w:rPr>
+        <w:t xml:space="preserve">; י' ועקנין, חומרי הקורס, יולי </w:t>
       </w:r>
       <w:r>
         <w:rPr>
@@ -3231,15 +3232,16 @@
           <w:sz w:val="24"/>
           <w:szCs w:val="24"/>
         </w:rPr>
-        <w:t xml:space="preserve">2024,</w:t>
-      </w:r>
-      <w:r>
-        <w:rPr>
-          <w:rFonts w:ascii="Times New Roman" w:cs="Times New Roman" w:eastAsia="Times New Roman" w:hAnsi="Times New Roman"/>
-          <w:sz w:val="24"/>
-          <w:szCs w:val="24"/>
-        </w:rPr>
-        <w:t xml:space="preserve"> </w:t>
+        <w:t xml:space="preserve">2024</w:t>
+      </w:r>
+      <w:r>
+        <w:rPr>
+          <w:rFonts w:ascii="David" w:cs="David" w:eastAsia="David" w:hAnsi="David"/>
+          <w:sz w:val="24"/>
+          <w:szCs w:val="24"/>
+          <w:rtl/>
+        </w:rPr>
+        <w:t xml:space="preserve">; י' ועקנין, חומרי הקורס, יולי </w:t>
       </w:r>
       <w:r>
         <w:rPr>
@@ -3272,7 +3274,7 @@
           <w:szCs w:val="24"/>
           <w:rtl/>
         </w:rPr>
-        <w:t xml:space="preserve">משתני רקע לתיאור האוכלוסייה. מגדר, גיל בשנים וקבוצת גיל, לאום בשתי קטגוריות (יהודים ולא יהודים), מספר המאסרים כשפוט בשלוש קטגוריות (מאסר ראשון, שני, שלישי ומעלה), ותק באגף בארבע קטגוריות והשתתפות במסלול שיקום (ועקנין, </w:t>
+        <w:t xml:space="preserve">משתני רקע לתיאור האוכלוסייה. מגדר, גיל בשנים וקבוצת גיל, לאום בשתי קטגוריות (יהודים ולא יהודים), מספר המאסרים כשפוט בשלוש קטגוריות (מאסר ראשון, שני, שלישי ומעלה), ותק באגף בארבע קטגוריות והשתתפות במסלול שיקום (י' ועקנין, חומרי הקורס, יולי </w:t>
       </w:r>
       <w:r>
         <w:rPr>
@@ -10521,15 +10523,16 @@
           <w:sz w:val="24"/>
           <w:szCs w:val="24"/>
         </w:rPr>
-        <w:t xml:space="preserve">2024,</w:t>
-      </w:r>
-      <w:r>
-        <w:rPr>
-          <w:rFonts w:ascii="Times New Roman" w:cs="Times New Roman" w:eastAsia="Times New Roman" w:hAnsi="Times New Roman"/>
-          <w:sz w:val="24"/>
-          <w:szCs w:val="24"/>
-        </w:rPr>
-        <w:t xml:space="preserve"> </w:t>
+        <w:t xml:space="preserve">2024</w:t>
+      </w:r>
+      <w:r>
+        <w:rPr>
+          <w:rFonts w:ascii="David" w:cs="David" w:eastAsia="David" w:hAnsi="David"/>
+          <w:sz w:val="24"/>
+          <w:szCs w:val="24"/>
+          <w:rtl/>
+        </w:rPr>
+        <w:t xml:space="preserve">; י' ועקנין, חומרי הקורס, יולי </w:t>
       </w:r>
       <w:r>
         <w:rPr>
@@ -10580,24 +10583,24 @@
           <w:szCs w:val="24"/>
           <w:rtl/>
         </w:rPr>
-        <w:t xml:space="preserve"> הוחלט להשאירו, משום שהטיפול בבקשות הוא ליבת ההוגנות הפרוצדורלית אצל ספרקס ובוטומס </w:t>
-      </w:r>
-      <w:r>
-        <w:rPr>
-          <w:rFonts w:ascii="Times New Roman" w:cs="Times New Roman" w:eastAsia="Times New Roman" w:hAnsi="Times New Roman"/>
-          <w:sz w:val="24"/>
-          <w:szCs w:val="24"/>
-        </w:rPr>
-        <w:t xml:space="preserve">(Sparks &amp; Bottoms, 1995)</w:t>
-      </w:r>
-      <w:r>
-        <w:rPr>
-          <w:rFonts w:ascii="David" w:cs="David" w:eastAsia="David" w:hAnsi="David"/>
-          <w:sz w:val="24"/>
-          <w:szCs w:val="24"/>
-          <w:rtl/>
-        </w:rPr>
-        <w:t xml:space="preserve"> ומשום שכך נבנה הסולם בפרסום המקורי.</w:t>
+        <w:t xml:space="preserve"> הוחלט להשאירו, משום שהטיפול בבקשות הוא ליבת ההוגנות הפרוצדורלית אצל ספרקס ובוטומס (</w:t>
+      </w:r>
+      <w:r>
+        <w:rPr>
+          <w:rFonts w:ascii="Times New Roman" w:cs="Times New Roman" w:eastAsia="Times New Roman" w:hAnsi="Times New Roman"/>
+          <w:sz w:val="24"/>
+          <w:szCs w:val="24"/>
+        </w:rPr>
+        <w:t xml:space="preserve">1995</w:t>
+      </w:r>
+      <w:r>
+        <w:rPr>
+          <w:rFonts w:ascii="David" w:cs="David" w:eastAsia="David" w:hAnsi="David"/>
+          <w:sz w:val="24"/>
+          <w:szCs w:val="24"/>
+          <w:rtl/>
+        </w:rPr>
+        <w:t xml:space="preserve">) ומשום שכך נבנה הסולם בפרסום המקורי.</w:t>
       </w:r>
     </w:p>
     <w:p>
@@ -12647,24 +12650,24 @@
           <w:szCs w:val="24"/>
           <w:rtl/>
         </w:rPr>
-        <w:t xml:space="preserve">). ממצא זה מתיישב עם הדגש של ספרקס ובוטומס </w:t>
-      </w:r>
-      <w:r>
-        <w:rPr>
-          <w:rFonts w:ascii="Times New Roman" w:cs="Times New Roman" w:eastAsia="Times New Roman" w:hAnsi="Times New Roman"/>
-          <w:sz w:val="24"/>
-          <w:szCs w:val="24"/>
-        </w:rPr>
-        <w:t xml:space="preserve">(Sparks &amp; Bottoms, 1995)</w:t>
-      </w:r>
-      <w:r>
-        <w:rPr>
-          <w:rFonts w:ascii="David" w:cs="David" w:eastAsia="David" w:hAnsi="David"/>
-          <w:sz w:val="24"/>
-          <w:szCs w:val="24"/>
-          <w:rtl/>
-        </w:rPr>
-        <w:t xml:space="preserve"> על האיכות האנושית של שגרת היום כתנאי ללגיטימיות, ועם הממצא האוסטרלי שלפיו איכות היחסים עם הסגל היא המנגנון שדרכו צדק פרוצדורלי מתורגם לרווחה לאורך זמן </w:t>
+        <w:t xml:space="preserve">). ממצא זה מתיישב עם הדגש של ספרקס ובוטומס (</w:t>
+      </w:r>
+      <w:r>
+        <w:rPr>
+          <w:rFonts w:ascii="Times New Roman" w:cs="Times New Roman" w:eastAsia="Times New Roman" w:hAnsi="Times New Roman"/>
+          <w:sz w:val="24"/>
+          <w:szCs w:val="24"/>
+        </w:rPr>
+        <w:t xml:space="preserve">1995</w:t>
+      </w:r>
+      <w:r>
+        <w:rPr>
+          <w:rFonts w:ascii="David" w:cs="David" w:eastAsia="David" w:hAnsi="David"/>
+          <w:sz w:val="24"/>
+          <w:szCs w:val="24"/>
+          <w:rtl/>
+        </w:rPr>
+        <w:t xml:space="preserve">) על האיכות האנושית של שגרת היום כתנאי ללגיטימיות, ועם הממצא האוסטרלי שלפיו איכות היחסים עם הסגל היא המנגנון שדרכו צדק פרוצדורלי מתורגם לרווחה לאורך זמן </w:t>
       </w:r>
       <w:r>
         <w:rPr>
@@ -13665,24 +13668,24 @@
           <w:szCs w:val="24"/>
           <w:rtl/>
         </w:rPr>
-        <w:t xml:space="preserve"> אחוזים מסטיית תקן. לשם השוואה, אצל אוטי וליבלינג </w:t>
-      </w:r>
-      <w:r>
-        <w:rPr>
-          <w:rFonts w:ascii="Times New Roman" w:cs="Times New Roman" w:eastAsia="Times New Roman" w:hAnsi="Times New Roman"/>
-          <w:sz w:val="24"/>
-          <w:szCs w:val="24"/>
-        </w:rPr>
-        <w:t xml:space="preserve">(Auty &amp; Liebling, 2024)</w:t>
-      </w:r>
-      <w:r>
-        <w:rPr>
-          <w:rFonts w:ascii="David" w:cs="David" w:eastAsia="David" w:hAnsi="David"/>
-          <w:sz w:val="24"/>
-          <w:szCs w:val="24"/>
-          <w:rtl/>
-        </w:rPr>
-        <w:t xml:space="preserve"> המרחק בין הסף "הלא בטוח" לסף "הבטוח מינימלית" בממד יחסי הסגל והאסירים הוא חצי נקודה בלבד, ומרחק זה הבחין בין בתי סוהר עם שיעורי אלימות ופגיעה עצמית גבוהים לנמוכים.</w:t>
+        <w:t xml:space="preserve"> אחוזים מסטיית תקן. לשם השוואה, אצל אוטי וליבלינג (</w:t>
+      </w:r>
+      <w:r>
+        <w:rPr>
+          <w:rFonts w:ascii="Times New Roman" w:cs="Times New Roman" w:eastAsia="Times New Roman" w:hAnsi="Times New Roman"/>
+          <w:sz w:val="24"/>
+          <w:szCs w:val="24"/>
+        </w:rPr>
+        <w:t xml:space="preserve">2024</w:t>
+      </w:r>
+      <w:r>
+        <w:rPr>
+          <w:rFonts w:ascii="David" w:cs="David" w:eastAsia="David" w:hAnsi="David"/>
+          <w:sz w:val="24"/>
+          <w:szCs w:val="24"/>
+          <w:rtl/>
+        </w:rPr>
+        <w:t xml:space="preserve">) המרחק בין הסף "הלא בטוח" לסף "הבטוח מינימלית" בממד יחסי הסגל והאסירים הוא חצי נקודה בלבד, ומרחק זה הבחין בין בתי סוהר עם שיעורי אלימות ופגיעה עצמית גבוהים לנמוכים.</w:t>
       </w:r>
     </w:p>
     <w:p>
@@ -13805,24 +13808,24 @@
           <w:szCs w:val="24"/>
           <w:rtl/>
         </w:rPr>
-        <w:t xml:space="preserve">המחקר ביקש לבחון באיזו מידה קיים קשר בין רווחה נפשית לבין תפיסת הלגיטימיות של סגל הכליאה בקרב אסירים שפוטים בישראל. הוא נשען על תאוריית הלגיטימיות בבתי סוהר של ספרקס ובוטומס </w:t>
-      </w:r>
-      <w:r>
-        <w:rPr>
-          <w:rFonts w:ascii="Times New Roman" w:cs="Times New Roman" w:eastAsia="Times New Roman" w:hAnsi="Times New Roman"/>
-          <w:sz w:val="24"/>
-          <w:szCs w:val="24"/>
-        </w:rPr>
-        <w:t xml:space="preserve">(Sparks &amp; Bottoms, 1995)</w:t>
-      </w:r>
-      <w:r>
-        <w:rPr>
-          <w:rFonts w:ascii="David" w:cs="David" w:eastAsia="David" w:hAnsi="David"/>
-          <w:sz w:val="24"/>
-          <w:szCs w:val="24"/>
-          <w:rtl/>
-        </w:rPr>
-        <w:t xml:space="preserve">, שלפיה הציות לסמכות נובע מתפיסתה כהוגנת, ועל ספרות ההסתגלות למאסר שתיארה את הפגיעה ברווחה הנפשית כחלק בלתי נפרד מחוויית הכליאה (דוידסקו וולק, </w:t>
+        <w:t xml:space="preserve">המחקר ביקש לבחון באיזו מידה קיים קשר בין רווחה נפשית לבין תפיסת הלגיטימיות של סגל הכליאה בקרב אסירים שפוטים בישראל. הוא נשען על תאוריית הלגיטימיות בבתי סוהר של ספרקס ובוטומס (</w:t>
+      </w:r>
+      <w:r>
+        <w:rPr>
+          <w:rFonts w:ascii="Times New Roman" w:cs="Times New Roman" w:eastAsia="Times New Roman" w:hAnsi="Times New Roman"/>
+          <w:sz w:val="24"/>
+          <w:szCs w:val="24"/>
+        </w:rPr>
+        <w:t xml:space="preserve">1995</w:t>
+      </w:r>
+      <w:r>
+        <w:rPr>
+          <w:rFonts w:ascii="David" w:cs="David" w:eastAsia="David" w:hAnsi="David"/>
+          <w:sz w:val="24"/>
+          <w:szCs w:val="24"/>
+          <w:rtl/>
+        </w:rPr>
+        <w:t xml:space="preserve">), שלפיה הציות לסמכות נובע מתפיסתה כהוגנת, ועל ספרות ההסתגלות למאסר שתיארה את הפגיעה ברווחה הנפשית כחלק בלתי נפרד מחוויית הכליאה (דוידסקו וולק, </w:t>
       </w:r>
       <w:r>
         <w:rPr>
@@ -13864,15 +13867,16 @@
           <w:sz w:val="24"/>
           <w:szCs w:val="24"/>
         </w:rPr>
-        <w:t xml:space="preserve">2024,</w:t>
-      </w:r>
-      <w:r>
-        <w:rPr>
-          <w:rFonts w:ascii="Times New Roman" w:cs="Times New Roman" w:eastAsia="Times New Roman" w:hAnsi="Times New Roman"/>
-          <w:sz w:val="24"/>
-          <w:szCs w:val="24"/>
-        </w:rPr>
-        <w:t xml:space="preserve"> </w:t>
+        <w:t xml:space="preserve">2024</w:t>
+      </w:r>
+      <w:r>
+        <w:rPr>
+          <w:rFonts w:ascii="David" w:cs="David" w:eastAsia="David" w:hAnsi="David"/>
+          <w:sz w:val="24"/>
+          <w:szCs w:val="24"/>
+          <w:rtl/>
+        </w:rPr>
+        <w:t xml:space="preserve">; י' ועקנין, חומרי הקורס, יולי </w:t>
       </w:r>
       <w:r>
         <w:rPr>
@@ -14009,7 +14013,7 @@
           <w:szCs w:val="24"/>
           <w:rtl/>
         </w:rPr>
-        <w:t xml:space="preserve"> מרמז שהמנגנון עובר דרך תחושת השליטה שיחס הוגן מעניק לאסיר. המחקר הנוכחי מוסיף לכך את הכיוון ההפוך: שפוטים שרווחתם הנפשית גבוהה יותר תופסים את הסגל כלגיטימי יותר. שני הכיוונים אינם סותרים. סביר שמדובר במעגל שבו יחס הוגן משפר את הרווחה, ורווחה גבוהה יותר מאפשרת לאסיר לפרש את התנהגות הסגל באור פחות עוין ולפנות אליו כשקשה לו. העובדה שהפריט הקשור ביותר לרווחה הוא דווקא האפשרות לדבר עם הסוהרים כשמודאגים או עצובים מחזקת פירוש זה, ומתיישבת עם ממצאיו של שניטקר </w:t>
+        <w:t xml:space="preserve"> מרמז שהמנגנון עובר דרך תחושת השליטה שיחס הוגן מעניק לאסיר. המחקר הנוכחי מוסיף לכך את הכיוון ההפוך: שפוטים שרווחתם הנפשית גבוהה יותר תופסים את הסגל כלגיטימי יותר. שני הכיוונים אינם סותרים. סביר שמדובר במעגל שבו יחס הוגן משפר את הרווחה, ורווחה גבוהה יותר מאפשרת לאסיר לפרש את התנהגות הסגל באור פחות עוין ולפנות אליו כשקשה לו. העובדה שהפריט הקשור ביותר לרווחה הוא דווקא האפשרות לדבר עם הסוהרים כשמודאגים או עצובים מחזקת פירוש זה, ומתיישבת עם מחקר האורך של משוחררי כלא בבוסטון, שבו סביבה של כבוד ואמון בין אסירים לסגל הפחיתה את חוסר האושר בשנה שאחרי השחרור, ואסירים שחוו יחסים תומכים עם הסוהרים פיתחו יחסים תומכים יותר גם בחוץ </w:t>
       </w:r>
       <w:r>
         <w:rPr>
@@ -14026,7 +14030,7 @@
           <w:szCs w:val="24"/>
           <w:rtl/>
         </w:rPr>
-        <w:t xml:space="preserve"> ממחקר האורך של משוחררי כלא בבוסטון: סביבה של כבוד ואמון בין אסירים לסגל הפחיתה את חוסר האושר בשנה שאחרי השחרור, ואסירים שחוו יחסים תומכים עם הסוהרים פיתחו יחסים תומכים יותר גם בחוץ.</w:t>
+        <w:t xml:space="preserve">.</w:t>
       </w:r>
     </w:p>
     <w:p>
@@ -14059,7 +14063,7 @@
           <w:szCs w:val="24"/>
           <w:rtl/>
         </w:rPr>
-        <w:t xml:space="preserve">, כפי שמצוטט אצל </w:t>
+        <w:t xml:space="preserve">, מצוטט אצל </w:t>
       </w:r>
       <w:r>
         <w:rPr>
@@ -14076,24 +14080,24 @@
           <w:szCs w:val="24"/>
           <w:rtl/>
         </w:rPr>
-        <w:t xml:space="preserve">), ועם ממצאיהם של פרנקה ואחרים </w:t>
-      </w:r>
-      <w:r>
-        <w:rPr>
-          <w:rFonts w:ascii="Times New Roman" w:cs="Times New Roman" w:eastAsia="Times New Roman" w:hAnsi="Times New Roman"/>
-          <w:sz w:val="24"/>
-          <w:szCs w:val="24"/>
-        </w:rPr>
-        <w:t xml:space="preserve">(Franke et al., 2010)</w:t>
-      </w:r>
-      <w:r>
-        <w:rPr>
-          <w:rFonts w:ascii="David" w:cs="David" w:eastAsia="David" w:hAnsi="David"/>
-          <w:sz w:val="24"/>
-          <w:szCs w:val="24"/>
-          <w:rtl/>
-        </w:rPr>
-        <w:t xml:space="preserve">, שלפיהם דלות סביבתית וחוויות שליליות הן שמכרסמות בלגיטימיות. המדרג שנמצא בלוח </w:t>
+        <w:t xml:space="preserve">), ועם ממצאיהם של פרנקה ואחרים (</w:t>
+      </w:r>
+      <w:r>
+        <w:rPr>
+          <w:rFonts w:ascii="Times New Roman" w:cs="Times New Roman" w:eastAsia="Times New Roman" w:hAnsi="Times New Roman"/>
+          <w:sz w:val="24"/>
+          <w:szCs w:val="24"/>
+        </w:rPr>
+        <w:t xml:space="preserve">2010</w:t>
+      </w:r>
+      <w:r>
+        <w:rPr>
+          <w:rFonts w:ascii="David" w:cs="David" w:eastAsia="David" w:hAnsi="David"/>
+          <w:sz w:val="24"/>
+          <w:szCs w:val="24"/>
+          <w:rtl/>
+        </w:rPr>
+        <w:t xml:space="preserve">), שלפיהם דלות סביבתית וחוויות שליליות הן שמכרסמות בלגיטימיות. המדרג שנמצא בלוח </w:t>
       </w:r>
       <w:r>
         <w:rPr>
@@ -14127,24 +14131,24 @@
           <w:szCs w:val="24"/>
           <w:rtl/>
         </w:rPr>
-        <w:t xml:space="preserve"> נקודות ברווחה בין השפוטים ברמת הלגיטימיות הנמוכה לאלו ברמה הגבוהה, מקבל משמעות מעשית לאור הספים שזיהו אוטי וליבלינג </w:t>
-      </w:r>
-      <w:r>
-        <w:rPr>
-          <w:rFonts w:ascii="Times New Roman" w:cs="Times New Roman" w:eastAsia="Times New Roman" w:hAnsi="Times New Roman"/>
-          <w:sz w:val="24"/>
-          <w:szCs w:val="24"/>
-        </w:rPr>
-        <w:t xml:space="preserve">(Auty &amp; Liebling, 2024)</w:t>
-      </w:r>
-      <w:r>
-        <w:rPr>
-          <w:rFonts w:ascii="David" w:cs="David" w:eastAsia="David" w:hAnsi="David"/>
-          <w:sz w:val="24"/>
-          <w:szCs w:val="24"/>
-          <w:rtl/>
-        </w:rPr>
-        <w:t xml:space="preserve">: מתחת לרמה מסוימת של יחסים בין סגל לאסירים עולים באופן חד שיעורי הפגיעה העצמית והאלימות. הממצא הישראלי שלפיו רווחה נפשית סובייקטיבית של אסירים עולה בעקבות התערבות קבוצתית (שני ואחרים, </w:t>
+        <w:t xml:space="preserve"> נקודות ברווחה בין השפוטים ברמת הלגיטימיות הנמוכה לאלו ברמה הגבוהה, מקבל משמעות מעשית לאור הספים שזיהו אוטי וליבלינג (</w:t>
+      </w:r>
+      <w:r>
+        <w:rPr>
+          <w:rFonts w:ascii="Times New Roman" w:cs="Times New Roman" w:eastAsia="Times New Roman" w:hAnsi="Times New Roman"/>
+          <w:sz w:val="24"/>
+          <w:szCs w:val="24"/>
+        </w:rPr>
+        <w:t xml:space="preserve">2024</w:t>
+      </w:r>
+      <w:r>
+        <w:rPr>
+          <w:rFonts w:ascii="David" w:cs="David" w:eastAsia="David" w:hAnsi="David"/>
+          <w:sz w:val="24"/>
+          <w:szCs w:val="24"/>
+          <w:rtl/>
+        </w:rPr>
+        <w:t xml:space="preserve">): מתחת לרמה מסוימת של יחסים בין סגל לאסירים עולים באופן חד שיעורי הפגיעה העצמית והאלימות. הממצא הישראלי שלפיו רווחה נפשית סובייקטיבית של אסירים עולה בעקבות התערבות קבוצתית (שני ואחרים, </w:t>
       </w:r>
       <w:r>
         <w:rPr>
@@ -14177,41 +14181,41 @@
           <w:szCs w:val="24"/>
           <w:rtl/>
         </w:rPr>
-        <w:t xml:space="preserve">עוצמת הקשר, בינונית ולא גבוהה, ראויה להתייחסות. הרווחה הנפשית חולקת עם הלגיטימיות כעשרה אחוזים מהשונות, ורוב השונות מוסברת על ידי גורמים אחרים. ברנטון-סמית ומקארתי </w:t>
-      </w:r>
-      <w:r>
-        <w:rPr>
-          <w:rFonts w:ascii="Times New Roman" w:cs="Times New Roman" w:eastAsia="Times New Roman" w:hAnsi="Times New Roman"/>
-          <w:sz w:val="24"/>
-          <w:szCs w:val="24"/>
-        </w:rPr>
-        <w:t xml:space="preserve">(Brunton-Smith &amp; McCarthy, 2016)</w:t>
-      </w:r>
-      <w:r>
-        <w:rPr>
-          <w:rFonts w:ascii="David" w:cs="David" w:eastAsia="David" w:hAnsi="David"/>
-          <w:sz w:val="24"/>
-          <w:szCs w:val="24"/>
-          <w:rtl/>
-        </w:rPr>
-        <w:t xml:space="preserve"> הראו שהמנבא החזק ביותר של לגיטימיות הוא ההוגנות הפרוצדורלית עצמה, כלומר האופן שבו הסגל מקבל החלטות ומסביר אותן, ושחלק מהשונות נמצא ברמת בית הסוהר ולא ברמת האסיר. בייארסברגן ואחרים </w:t>
-      </w:r>
-      <w:r>
-        <w:rPr>
-          <w:rFonts w:ascii="Times New Roman" w:cs="Times New Roman" w:eastAsia="Times New Roman" w:hAnsi="Times New Roman"/>
-          <w:sz w:val="24"/>
-          <w:szCs w:val="24"/>
-        </w:rPr>
-        <w:t xml:space="preserve">(Beijersbergen et al., 2015)</w:t>
-      </w:r>
-      <w:r>
-        <w:rPr>
-          <w:rFonts w:ascii="David" w:cs="David" w:eastAsia="David" w:hAnsi="David"/>
-          <w:sz w:val="24"/>
-          <w:szCs w:val="24"/>
-          <w:rtl/>
-        </w:rPr>
-        <w:t xml:space="preserve"> הוסיפו שמאפייני הסגל ביחידה משפיעים על תפיסת ההוגנות. בקובץ הסינתטי לא ניתן להפריד בין בתי סוהר ובין אגפים, ולכן חלק זה של השונות נותר מחוץ לניתוח. בסקר המקורי הסביר המודל </w:t>
+        <w:t xml:space="preserve">עוצמת הקשר, בינונית ולא גבוהה, ראויה להתייחסות. הרווחה הנפשית חולקת עם הלגיטימיות כעשרה אחוזים מהשונות, ורוב השונות מוסברת על ידי גורמים אחרים. ברנטון-סמית ומקארתי (</w:t>
+      </w:r>
+      <w:r>
+        <w:rPr>
+          <w:rFonts w:ascii="Times New Roman" w:cs="Times New Roman" w:eastAsia="Times New Roman" w:hAnsi="Times New Roman"/>
+          <w:sz w:val="24"/>
+          <w:szCs w:val="24"/>
+        </w:rPr>
+        <w:t xml:space="preserve">2016</w:t>
+      </w:r>
+      <w:r>
+        <w:rPr>
+          <w:rFonts w:ascii="David" w:cs="David" w:eastAsia="David" w:hAnsi="David"/>
+          <w:sz w:val="24"/>
+          <w:szCs w:val="24"/>
+          <w:rtl/>
+        </w:rPr>
+        <w:t xml:space="preserve">) הראו שהמנבא החזק ביותר של לגיטימיות הוא ההוגנות הפרוצדורלית עצמה, כלומר האופן שבו הסגל מקבל החלטות ומסביר אותן, ושחלק מהשונות נמצא ברמת בית הסוהר ולא ברמת האסיר. בייארסברגן ואחרים (</w:t>
+      </w:r>
+      <w:r>
+        <w:rPr>
+          <w:rFonts w:ascii="Times New Roman" w:cs="Times New Roman" w:eastAsia="Times New Roman" w:hAnsi="Times New Roman"/>
+          <w:sz w:val="24"/>
+          <w:szCs w:val="24"/>
+        </w:rPr>
+        <w:t xml:space="preserve">2015</w:t>
+      </w:r>
+      <w:r>
+        <w:rPr>
+          <w:rFonts w:ascii="David" w:cs="David" w:eastAsia="David" w:hAnsi="David"/>
+          <w:sz w:val="24"/>
+          <w:szCs w:val="24"/>
+          <w:rtl/>
+        </w:rPr>
+        <w:t xml:space="preserve">) הוסיפו שמאפייני הסגל ביחידה משפיעים על תפיסת ההוגנות. בקובץ הסינתטי לא ניתן להפריד בין בתי סוהר ובין אגפים, ולכן חלק זה של השונות נותר מחוץ לניתוח. בסקר המקורי הסביר המודל </w:t>
       </w:r>
       <w:r>
         <w:rPr>
@@ -14434,7 +14438,7 @@
           <w:szCs w:val="24"/>
           <w:rtl/>
         </w:rPr>
-        <w:t xml:space="preserve">), יחס הסגל באגף נותר אחד ממרכיבי ההוגנות המעטים שהאסיר חווה ישירות. ממצאיו של שניטקר </w:t>
+        <w:t xml:space="preserve">), יחס הסגל באגף נותר אחד ממרכיבי ההוגנות המעטים שהאסיר חווה ישירות. הממצא שלפיו יחסי כבוד ואמון עם הסגל ממשיכים להשפיע על הרווחה גם בשנה שאחרי השחרור </w:t>
       </w:r>
       <w:r>
         <w:rPr>
@@ -14451,7 +14455,7 @@
           <w:szCs w:val="24"/>
           <w:rtl/>
         </w:rPr>
-        <w:t xml:space="preserve">, שלפיהם יחסי כבוד ואמון עם הסגל ממשיכים להשפיע על הרווחה גם בשנה שאחרי השחרור, יחד עם הממצא הישראלי על תרומת התמיכה החברתית לרווחתם של אסירים משוחררים (מורלי ואחרים, </w:t>
+        <w:t xml:space="preserve">, יחד עם הממצא הישראלי על תרומת התמיכה החברתית לרווחתם של אסירים משוחררים (מורלי ואחרים, </w:t>
       </w:r>
       <w:r>
         <w:rPr>
@@ -14504,24 +14508,24 @@
           <w:szCs w:val="24"/>
           <w:rtl/>
         </w:rPr>
-        <w:t xml:space="preserve">מהממצאים נגזרות כמה המלצות מעשיות. הראשונה היא סינון שגרתי של רווחה נפשית בשתי נקודות זמן, בקליטה לאגף ושלושה חודשים לאחריה, שהן נקודות הזמן שבהן נמדדה המצוקה במחקר ההולנדי שעליו נשענו סרג'נט ואחרים </w:t>
-      </w:r>
-      <w:r>
-        <w:rPr>
-          <w:rFonts w:ascii="Times New Roman" w:cs="Times New Roman" w:eastAsia="Times New Roman" w:hAnsi="Times New Roman"/>
-          <w:sz w:val="24"/>
-          <w:szCs w:val="24"/>
-        </w:rPr>
-        <w:t xml:space="preserve">(Sargeant et al., 2026)</w:t>
-      </w:r>
-      <w:r>
-        <w:rPr>
-          <w:rFonts w:ascii="David" w:cs="David" w:eastAsia="David" w:hAnsi="David"/>
-          <w:sz w:val="24"/>
-          <w:szCs w:val="24"/>
-          <w:rtl/>
-        </w:rPr>
-        <w:t xml:space="preserve">. חמשת פריטי הרווחה שבשאלון הנוכחי, שמהימנותם </w:t>
+        <w:t xml:space="preserve">מהממצאים נגזרות כמה המלצות מעשיות. הראשונה היא סינון שגרתי של רווחה נפשית בשתי נקודות זמן, בקליטה לאגף ושלושה חודשים לאחריה, שהן נקודות הזמן שבהן נמדדה המצוקה במחקר ההולנדי שעליו נשענו סרג'נט ואחרים (</w:t>
+      </w:r>
+      <w:r>
+        <w:rPr>
+          <w:rFonts w:ascii="Times New Roman" w:cs="Times New Roman" w:eastAsia="Times New Roman" w:hAnsi="Times New Roman"/>
+          <w:sz w:val="24"/>
+          <w:szCs w:val="24"/>
+        </w:rPr>
+        <w:t xml:space="preserve">2026</w:t>
+      </w:r>
+      <w:r>
+        <w:rPr>
+          <w:rFonts w:ascii="David" w:cs="David" w:eastAsia="David" w:hAnsi="David"/>
+          <w:sz w:val="24"/>
+          <w:szCs w:val="24"/>
+          <w:rtl/>
+        </w:rPr>
+        <w:t xml:space="preserve">). חמשת פריטי הרווחה שבשאלון הנוכחי, שמהימנותם </w:t>
       </w:r>
       <w:r>
         <w:rPr>
@@ -14538,24 +14542,24 @@
           <w:szCs w:val="24"/>
           <w:rtl/>
         </w:rPr>
-        <w:t xml:space="preserve"> יכולים לשמש לכך כפי שהם. השנייה נובעת מהממצא שהפריט הקשור ביותר לרווחה הוא האפשרות לדבר עם הסוהרים: לקבוע לכל סוהר אגף שעת קבלה שבועית קבועה שבה אסירים יכולים לפנות אליו שלא בדחיפות, ולתעד את הפניות. השלישית היא הכשרת סוהרי אגף בעקרונות הצדק הפרוצדורלי, לתת לאסיר לומר את דברו לפני החלטה ולהסביר את ההחלטה גם כשהיא שלילית, בהתאם לתנאים שזיהו ספרקס ובוטומס </w:t>
-      </w:r>
-      <w:r>
-        <w:rPr>
-          <w:rFonts w:ascii="Times New Roman" w:cs="Times New Roman" w:eastAsia="Times New Roman" w:hAnsi="Times New Roman"/>
-          <w:sz w:val="24"/>
-          <w:szCs w:val="24"/>
-        </w:rPr>
-        <w:t xml:space="preserve">(Sparks &amp; Bottoms, 1995)</w:t>
-      </w:r>
-      <w:r>
-        <w:rPr>
-          <w:rFonts w:ascii="David" w:cs="David" w:eastAsia="David" w:hAnsi="David"/>
-          <w:sz w:val="24"/>
-          <w:szCs w:val="24"/>
-          <w:rtl/>
-        </w:rPr>
-        <w:t xml:space="preserve">. הרביעית היא מדידה שנתית של הלגיטימיות והרווחה ברמת האגף באמצעות שלושת פריטי הלגיטימיות וחמשת פריטי הרווחה, כך שאגפים שבהם הציונים נמוכים מסף מוגדר, למשל </w:t>
+        <w:t xml:space="preserve"> יכולים לשמש לכך כפי שהם. השנייה נובעת מהממצא שהפריט הקשור ביותר לרווחה הוא האפשרות לדבר עם הסוהרים: לקבוע לכל סוהר אגף שעת קבלה שבועית קבועה שבה אסירים יכולים לפנות אליו שלא בדחיפות, ולתעד את הפניות. השלישית היא הכשרת סוהרי אגף בעקרונות הצדק הפרוצדורלי, לתת לאסיר לומר את דברו לפני החלטה ולהסביר את ההחלטה גם כשהיא שלילית, בהתאם לתנאים שזיהו ספרקס ובוטומס (</w:t>
+      </w:r>
+      <w:r>
+        <w:rPr>
+          <w:rFonts w:ascii="Times New Roman" w:cs="Times New Roman" w:eastAsia="Times New Roman" w:hAnsi="Times New Roman"/>
+          <w:sz w:val="24"/>
+          <w:szCs w:val="24"/>
+        </w:rPr>
+        <w:t xml:space="preserve">1995</w:t>
+      </w:r>
+      <w:r>
+        <w:rPr>
+          <w:rFonts w:ascii="David" w:cs="David" w:eastAsia="David" w:hAnsi="David"/>
+          <w:sz w:val="24"/>
+          <w:szCs w:val="24"/>
+          <w:rtl/>
+        </w:rPr>
+        <w:t xml:space="preserve">). הרביעית היא מדידה שנתית של הלגיטימיות והרווחה ברמת האגף באמצעות שלושת פריטי הלגיטימיות וחמשת פריטי הרווחה, כך שאגפים שבהם הציונים נמוכים מסף מוגדר, למשל </w:t>
       </w:r>
       <w:r>
         <w:rPr>
@@ -14572,24 +14576,24 @@
           <w:szCs w:val="24"/>
           <w:rtl/>
         </w:rPr>
-        <w:t xml:space="preserve"> יזוהו ויקבלו ליווי, בדומה לסף שהציעו אוטי וליבלינג </w:t>
-      </w:r>
-      <w:r>
-        <w:rPr>
-          <w:rFonts w:ascii="Times New Roman" w:cs="Times New Roman" w:eastAsia="Times New Roman" w:hAnsi="Times New Roman"/>
-          <w:sz w:val="24"/>
-          <w:szCs w:val="24"/>
-        </w:rPr>
-        <w:t xml:space="preserve">(Auty &amp; Liebling, 2024)</w:t>
-      </w:r>
-      <w:r>
-        <w:rPr>
-          <w:rFonts w:ascii="David" w:cs="David" w:eastAsia="David" w:hAnsi="David"/>
-          <w:sz w:val="24"/>
-          <w:szCs w:val="24"/>
-          <w:rtl/>
-        </w:rPr>
-        <w:t xml:space="preserve">. החמישית, בעקבות הביקורת על הגישה הפרוצדורלית </w:t>
+        <w:t xml:space="preserve"> יזוהו ויקבלו ליווי, בדומה לסף שהציעו אוטי וליבלינג (</w:t>
+      </w:r>
+      <w:r>
+        <w:rPr>
+          <w:rFonts w:ascii="Times New Roman" w:cs="Times New Roman" w:eastAsia="Times New Roman" w:hAnsi="Times New Roman"/>
+          <w:sz w:val="24"/>
+          <w:szCs w:val="24"/>
+        </w:rPr>
+        <w:t xml:space="preserve">2024</w:t>
+      </w:r>
+      <w:r>
+        <w:rPr>
+          <w:rFonts w:ascii="David" w:cs="David" w:eastAsia="David" w:hAnsi="David"/>
+          <w:sz w:val="24"/>
+          <w:szCs w:val="24"/>
+          <w:rtl/>
+        </w:rPr>
+        <w:t xml:space="preserve">). החמישית, בעקבות הביקורת על הגישה הפרוצדורלית </w:t>
       </w:r>
       <w:r>
         <w:rPr>
@@ -14659,7 +14663,7 @@
           <w:szCs w:val="24"/>
           <w:rtl/>
         </w:rPr>
-        <w:t xml:space="preserve"> מושפעים מרעש הסינתזה (ועקנין, </w:t>
+        <w:t xml:space="preserve"> מושפעים מרעש הסינתזה (י' ועקנין, חומרי הקורס, יולי </w:t>
       </w:r>
       <w:r>
         <w:rPr>
@@ -14759,24 +14763,24 @@
           <w:szCs w:val="24"/>
           <w:rtl/>
         </w:rPr>
-        <w:t xml:space="preserve">המגבלה השלישית היא היקף האוכלוסייה והמדידה. המחקר עוסק באסירים פליליים ישראלים שפוטים בלבד, ואינו מייצג עצורים, אסירים ביטחוניים או אסירות, שמספרן במדגם קטן מכדי לנתחן בנפרד. שני המשתנים נמדדו בדיווח עצמי בשאלון שהועבר על ידי מנהלי האגפים וקציני החינוך, ובסביבת כליאה יש לחשוש מרצייה חברתית ומחשש של אסירים לדווח על יחס הסגל, גם כשהשאלון אנונימי. הממוצע הגבוה של הלגיטימיות והטיית ההתפלגות שמאלה עשויים לשקף חשש כזה. האצין ומשקו </w:t>
-      </w:r>
-      <w:r>
-        <w:rPr>
-          <w:rFonts w:ascii="Times New Roman" w:cs="Times New Roman" w:eastAsia="Times New Roman" w:hAnsi="Times New Roman"/>
-          <w:sz w:val="24"/>
-          <w:szCs w:val="24"/>
-        </w:rPr>
-        <w:t xml:space="preserve">(Hacin &amp; Meško, 2018)</w:t>
-      </w:r>
-      <w:r>
-        <w:rPr>
-          <w:rFonts w:ascii="David" w:cs="David" w:eastAsia="David" w:hAnsi="David"/>
-          <w:sz w:val="24"/>
-          <w:szCs w:val="24"/>
-          <w:rtl/>
-        </w:rPr>
-        <w:t xml:space="preserve"> הצביעו על חוסר אמון בסגל כתופעה רווחת, וייתכן שאותו חוסר אמון משפיע גם על הנכונות להשיב בכנות.</w:t>
+        <w:t xml:space="preserve">המגבלה השלישית היא היקף האוכלוסייה והמדידה. המחקר עוסק באסירים פליליים ישראלים שפוטים בלבד, ואינו מייצג עצורים, אסירים ביטחוניים או אסירות, שמספרן במדגם קטן מכדי לנתחן בנפרד. שני המשתנים נמדדו בדיווח עצמי בשאלון שהועבר על ידי מנהלי האגפים וקציני החינוך, ובסביבת כליאה יש לחשוש מרצייה חברתית ומחשש של אסירים לדווח על יחס הסגל, גם כשהשאלון אנונימי. הממוצע הגבוה של הלגיטימיות והטיית ההתפלגות שמאלה עשויים לשקף חשש כזה. האצין ומשקו (</w:t>
+      </w:r>
+      <w:r>
+        <w:rPr>
+          <w:rFonts w:ascii="Times New Roman" w:cs="Times New Roman" w:eastAsia="Times New Roman" w:hAnsi="Times New Roman"/>
+          <w:sz w:val="24"/>
+          <w:szCs w:val="24"/>
+        </w:rPr>
+        <w:t xml:space="preserve">2018</w:t>
+      </w:r>
+      <w:r>
+        <w:rPr>
+          <w:rFonts w:ascii="David" w:cs="David" w:eastAsia="David" w:hAnsi="David"/>
+          <w:sz w:val="24"/>
+          <w:szCs w:val="24"/>
+          <w:rtl/>
+        </w:rPr>
+        <w:t xml:space="preserve">) הצביעו על חוסר אמון בסגל כתופעה רווחת, וייתכן שאותו חוסר אמון משפיע גם על הנכונות להשיב בכנות.</w:t>
       </w:r>
     </w:p>
     <w:p>
@@ -15063,6 +15067,8 @@
       <w:r>
         <w:rPr>
           <w:rFonts w:ascii="David" w:cs="David" w:eastAsia="David" w:hAnsi="David"/>
+          <w:b w:val="false"/>
+          <w:bCs w:val="false"/>
           <w:sz w:val="24"/>
           <w:szCs w:val="24"/>
           <w:rtl/>
@@ -15072,6 +15078,8 @@
       <w:r>
         <w:rPr>
           <w:rFonts w:ascii="Times New Roman" w:cs="Times New Roman" w:eastAsia="Times New Roman" w:hAnsi="Times New Roman"/>
+          <w:b w:val="false"/>
+          <w:bCs w:val="false"/>
           <w:sz w:val="24"/>
           <w:szCs w:val="24"/>
         </w:rPr>
@@ -15080,19 +15088,34 @@
       <w:r>
         <w:rPr>
           <w:rFonts w:ascii="David" w:cs="David" w:eastAsia="David" w:hAnsi="David"/>
-          <w:sz w:val="24"/>
-          <w:szCs w:val="24"/>
-          <w:rtl/>
-        </w:rPr>
-        <w:t xml:space="preserve">). מהפכת השחרור המנהלי: ממדיניות כליאה מבוססת ביקוש למדיניות מבוססת היצע. עיוני משפט, מז, </w:t>
-      </w:r>
-      <w:r>
-        <w:rPr>
-          <w:rFonts w:ascii="Times New Roman" w:cs="Times New Roman" w:eastAsia="Times New Roman" w:hAnsi="Times New Roman"/>
-          <w:sz w:val="24"/>
-          <w:szCs w:val="24"/>
-        </w:rPr>
-        <w:t xml:space="preserve">57-123.</w:t>
+          <w:b w:val="false"/>
+          <w:bCs w:val="false"/>
+          <w:sz w:val="24"/>
+          <w:szCs w:val="24"/>
+          <w:rtl/>
+        </w:rPr>
+        <w:t xml:space="preserve">). מהפכת השחרור המנהלי: ממדיניות כליאה מבוססת ביקוש למדיניות מבוססת היצע. </w:t>
+      </w:r>
+      <w:r>
+        <w:rPr>
+          <w:rFonts w:ascii="David" w:cs="David" w:eastAsia="David" w:hAnsi="David"/>
+          <w:b/>
+          <w:bCs/>
+          <w:sz w:val="24"/>
+          <w:szCs w:val="24"/>
+          <w:rtl/>
+        </w:rPr>
+        <w:t xml:space="preserve">עיוני משפט, מז</w:t>
+      </w:r>
+      <w:r>
+        <w:rPr>
+          <w:rFonts w:ascii="Times New Roman" w:cs="Times New Roman" w:eastAsia="Times New Roman" w:hAnsi="Times New Roman"/>
+          <w:b w:val="false"/>
+          <w:bCs w:val="false"/>
+          <w:sz w:val="24"/>
+          <w:szCs w:val="24"/>
+        </w:rPr>
+        <w:t xml:space="preserve">, 57-123. https://www.taulawreview.sites.tau.ac.il/mz1/gazalayal_makalda</w:t>
       </w:r>
     </w:p>
     <w:p>
@@ -15105,6 +15128,8 @@
       <w:r>
         <w:rPr>
           <w:rFonts w:ascii="David" w:cs="David" w:eastAsia="David" w:hAnsi="David"/>
+          <w:b w:val="false"/>
+          <w:bCs w:val="false"/>
           <w:sz w:val="24"/>
           <w:szCs w:val="24"/>
           <w:rtl/>
@@ -15114,6 +15139,8 @@
       <w:r>
         <w:rPr>
           <w:rFonts w:ascii="Times New Roman" w:cs="Times New Roman" w:eastAsia="Times New Roman" w:hAnsi="Times New Roman"/>
+          <w:b w:val="false"/>
+          <w:bCs w:val="false"/>
           <w:sz w:val="24"/>
           <w:szCs w:val="24"/>
         </w:rPr>
@@ -15122,19 +15149,34 @@
       <w:r>
         <w:rPr>
           <w:rFonts w:ascii="David" w:cs="David" w:eastAsia="David" w:hAnsi="David"/>
-          <w:sz w:val="24"/>
-          <w:szCs w:val="24"/>
-          <w:rtl/>
-        </w:rPr>
-        <w:t xml:space="preserve">). שני מושגים של שלילת חירות: היחס בין שיקולי הענישה לתכליות הכליאה והשפעתו על זכויות האסיר. חוקים, טו, </w:t>
-      </w:r>
-      <w:r>
-        <w:rPr>
-          <w:rFonts w:ascii="Times New Roman" w:cs="Times New Roman" w:eastAsia="Times New Roman" w:hAnsi="Times New Roman"/>
-          <w:sz w:val="24"/>
-          <w:szCs w:val="24"/>
-        </w:rPr>
-        <w:t xml:space="preserve">9-48.</w:t>
+          <w:b w:val="false"/>
+          <w:bCs w:val="false"/>
+          <w:sz w:val="24"/>
+          <w:szCs w:val="24"/>
+          <w:rtl/>
+        </w:rPr>
+        <w:t xml:space="preserve">). שני מושגים של שלילת חירות: היחס בין שיקולי הענישה לתכליות הכליאה והשפעתו על זכויות האסיר. </w:t>
+      </w:r>
+      <w:r>
+        <w:rPr>
+          <w:rFonts w:ascii="David" w:cs="David" w:eastAsia="David" w:hAnsi="David"/>
+          <w:b/>
+          <w:bCs/>
+          <w:sz w:val="24"/>
+          <w:szCs w:val="24"/>
+          <w:rtl/>
+        </w:rPr>
+        <w:t xml:space="preserve">חוקים, טו</w:t>
+      </w:r>
+      <w:r>
+        <w:rPr>
+          <w:rFonts w:ascii="Times New Roman" w:cs="Times New Roman" w:eastAsia="Times New Roman" w:hAnsi="Times New Roman"/>
+          <w:b w:val="false"/>
+          <w:bCs w:val="false"/>
+          <w:sz w:val="24"/>
+          <w:szCs w:val="24"/>
+        </w:rPr>
+        <w:t xml:space="preserve">, 9-48. https://law.huji.ac.il/sites/default/files/law/files/shny_mvshgym_shl_shlylt_khyrvt.pdf</w:t>
       </w:r>
     </w:p>
     <w:p>
@@ -15147,6 +15189,8 @@
       <w:r>
         <w:rPr>
           <w:rFonts w:ascii="David" w:cs="David" w:eastAsia="David" w:hAnsi="David"/>
+          <w:b w:val="false"/>
+          <w:bCs w:val="false"/>
           <w:sz w:val="24"/>
           <w:szCs w:val="24"/>
           <w:rtl/>
@@ -15156,6 +15200,8 @@
       <w:r>
         <w:rPr>
           <w:rFonts w:ascii="Times New Roman" w:cs="Times New Roman" w:eastAsia="Times New Roman" w:hAnsi="Times New Roman"/>
+          <w:b w:val="false"/>
+          <w:bCs w:val="false"/>
           <w:sz w:val="24"/>
           <w:szCs w:val="24"/>
         </w:rPr>
@@ -15164,15 +15210,41 @@
       <w:r>
         <w:rPr>
           <w:rFonts w:ascii="David" w:cs="David" w:eastAsia="David" w:hAnsi="David"/>
-          <w:sz w:val="24"/>
-          <w:szCs w:val="24"/>
-          <w:rtl/>
-        </w:rPr>
-        <w:t xml:space="preserve">). תנאי כליאה של אסירים: בין רווחה לנוקשות [סקירת ספרות, פרסום מס' </w:t>
-      </w:r>
-      <w:r>
-        <w:rPr>
-          <w:rFonts w:ascii="Times New Roman" w:cs="Times New Roman" w:eastAsia="Times New Roman" w:hAnsi="Times New Roman"/>
+          <w:b w:val="false"/>
+          <w:bCs w:val="false"/>
+          <w:sz w:val="24"/>
+          <w:szCs w:val="24"/>
+          <w:rtl/>
+        </w:rPr>
+        <w:t xml:space="preserve">). </w:t>
+      </w:r>
+      <w:r>
+        <w:rPr>
+          <w:rFonts w:ascii="David" w:cs="David" w:eastAsia="David" w:hAnsi="David"/>
+          <w:b/>
+          <w:bCs/>
+          <w:sz w:val="24"/>
+          <w:szCs w:val="24"/>
+          <w:rtl/>
+        </w:rPr>
+        <w:t xml:space="preserve">תנאי כליאה של אסירים: בין רווחה לנוקשות</w:t>
+      </w:r>
+      <w:r>
+        <w:rPr>
+          <w:rFonts w:ascii="David" w:cs="David" w:eastAsia="David" w:hAnsi="David"/>
+          <w:b w:val="false"/>
+          <w:bCs w:val="false"/>
+          <w:sz w:val="24"/>
+          <w:szCs w:val="24"/>
+          <w:rtl/>
+        </w:rPr>
+        <w:t xml:space="preserve"> (סקירת ספרות, פרסום מס' </w:t>
+      </w:r>
+      <w:r>
+        <w:rPr>
+          <w:rFonts w:ascii="Times New Roman" w:cs="Times New Roman" w:eastAsia="Times New Roman" w:hAnsi="Times New Roman"/>
+          <w:b w:val="false"/>
+          <w:bCs w:val="false"/>
           <w:sz w:val="24"/>
           <w:szCs w:val="24"/>
         </w:rPr>
@@ -15181,11 +15253,13 @@
       <w:r>
         <w:rPr>
           <w:rFonts w:ascii="David" w:cs="David" w:eastAsia="David" w:hAnsi="David"/>
-          <w:sz w:val="24"/>
-          <w:szCs w:val="24"/>
-          <w:rtl/>
-        </w:rPr>
-        <w:t xml:space="preserve">]. שירות בתי הסוהר, מחלקת מחקר ואסטרטגיה.</w:t>
+          <w:b w:val="false"/>
+          <w:bCs w:val="false"/>
+          <w:sz w:val="24"/>
+          <w:szCs w:val="24"/>
+          <w:rtl/>
+        </w:rPr>
+        <w:t xml:space="preserve">). שירות בתי הסוהר, מחלקת מחקר ואסטרטגיה.</w:t>
       </w:r>
     </w:p>
     <w:p>
@@ -15198,6 +15272,8 @@
       <w:r>
         <w:rPr>
           <w:rFonts w:ascii="David" w:cs="David" w:eastAsia="David" w:hAnsi="David"/>
+          <w:b w:val="false"/>
+          <w:bCs w:val="false"/>
           <w:sz w:val="24"/>
           <w:szCs w:val="24"/>
           <w:rtl/>
@@ -15207,6 +15283,8 @@
       <w:r>
         <w:rPr>
           <w:rFonts w:ascii="Times New Roman" w:cs="Times New Roman" w:eastAsia="Times New Roman" w:hAnsi="Times New Roman"/>
+          <w:b w:val="false"/>
+          <w:bCs w:val="false"/>
           <w:sz w:val="24"/>
           <w:szCs w:val="24"/>
         </w:rPr>
@@ -15215,35 +15293,44 @@
       <w:r>
         <w:rPr>
           <w:rFonts w:ascii="David" w:cs="David" w:eastAsia="David" w:hAnsi="David"/>
-          <w:sz w:val="24"/>
-          <w:szCs w:val="24"/>
-          <w:rtl/>
-        </w:rPr>
-        <w:t xml:space="preserve">). בין שיקום ללגיטימיות: התפקיד של לגיטימיות בקשר שבין שביעות רצון מתנאי המחיה לשביעות רצון מפעילות חטו"ש בקרב כלואים פליליים בישראל. צוהר לבית הסוהר: מחקרים בכליאה, ביטחון ואכיפה, </w:t>
-      </w:r>
-      <w:r>
-        <w:rPr>
-          <w:rFonts w:ascii="Times New Roman" w:cs="Times New Roman" w:eastAsia="Times New Roman" w:hAnsi="Times New Roman"/>
-          <w:sz w:val="24"/>
-          <w:szCs w:val="24"/>
-        </w:rPr>
-        <w:t xml:space="preserve">22,</w:t>
-      </w:r>
-      <w:r>
-        <w:rPr>
-          <w:rFonts w:ascii="Times New Roman" w:cs="Times New Roman" w:eastAsia="Times New Roman" w:hAnsi="Times New Roman"/>
-          <w:sz w:val="24"/>
-          <w:szCs w:val="24"/>
-        </w:rPr>
-        <w:t xml:space="preserve"> </w:t>
-      </w:r>
-      <w:r>
-        <w:rPr>
-          <w:rFonts w:ascii="Times New Roman" w:cs="Times New Roman" w:eastAsia="Times New Roman" w:hAnsi="Times New Roman"/>
-          <w:sz w:val="24"/>
-          <w:szCs w:val="24"/>
-        </w:rPr>
-        <w:t xml:space="preserve">62-77.</w:t>
+          <w:b w:val="false"/>
+          <w:bCs w:val="false"/>
+          <w:sz w:val="24"/>
+          <w:szCs w:val="24"/>
+          <w:rtl/>
+        </w:rPr>
+        <w:t xml:space="preserve">). בין שיקום ללגיטימיות: התפקיד של לגיטימיות בקשר שבין שביעות רצון מתנאי המחיה לשביעות רצון מפעילות חטו"ש בקרב כלואים פליליים בישראל. </w:t>
+      </w:r>
+      <w:r>
+        <w:rPr>
+          <w:rFonts w:ascii="David" w:cs="David" w:eastAsia="David" w:hAnsi="David"/>
+          <w:b/>
+          <w:bCs/>
+          <w:sz w:val="24"/>
+          <w:szCs w:val="24"/>
+          <w:rtl/>
+        </w:rPr>
+        <w:t xml:space="preserve">צוהר לבית הסוהר: מחקרים בכליאה, ביטחון ואכיפה, </w:t>
+      </w:r>
+      <w:r>
+        <w:rPr>
+          <w:rFonts w:ascii="Times New Roman" w:cs="Times New Roman" w:eastAsia="Times New Roman" w:hAnsi="Times New Roman"/>
+          <w:b/>
+          <w:bCs/>
+          <w:sz w:val="24"/>
+          <w:szCs w:val="24"/>
+        </w:rPr>
+        <w:t xml:space="preserve">22</w:t>
+      </w:r>
+      <w:r>
+        <w:rPr>
+          <w:rFonts w:ascii="Times New Roman" w:cs="Times New Roman" w:eastAsia="Times New Roman" w:hAnsi="Times New Roman"/>
+          <w:b w:val="false"/>
+          <w:bCs w:val="false"/>
+          <w:sz w:val="24"/>
+          <w:szCs w:val="24"/>
+        </w:rPr>
+        <w:t xml:space="preserve">, 62-77. https://www.gov.il/BlobFolder/guide/zohar/he/%D7%A6%D7%95%D7%94%D7%A8%2022.pdf</w:t>
       </w:r>
     </w:p>
     <w:p>
@@ -15256,6 +15343,8 @@
       <w:r>
         <w:rPr>
           <w:rFonts w:ascii="David" w:cs="David" w:eastAsia="David" w:hAnsi="David"/>
+          <w:b w:val="false"/>
+          <w:bCs w:val="false"/>
           <w:sz w:val="24"/>
           <w:szCs w:val="24"/>
           <w:rtl/>
@@ -15265,6 +15354,8 @@
       <w:r>
         <w:rPr>
           <w:rFonts w:ascii="Times New Roman" w:cs="Times New Roman" w:eastAsia="Times New Roman" w:hAnsi="Times New Roman"/>
+          <w:b w:val="false"/>
+          <w:bCs w:val="false"/>
           <w:sz w:val="24"/>
           <w:szCs w:val="24"/>
         </w:rPr>
@@ -15272,12 +15363,56 @@
       </w:r>
       <w:r>
         <w:rPr>
-          <w:rFonts w:ascii="David" w:cs="David" w:eastAsia="David" w:hAnsi="David"/>
-          <w:sz w:val="24"/>
-          <w:szCs w:val="24"/>
-          <w:rtl/>
-        </w:rPr>
-        <w:t xml:space="preserve"> ינואר). אפקטיביות תוכניות התקון בשב"ס [מצגת הרצאה]. כנס מחקר שב"ס, שירות בתי הסוהר.</w:t>
+          <w:rFonts w:ascii="Times New Roman" w:cs="Times New Roman" w:eastAsia="Times New Roman" w:hAnsi="Times New Roman"/>
+          <w:b w:val="false"/>
+          <w:bCs w:val="false"/>
+          <w:sz w:val="24"/>
+          <w:szCs w:val="24"/>
+        </w:rPr>
+        <w:t xml:space="preserve"> </w:t>
+      </w:r>
+      <w:r>
+        <w:rPr>
+          <w:rFonts w:ascii="Times New Roman" w:cs="Times New Roman" w:eastAsia="Times New Roman" w:hAnsi="Times New Roman"/>
+          <w:b w:val="false"/>
+          <w:bCs w:val="false"/>
+          <w:sz w:val="24"/>
+          <w:szCs w:val="24"/>
+        </w:rPr>
+        <w:t xml:space="preserve">8</w:t>
+      </w:r>
+      <w:r>
+        <w:rPr>
+          <w:rFonts w:ascii="David" w:cs="David" w:eastAsia="David" w:hAnsi="David"/>
+          <w:b w:val="false"/>
+          <w:bCs w:val="false"/>
+          <w:sz w:val="24"/>
+          <w:szCs w:val="24"/>
+          <w:rtl/>
+        </w:rPr>
+        <w:t xml:space="preserve"> בינואר). </w:t>
+      </w:r>
+      <w:r>
+        <w:rPr>
+          <w:rFonts w:ascii="David" w:cs="David" w:eastAsia="David" w:hAnsi="David"/>
+          <w:b/>
+          <w:bCs/>
+          <w:sz w:val="24"/>
+          <w:szCs w:val="24"/>
+          <w:rtl/>
+        </w:rPr>
+        <w:t xml:space="preserve">אפקטיביות תוכניות התקון בשב"ס</w:t>
+      </w:r>
+      <w:r>
+        <w:rPr>
+          <w:rFonts w:ascii="David" w:cs="David" w:eastAsia="David" w:hAnsi="David"/>
+          <w:b w:val="false"/>
+          <w:bCs w:val="false"/>
+          <w:sz w:val="24"/>
+          <w:szCs w:val="24"/>
+          <w:rtl/>
+        </w:rPr>
+        <w:t xml:space="preserve"> [מצגת בכנס]. כנס מחקר שב"ס, שירות בתי הסוהר.</w:t>
       </w:r>
     </w:p>
     <w:p>
@@ -15290,28 +15425,66 @@
       <w:r>
         <w:rPr>
           <w:rFonts w:ascii="David" w:cs="David" w:eastAsia="David" w:hAnsi="David"/>
-          <w:sz w:val="24"/>
-          <w:szCs w:val="24"/>
-          <w:rtl/>
-        </w:rPr>
-        <w:t xml:space="preserve">ועקנין, י' (</w:t>
-      </w:r>
-      <w:r>
-        <w:rPr>
-          <w:rFonts w:ascii="Times New Roman" w:cs="Times New Roman" w:eastAsia="Times New Roman" w:hAnsi="Times New Roman"/>
-          <w:sz w:val="24"/>
-          <w:szCs w:val="24"/>
-        </w:rPr>
-        <w:t xml:space="preserve">2026</w:t>
-      </w:r>
-      <w:r>
-        <w:rPr>
-          <w:rFonts w:ascii="David" w:cs="David" w:eastAsia="David" w:hAnsi="David"/>
-          <w:sz w:val="24"/>
-          <w:szCs w:val="24"/>
-          <w:rtl/>
-        </w:rPr>
-        <w:t xml:space="preserve">). סקר תנאי מחיה באגפים פליליים: מערך נתונים סינתטי להוראה, ספר משתנים ובנק שאלות מחקר [חומרי קורס]. סמינריון תנאי כליאה של אסירים פליליים בישראל ובעולם, המכללה האקדמית אשקלון.</w:t>
+          <w:b w:val="false"/>
+          <w:bCs w:val="false"/>
+          <w:sz w:val="24"/>
+          <w:szCs w:val="24"/>
+          <w:rtl/>
+        </w:rPr>
+        <w:t xml:space="preserve">יכימוביץ-כהן, נ' (</w:t>
+      </w:r>
+      <w:r>
+        <w:rPr>
+          <w:rFonts w:ascii="Times New Roman" w:cs="Times New Roman" w:eastAsia="Times New Roman" w:hAnsi="Times New Roman"/>
+          <w:b w:val="false"/>
+          <w:bCs w:val="false"/>
+          <w:sz w:val="24"/>
+          <w:szCs w:val="24"/>
+        </w:rPr>
+        <w:t xml:space="preserve">2020</w:t>
+      </w:r>
+      <w:r>
+        <w:rPr>
+          <w:rFonts w:ascii="David" w:cs="David" w:eastAsia="David" w:hAnsi="David"/>
+          <w:b w:val="false"/>
+          <w:bCs w:val="false"/>
+          <w:sz w:val="24"/>
+          <w:szCs w:val="24"/>
+          <w:rtl/>
+        </w:rPr>
+        <w:t xml:space="preserve">). </w:t>
+      </w:r>
+      <w:r>
+        <w:rPr>
+          <w:rFonts w:ascii="David" w:cs="David" w:eastAsia="David" w:hAnsi="David"/>
+          <w:b/>
+          <w:bCs/>
+          <w:sz w:val="24"/>
+          <w:szCs w:val="24"/>
+          <w:rtl/>
+        </w:rPr>
+        <w:t xml:space="preserve">סוגיות בכליאה בישראל</w:t>
+      </w:r>
+      <w:r>
+        <w:rPr>
+          <w:rFonts w:ascii="David" w:cs="David" w:eastAsia="David" w:hAnsi="David"/>
+          <w:b w:val="false"/>
+          <w:bCs w:val="false"/>
+          <w:sz w:val="24"/>
+          <w:szCs w:val="24"/>
+          <w:rtl/>
+        </w:rPr>
+        <w:t xml:space="preserve">. הכנסת, מרכז המחקר והמידע. </w:t>
+      </w:r>
+      <w:r>
+        <w:rPr>
+          <w:rFonts w:ascii="Times New Roman" w:cs="Times New Roman" w:eastAsia="Times New Roman" w:hAnsi="Times New Roman"/>
+          <w:b w:val="false"/>
+          <w:bCs w:val="false"/>
+          <w:sz w:val="24"/>
+          <w:szCs w:val="24"/>
+        </w:rPr>
+        <w:t xml:space="preserve">https://fs.knesset.gov.il/globaldocs/MMM/78db42ca-8119-e911-80e1-00155d0a98a9/2_78db42ca-8119-e911-80e1-00155d0a98a9_11_15096.pdf</w:t>
       </w:r>
     </w:p>
     <w:p>
@@ -15324,28 +15497,65 @@
       <w:r>
         <w:rPr>
           <w:rFonts w:ascii="David" w:cs="David" w:eastAsia="David" w:hAnsi="David"/>
-          <w:sz w:val="24"/>
-          <w:szCs w:val="24"/>
-          <w:rtl/>
-        </w:rPr>
-        <w:t xml:space="preserve">יכימוביץ-כהן, נ' (</w:t>
-      </w:r>
-      <w:r>
-        <w:rPr>
-          <w:rFonts w:ascii="Times New Roman" w:cs="Times New Roman" w:eastAsia="Times New Roman" w:hAnsi="Times New Roman"/>
-          <w:sz w:val="24"/>
-          <w:szCs w:val="24"/>
-        </w:rPr>
-        <w:t xml:space="preserve">2020</w:t>
-      </w:r>
-      <w:r>
-        <w:rPr>
-          <w:rFonts w:ascii="David" w:cs="David" w:eastAsia="David" w:hAnsi="David"/>
-          <w:sz w:val="24"/>
-          <w:szCs w:val="24"/>
-          <w:rtl/>
-        </w:rPr>
-        <w:t xml:space="preserve">). סוגיות בכליאה בישראל. הכנסת, מרכז המחקר והמידע.</w:t>
+          <w:b w:val="false"/>
+          <w:bCs w:val="false"/>
+          <w:sz w:val="24"/>
+          <w:szCs w:val="24"/>
+          <w:rtl/>
+        </w:rPr>
+        <w:t xml:space="preserve">יפתח-שרצקי, א' והראל, ש' (</w:t>
+      </w:r>
+      <w:r>
+        <w:rPr>
+          <w:rFonts w:ascii="Times New Roman" w:cs="Times New Roman" w:eastAsia="Times New Roman" w:hAnsi="Times New Roman"/>
+          <w:b w:val="false"/>
+          <w:bCs w:val="false"/>
+          <w:sz w:val="24"/>
+          <w:szCs w:val="24"/>
+        </w:rPr>
+        <w:t xml:space="preserve">2024</w:t>
+      </w:r>
+      <w:r>
+        <w:rPr>
+          <w:rFonts w:ascii="David" w:cs="David" w:eastAsia="David" w:hAnsi="David"/>
+          <w:b w:val="false"/>
+          <w:bCs w:val="false"/>
+          <w:sz w:val="24"/>
+          <w:szCs w:val="24"/>
+          <w:rtl/>
+        </w:rPr>
+        <w:t xml:space="preserve">). צללים מאחורי הסורגים: תסמינים פוסט טראומטיים, ויסות רגשי שלילי והשלכתם על תפקודם של אסירים בכלא. </w:t>
+      </w:r>
+      <w:r>
+        <w:rPr>
+          <w:rFonts w:ascii="David" w:cs="David" w:eastAsia="David" w:hAnsi="David"/>
+          <w:b/>
+          <w:bCs/>
+          <w:sz w:val="24"/>
+          <w:szCs w:val="24"/>
+          <w:rtl/>
+        </w:rPr>
+        <w:t xml:space="preserve">צוהר לבית הסוהר: מחקרים בכליאה, ביטחון ואכיפה, </w:t>
+      </w:r>
+      <w:r>
+        <w:rPr>
+          <w:rFonts w:ascii="Times New Roman" w:cs="Times New Roman" w:eastAsia="Times New Roman" w:hAnsi="Times New Roman"/>
+          <w:b/>
+          <w:bCs/>
+          <w:sz w:val="24"/>
+          <w:szCs w:val="24"/>
+        </w:rPr>
+        <w:t xml:space="preserve">22</w:t>
+      </w:r>
+      <w:r>
+        <w:rPr>
+          <w:rFonts w:ascii="Times New Roman" w:cs="Times New Roman" w:eastAsia="Times New Roman" w:hAnsi="Times New Roman"/>
+          <w:b w:val="false"/>
+          <w:bCs w:val="false"/>
+          <w:sz w:val="24"/>
+          <w:szCs w:val="24"/>
+        </w:rPr>
+        <w:t xml:space="preserve">, 130-157. https://www.gov.il/BlobFolder/guide/zohar/he/%D7%A6%D7%95%D7%94%D7%A8%2022.pdf</w:t>
       </w:r>
     </w:p>
     <w:p>
@@ -15358,52 +15568,65 @@
       <w:r>
         <w:rPr>
           <w:rFonts w:ascii="David" w:cs="David" w:eastAsia="David" w:hAnsi="David"/>
-          <w:sz w:val="24"/>
-          <w:szCs w:val="24"/>
-          <w:rtl/>
-        </w:rPr>
-        <w:t xml:space="preserve">יפתח-שרצקי, א' והראל, ש' (</w:t>
-      </w:r>
-      <w:r>
-        <w:rPr>
-          <w:rFonts w:ascii="Times New Roman" w:cs="Times New Roman" w:eastAsia="Times New Roman" w:hAnsi="Times New Roman"/>
-          <w:sz w:val="24"/>
-          <w:szCs w:val="24"/>
-        </w:rPr>
-        <w:t xml:space="preserve">2024</w:t>
-      </w:r>
-      <w:r>
-        <w:rPr>
-          <w:rFonts w:ascii="David" w:cs="David" w:eastAsia="David" w:hAnsi="David"/>
-          <w:sz w:val="24"/>
-          <w:szCs w:val="24"/>
-          <w:rtl/>
-        </w:rPr>
-        <w:t xml:space="preserve">). צללים מאחורי הסורגים: תסמינים פוסט טראומטיים, ויסות רגשי שלילי והשלכתם על תפקודם של אסירים בכלא. צוהר לבית הסוהר: מחקרים בכליאה, ביטחון ואכיפה, </w:t>
-      </w:r>
-      <w:r>
-        <w:rPr>
-          <w:rFonts w:ascii="Times New Roman" w:cs="Times New Roman" w:eastAsia="Times New Roman" w:hAnsi="Times New Roman"/>
-          <w:sz w:val="24"/>
-          <w:szCs w:val="24"/>
-        </w:rPr>
-        <w:t xml:space="preserve">22,</w:t>
-      </w:r>
-      <w:r>
-        <w:rPr>
-          <w:rFonts w:ascii="Times New Roman" w:cs="Times New Roman" w:eastAsia="Times New Roman" w:hAnsi="Times New Roman"/>
-          <w:sz w:val="24"/>
-          <w:szCs w:val="24"/>
-        </w:rPr>
-        <w:t xml:space="preserve"> </w:t>
-      </w:r>
-      <w:r>
-        <w:rPr>
-          <w:rFonts w:ascii="Times New Roman" w:cs="Times New Roman" w:eastAsia="Times New Roman" w:hAnsi="Times New Roman"/>
-          <w:sz w:val="24"/>
-          <w:szCs w:val="24"/>
-        </w:rPr>
-        <w:t xml:space="preserve">130-157.</w:t>
+          <w:b w:val="false"/>
+          <w:bCs w:val="false"/>
+          <w:sz w:val="24"/>
+          <w:szCs w:val="24"/>
+          <w:rtl/>
+        </w:rPr>
+        <w:t xml:space="preserve">מורלי, י', שער-אפודי, ר' ואבו-ריא, ה' (</w:t>
+      </w:r>
+      <w:r>
+        <w:rPr>
+          <w:rFonts w:ascii="Times New Roman" w:cs="Times New Roman" w:eastAsia="Times New Roman" w:hAnsi="Times New Roman"/>
+          <w:b w:val="false"/>
+          <w:bCs w:val="false"/>
+          <w:sz w:val="24"/>
+          <w:szCs w:val="24"/>
+        </w:rPr>
+        <w:t xml:space="preserve">2019</w:t>
+      </w:r>
+      <w:r>
+        <w:rPr>
+          <w:rFonts w:ascii="David" w:cs="David" w:eastAsia="David" w:hAnsi="David"/>
+          <w:b w:val="false"/>
+          <w:bCs w:val="false"/>
+          <w:sz w:val="24"/>
+          <w:szCs w:val="24"/>
+          <w:rtl/>
+        </w:rPr>
+        <w:t xml:space="preserve">). ניצחון הרוח: התמודדות דתית ותמיכה חברתית כמנבאים רווחה נפשית בקרב אסירים משוחררים. </w:t>
+      </w:r>
+      <w:r>
+        <w:rPr>
+          <w:rFonts w:ascii="David" w:cs="David" w:eastAsia="David" w:hAnsi="David"/>
+          <w:b/>
+          <w:bCs/>
+          <w:sz w:val="24"/>
+          <w:szCs w:val="24"/>
+          <w:rtl/>
+        </w:rPr>
+        <w:t xml:space="preserve">צוהר לבית הסוהר, </w:t>
+      </w:r>
+      <w:r>
+        <w:rPr>
+          <w:rFonts w:ascii="Times New Roman" w:cs="Times New Roman" w:eastAsia="Times New Roman" w:hAnsi="Times New Roman"/>
+          <w:b/>
+          <w:bCs/>
+          <w:sz w:val="24"/>
+          <w:szCs w:val="24"/>
+        </w:rPr>
+        <w:t xml:space="preserve">20</w:t>
+      </w:r>
+      <w:r>
+        <w:rPr>
+          <w:rFonts w:ascii="Times New Roman" w:cs="Times New Roman" w:eastAsia="Times New Roman" w:hAnsi="Times New Roman"/>
+          <w:b w:val="false"/>
+          <w:bCs w:val="false"/>
+          <w:sz w:val="24"/>
+          <w:szCs w:val="24"/>
+        </w:rPr>
+        <w:t xml:space="preserve">, 71-89. https://www.gov.il/BlobFolder/guide/zohar/he/%D7%A6%D7%95%D7%94%D7%A8%20%D7%9C%D7%91%D7%99%D7%AA%20%D7%94%D7%A1%D7%95%D7%94%D7%A8%20%D7%92%D7%9C%D7%99%D7%95%D7%9F%2020.pdf</w:t>
       </w:r>
     </w:p>
     <w:p>
@@ -15416,52 +15639,65 @@
       <w:r>
         <w:rPr>
           <w:rFonts w:ascii="David" w:cs="David" w:eastAsia="David" w:hAnsi="David"/>
-          <w:sz w:val="24"/>
-          <w:szCs w:val="24"/>
-          <w:rtl/>
-        </w:rPr>
-        <w:t xml:space="preserve">מורלי, י', שער-אפודי, ר' ואבו-ריא, ה' (</w:t>
-      </w:r>
-      <w:r>
-        <w:rPr>
-          <w:rFonts w:ascii="Times New Roman" w:cs="Times New Roman" w:eastAsia="Times New Roman" w:hAnsi="Times New Roman"/>
-          <w:sz w:val="24"/>
-          <w:szCs w:val="24"/>
-        </w:rPr>
-        <w:t xml:space="preserve">2019</w:t>
-      </w:r>
-      <w:r>
-        <w:rPr>
-          <w:rFonts w:ascii="David" w:cs="David" w:eastAsia="David" w:hAnsi="David"/>
-          <w:sz w:val="24"/>
-          <w:szCs w:val="24"/>
-          <w:rtl/>
-        </w:rPr>
-        <w:t xml:space="preserve">). ניצחון הרוח: התמודדות דתית ותמיכה חברתית כמנבאים רווחה נפשית בקרב אסירים משוחררים. צוהר לבית הסוהר, </w:t>
-      </w:r>
-      <w:r>
-        <w:rPr>
-          <w:rFonts w:ascii="Times New Roman" w:cs="Times New Roman" w:eastAsia="Times New Roman" w:hAnsi="Times New Roman"/>
-          <w:sz w:val="24"/>
-          <w:szCs w:val="24"/>
-        </w:rPr>
-        <w:t xml:space="preserve">20,</w:t>
-      </w:r>
-      <w:r>
-        <w:rPr>
-          <w:rFonts w:ascii="Times New Roman" w:cs="Times New Roman" w:eastAsia="Times New Roman" w:hAnsi="Times New Roman"/>
-          <w:sz w:val="24"/>
-          <w:szCs w:val="24"/>
-        </w:rPr>
-        <w:t xml:space="preserve"> </w:t>
-      </w:r>
-      <w:r>
-        <w:rPr>
-          <w:rFonts w:ascii="Times New Roman" w:cs="Times New Roman" w:eastAsia="Times New Roman" w:hAnsi="Times New Roman"/>
-          <w:sz w:val="24"/>
-          <w:szCs w:val="24"/>
-        </w:rPr>
-        <w:t xml:space="preserve">71-89.</w:t>
+          <w:b w:val="false"/>
+          <w:bCs w:val="false"/>
+          <w:sz w:val="24"/>
+          <w:szCs w:val="24"/>
+          <w:rtl/>
+        </w:rPr>
+        <w:t xml:space="preserve">נחשון דהן, מ' וכץ, ע' (</w:t>
+      </w:r>
+      <w:r>
+        <w:rPr>
+          <w:rFonts w:ascii="Times New Roman" w:cs="Times New Roman" w:eastAsia="Times New Roman" w:hAnsi="Times New Roman"/>
+          <w:b w:val="false"/>
+          <w:bCs w:val="false"/>
+          <w:sz w:val="24"/>
+          <w:szCs w:val="24"/>
+        </w:rPr>
+        <w:t xml:space="preserve">2024</w:t>
+      </w:r>
+      <w:r>
+        <w:rPr>
+          <w:rFonts w:ascii="David" w:cs="David" w:eastAsia="David" w:hAnsi="David"/>
+          <w:b w:val="false"/>
+          <w:bCs w:val="false"/>
+          <w:sz w:val="24"/>
+          <w:szCs w:val="24"/>
+          <w:rtl/>
+        </w:rPr>
+        <w:t xml:space="preserve">). מוטיבציה ללמידה בקרב אסירים: האם תמיכה בצרכים פסיכולוגיים של אסירים במרכז החינוך מביאה למוטיבציה אוטונומית ללמידה ולהתמדה בה? </w:t>
+      </w:r>
+      <w:r>
+        <w:rPr>
+          <w:rFonts w:ascii="David" w:cs="David" w:eastAsia="David" w:hAnsi="David"/>
+          <w:b/>
+          <w:bCs/>
+          <w:sz w:val="24"/>
+          <w:szCs w:val="24"/>
+          <w:rtl/>
+        </w:rPr>
+        <w:t xml:space="preserve">צוהר לבית הסוהר: מחקרים בכליאה, ביטחון ואכיפה, </w:t>
+      </w:r>
+      <w:r>
+        <w:rPr>
+          <w:rFonts w:ascii="Times New Roman" w:cs="Times New Roman" w:eastAsia="Times New Roman" w:hAnsi="Times New Roman"/>
+          <w:b/>
+          <w:bCs/>
+          <w:sz w:val="24"/>
+          <w:szCs w:val="24"/>
+        </w:rPr>
+        <w:t xml:space="preserve">22</w:t>
+      </w:r>
+      <w:r>
+        <w:rPr>
+          <w:rFonts w:ascii="Times New Roman" w:cs="Times New Roman" w:eastAsia="Times New Roman" w:hAnsi="Times New Roman"/>
+          <w:b w:val="false"/>
+          <w:bCs w:val="false"/>
+          <w:sz w:val="24"/>
+          <w:szCs w:val="24"/>
+        </w:rPr>
+        <w:t xml:space="preserve">, 106-129. https://www.gov.il/BlobFolder/guide/zohar/he/%D7%A6%D7%95%D7%94%D7%A8%2022.pdf</w:t>
       </w:r>
     </w:p>
     <w:p>
@@ -15474,15 +15710,19 @@
       <w:r>
         <w:rPr>
           <w:rFonts w:ascii="David" w:cs="David" w:eastAsia="David" w:hAnsi="David"/>
-          <w:sz w:val="24"/>
-          <w:szCs w:val="24"/>
-          <w:rtl/>
-        </w:rPr>
-        <w:t xml:space="preserve">נחשון דהן, מ' וכץ, ע' (</w:t>
-      </w:r>
-      <w:r>
-        <w:rPr>
-          <w:rFonts w:ascii="Times New Roman" w:cs="Times New Roman" w:eastAsia="Times New Roman" w:hAnsi="Times New Roman"/>
+          <w:b w:val="false"/>
+          <w:bCs w:val="false"/>
+          <w:sz w:val="24"/>
+          <w:szCs w:val="24"/>
+          <w:rtl/>
+        </w:rPr>
+        <w:t xml:space="preserve">פלד-לסקוב, ר' ותימור, א' (</w:t>
+      </w:r>
+      <w:r>
+        <w:rPr>
+          <w:rFonts w:ascii="Times New Roman" w:cs="Times New Roman" w:eastAsia="Times New Roman" w:hAnsi="Times New Roman"/>
+          <w:b w:val="false"/>
+          <w:bCs w:val="false"/>
           <w:sz w:val="24"/>
           <w:szCs w:val="24"/>
         </w:rPr>
@@ -15491,35 +15731,44 @@
       <w:r>
         <w:rPr>
           <w:rFonts w:ascii="David" w:cs="David" w:eastAsia="David" w:hAnsi="David"/>
-          <w:sz w:val="24"/>
-          <w:szCs w:val="24"/>
-          <w:rtl/>
-        </w:rPr>
-        <w:t xml:space="preserve">). מוטיבציה ללמידה בקרב אסירים: האם תמיכה בצרכים פסיכולוגיים של אסירים במרכז החינוך מביאה למוטיבציה אוטונומית ללמידה ולהתמדה בה? צוהר לבית הסוהר: מחקרים בכליאה, ביטחון ואכיפה, </w:t>
-      </w:r>
-      <w:r>
-        <w:rPr>
-          <w:rFonts w:ascii="Times New Roman" w:cs="Times New Roman" w:eastAsia="Times New Roman" w:hAnsi="Times New Roman"/>
-          <w:sz w:val="24"/>
-          <w:szCs w:val="24"/>
-        </w:rPr>
-        <w:t xml:space="preserve">22,</w:t>
-      </w:r>
-      <w:r>
-        <w:rPr>
-          <w:rFonts w:ascii="Times New Roman" w:cs="Times New Roman" w:eastAsia="Times New Roman" w:hAnsi="Times New Roman"/>
-          <w:sz w:val="24"/>
-          <w:szCs w:val="24"/>
-        </w:rPr>
-        <w:t xml:space="preserve"> </w:t>
-      </w:r>
-      <w:r>
-        <w:rPr>
-          <w:rFonts w:ascii="Times New Roman" w:cs="Times New Roman" w:eastAsia="Times New Roman" w:hAnsi="Times New Roman"/>
-          <w:sz w:val="24"/>
-          <w:szCs w:val="24"/>
-        </w:rPr>
-        <w:t xml:space="preserve">106-129.</w:t>
+          <w:b w:val="false"/>
+          <w:bCs w:val="false"/>
+          <w:sz w:val="24"/>
+          <w:szCs w:val="24"/>
+          <w:rtl/>
+        </w:rPr>
+        <w:t xml:space="preserve">). אל החיים "מאחורי הסורגים": תהליכי שיקום בעיני אסירים משוחררים. </w:t>
+      </w:r>
+      <w:r>
+        <w:rPr>
+          <w:rFonts w:ascii="David" w:cs="David" w:eastAsia="David" w:hAnsi="David"/>
+          <w:b/>
+          <w:bCs/>
+          <w:sz w:val="24"/>
+          <w:szCs w:val="24"/>
+          <w:rtl/>
+        </w:rPr>
+        <w:t xml:space="preserve">צוהר לבית הסוהר: מחקרים בכליאה, ביטחון ואכיפה, </w:t>
+      </w:r>
+      <w:r>
+        <w:rPr>
+          <w:rFonts w:ascii="Times New Roman" w:cs="Times New Roman" w:eastAsia="Times New Roman" w:hAnsi="Times New Roman"/>
+          <w:b/>
+          <w:bCs/>
+          <w:sz w:val="24"/>
+          <w:szCs w:val="24"/>
+        </w:rPr>
+        <w:t xml:space="preserve">22</w:t>
+      </w:r>
+      <w:r>
+        <w:rPr>
+          <w:rFonts w:ascii="Times New Roman" w:cs="Times New Roman" w:eastAsia="Times New Roman" w:hAnsi="Times New Roman"/>
+          <w:b w:val="false"/>
+          <w:bCs w:val="false"/>
+          <w:sz w:val="24"/>
+          <w:szCs w:val="24"/>
+        </w:rPr>
+        <w:t xml:space="preserve">, 43-61. https://www.gov.il/BlobFolder/guide/zohar/he/%D7%A6%D7%95%D7%94%D7%A8%2022.pdf</w:t>
       </w:r>
     </w:p>
     <w:p>
@@ -15532,15 +15781,19 @@
       <w:r>
         <w:rPr>
           <w:rFonts w:ascii="David" w:cs="David" w:eastAsia="David" w:hAnsi="David"/>
-          <w:sz w:val="24"/>
-          <w:szCs w:val="24"/>
-          <w:rtl/>
-        </w:rPr>
-        <w:t xml:space="preserve">פלד-לסקוב, ר' ותימור, א' (</w:t>
-      </w:r>
-      <w:r>
-        <w:rPr>
-          <w:rFonts w:ascii="Times New Roman" w:cs="Times New Roman" w:eastAsia="Times New Roman" w:hAnsi="Times New Roman"/>
+          <w:b w:val="false"/>
+          <w:bCs w:val="false"/>
+          <w:sz w:val="24"/>
+          <w:szCs w:val="24"/>
+          <w:rtl/>
+        </w:rPr>
+        <w:t xml:space="preserve">שני, נ', חמלניצקי, מ', תימור, א' ואידיסיס, י' (</w:t>
+      </w:r>
+      <w:r>
+        <w:rPr>
+          <w:rFonts w:ascii="Times New Roman" w:cs="Times New Roman" w:eastAsia="Times New Roman" w:hAnsi="Times New Roman"/>
+          <w:b w:val="false"/>
+          <w:bCs w:val="false"/>
           <w:sz w:val="24"/>
           <w:szCs w:val="24"/>
         </w:rPr>
@@ -15549,93 +15802,44 @@
       <w:r>
         <w:rPr>
           <w:rFonts w:ascii="David" w:cs="David" w:eastAsia="David" w:hAnsi="David"/>
-          <w:sz w:val="24"/>
-          <w:szCs w:val="24"/>
-          <w:rtl/>
-        </w:rPr>
-        <w:t xml:space="preserve">). אל החיים "מאחורי הסורגים": תהליכי שיקום בעיני אסירים משוחררים. צוהר לבית הסוהר: מחקרים בכליאה, ביטחון ואכיפה, </w:t>
-      </w:r>
-      <w:r>
-        <w:rPr>
-          <w:rFonts w:ascii="Times New Roman" w:cs="Times New Roman" w:eastAsia="Times New Roman" w:hAnsi="Times New Roman"/>
-          <w:sz w:val="24"/>
-          <w:szCs w:val="24"/>
-        </w:rPr>
-        <w:t xml:space="preserve">22,</w:t>
-      </w:r>
-      <w:r>
-        <w:rPr>
-          <w:rFonts w:ascii="Times New Roman" w:cs="Times New Roman" w:eastAsia="Times New Roman" w:hAnsi="Times New Roman"/>
-          <w:sz w:val="24"/>
-          <w:szCs w:val="24"/>
-        </w:rPr>
-        <w:t xml:space="preserve"> </w:t>
-      </w:r>
-      <w:r>
-        <w:rPr>
-          <w:rFonts w:ascii="Times New Roman" w:cs="Times New Roman" w:eastAsia="Times New Roman" w:hAnsi="Times New Roman"/>
-          <w:sz w:val="24"/>
-          <w:szCs w:val="24"/>
-        </w:rPr>
-        <w:t xml:space="preserve">43-61.</w:t>
-      </w:r>
-    </w:p>
-    <w:p>
-      <w:pPr>
-        <w:bidi/>
-        <w:spacing w:after="120" w:line="360"/>
-        <w:ind w:start="709" w:hanging="709"/>
-        <w:jc w:val="right"/>
-      </w:pPr>
-      <w:r>
-        <w:rPr>
-          <w:rFonts w:ascii="David" w:cs="David" w:eastAsia="David" w:hAnsi="David"/>
-          <w:sz w:val="24"/>
-          <w:szCs w:val="24"/>
-          <w:rtl/>
-        </w:rPr>
-        <w:t xml:space="preserve">שני, נ', חמלניצקי, מ', תימור, א' ואידיסיס, י' (</w:t>
-      </w:r>
-      <w:r>
-        <w:rPr>
-          <w:rFonts w:ascii="Times New Roman" w:cs="Times New Roman" w:eastAsia="Times New Roman" w:hAnsi="Times New Roman"/>
-          <w:sz w:val="24"/>
-          <w:szCs w:val="24"/>
-        </w:rPr>
-        <w:t xml:space="preserve">2024</w:t>
-      </w:r>
-      <w:r>
-        <w:rPr>
-          <w:rFonts w:ascii="David" w:cs="David" w:eastAsia="David" w:hAnsi="David"/>
-          <w:sz w:val="24"/>
-          <w:szCs w:val="24"/>
-          <w:rtl/>
-        </w:rPr>
-        <w:t xml:space="preserve">). איזה מין טיפול: התרומה של השתתפות בקבוצה פסיכו-חינוכית מורחבת מכינה לטיפול ייעודי בפוגעים מינית להפחתה של מתח נפשי, להעלאת רווחה נפשית סובייקטיבית ולהגברה של מיקוד שליטה פנימי. צוהר לבית הסוהר: מחקרים בכליאה, ביטחון ואכיפה, </w:t>
-      </w:r>
-      <w:r>
-        <w:rPr>
-          <w:rFonts w:ascii="Times New Roman" w:cs="Times New Roman" w:eastAsia="Times New Roman" w:hAnsi="Times New Roman"/>
-          <w:sz w:val="24"/>
-          <w:szCs w:val="24"/>
-        </w:rPr>
-        <w:t xml:space="preserve">22,</w:t>
-      </w:r>
-      <w:r>
-        <w:rPr>
-          <w:rFonts w:ascii="Times New Roman" w:cs="Times New Roman" w:eastAsia="Times New Roman" w:hAnsi="Times New Roman"/>
-          <w:sz w:val="24"/>
-          <w:szCs w:val="24"/>
-        </w:rPr>
-        <w:t xml:space="preserve"> </w:t>
-      </w:r>
-      <w:r>
-        <w:rPr>
-          <w:rFonts w:ascii="Times New Roman" w:cs="Times New Roman" w:eastAsia="Times New Roman" w:hAnsi="Times New Roman"/>
-          <w:sz w:val="24"/>
-          <w:szCs w:val="24"/>
-        </w:rPr>
-        <w:t xml:space="preserve">158-171.</w:t>
+          <w:b w:val="false"/>
+          <w:bCs w:val="false"/>
+          <w:sz w:val="24"/>
+          <w:szCs w:val="24"/>
+          <w:rtl/>
+        </w:rPr>
+        <w:t xml:space="preserve">). איזה מין טיפול: התרומה של השתתפות בקבוצה פסיכו-חינוכית מורחבת מכינה לטיפול ייעודי בפוגעים מינית להפחתה של מתח נפשי, להעלאת רווחה נפשית סובייקטיבית ולהגברה של מיקוד שליטה פנימי. </w:t>
+      </w:r>
+      <w:r>
+        <w:rPr>
+          <w:rFonts w:ascii="David" w:cs="David" w:eastAsia="David" w:hAnsi="David"/>
+          <w:b/>
+          <w:bCs/>
+          <w:sz w:val="24"/>
+          <w:szCs w:val="24"/>
+          <w:rtl/>
+        </w:rPr>
+        <w:t xml:space="preserve">צוהר לבית הסוהר: מחקרים בכליאה, ביטחון ואכיפה, </w:t>
+      </w:r>
+      <w:r>
+        <w:rPr>
+          <w:rFonts w:ascii="Times New Roman" w:cs="Times New Roman" w:eastAsia="Times New Roman" w:hAnsi="Times New Roman"/>
+          <w:b/>
+          <w:bCs/>
+          <w:sz w:val="24"/>
+          <w:szCs w:val="24"/>
+        </w:rPr>
+        <w:t xml:space="preserve">22</w:t>
+      </w:r>
+      <w:r>
+        <w:rPr>
+          <w:rFonts w:ascii="Times New Roman" w:cs="Times New Roman" w:eastAsia="Times New Roman" w:hAnsi="Times New Roman"/>
+          <w:b w:val="false"/>
+          <w:bCs w:val="false"/>
+          <w:sz w:val="24"/>
+          <w:szCs w:val="24"/>
+        </w:rPr>
+        <w:t xml:space="preserve">, 158-171. https://www.gov.il/BlobFolder/guide/zohar/he/%D7%A6%D7%95%D7%94%D7%A8%2022.pdf</w:t>
       </w:r>
     </w:p>
     <w:p>
@@ -16221,28 +16425,7 @@
           <w:sz w:val="24"/>
           <w:szCs w:val="24"/>
         </w:rPr>
-        <w:t xml:space="preserve">Crosstabs, inmate</w:t>
-      </w:r>
-      <w:r>
-        <w:rPr>
-          <w:rFonts w:ascii="David" w:cs="David" w:eastAsia="David" w:hAnsi="David"/>
-          <w:b/>
-          <w:bCs/>
-          <w:sz w:val="24"/>
-          <w:szCs w:val="24"/>
-          <w:rtl/>
-        </w:rPr>
-        <w:t xml:space="preserve">_</w:t>
-      </w:r>
-      <w:r>
-        <w:rPr>
-          <w:rFonts w:ascii="Times New Roman" w:cs="Times New Roman" w:eastAsia="Times New Roman" w:hAnsi="Times New Roman"/>
-          <w:b/>
-          <w:bCs/>
-          <w:sz w:val="24"/>
-          <w:szCs w:val="24"/>
-        </w:rPr>
-        <w:t xml:space="preserve">type</w:t>
+        <w:t xml:space="preserve">Crosstabs, inmate_type</w:t>
       </w:r>
       <w:r>
         <w:rPr>
@@ -16895,39 +17078,7 @@
           <w:sz w:val="24"/>
           <w:szCs w:val="24"/>
         </w:rPr>
-        <w:t xml:space="preserve">Frequencies, Statistics (Filter: filt</w:t>
-      </w:r>
-      <w:r>
-        <w:rPr>
-          <w:rFonts w:ascii="David" w:cs="David" w:eastAsia="David" w:hAnsi="David"/>
-          <w:b/>
-          <w:bCs/>
-          <w:sz w:val="24"/>
-          <w:szCs w:val="24"/>
-          <w:rtl/>
-        </w:rPr>
-        <w:t xml:space="preserve">_</w:t>
-      </w:r>
-      <w:r>
-        <w:rPr>
-          <w:rFonts w:ascii="Times New Roman" w:cs="Times New Roman" w:eastAsia="Times New Roman" w:hAnsi="Times New Roman"/>
-          <w:b/>
-          <w:bCs/>
-          <w:sz w:val="24"/>
-          <w:szCs w:val="24"/>
-        </w:rPr>
-        <w:t xml:space="preserve">shafut</w:t>
-      </w:r>
-      <w:r>
-        <w:rPr>
-          <w:rFonts w:ascii="David" w:cs="David" w:eastAsia="David" w:hAnsi="David"/>
-          <w:b/>
-          <w:bCs/>
-          <w:sz w:val="24"/>
-          <w:szCs w:val="24"/>
-          <w:rtl/>
-        </w:rPr>
-        <w:t xml:space="preserve">)</w:t>
+        <w:t xml:space="preserve">Frequencies, Statistics (Filter: filt_shafut)</w:t>
       </w:r>
     </w:p>
     <w:tbl>

</xml_diff>

<commit_message>
Add college logo to the cover page
Co-Authored-By: Claude Fable 5.1 <noreply@anthropic.com>
Claude-Session: https://claude.ai/code/session_01KHo5ZcKCUwhCAvyoKeeMWs
</commit_message>
<xml_diff>
--- a/seminar/סמינריון_רווחה_נפשית_ולגיטימיות.docx
+++ b/seminar/סמינריון_רווחה_נפשית_ולגיטימיות.docx
@@ -3,8 +3,49 @@
 <w:document xmlns:wpc="http://schemas.microsoft.com/office/word/2010/wordprocessingCanvas" xmlns:mc="http://schemas.openxmlformats.org/markup-compatibility/2006" xmlns:o="urn:schemas-microsoft-com:office:office" xmlns:r="http://schemas.openxmlformats.org/officeDocument/2006/relationships" xmlns:m="http://schemas.openxmlformats.org/officeDocument/2006/math" xmlns:v="urn:schemas-microsoft-com:vml" xmlns:wp14="http://schemas.microsoft.com/office/word/2010/wordprocessingDrawing" xmlns:wp="http://schemas.openxmlformats.org/drawingml/2006/wordprocessingDrawing" xmlns:w10="urn:schemas-microsoft-com:office:word" xmlns:w="http://schemas.openxmlformats.org/wordprocessingml/2006/main" xmlns:w14="http://schemas.microsoft.com/office/word/2010/wordml" xmlns:w15="http://schemas.microsoft.com/office/word/2012/wordml" xmlns:wpg="http://schemas.microsoft.com/office/word/2010/wordprocessingGroup" xmlns:wpi="http://schemas.microsoft.com/office/word/2010/wordprocessingInk" xmlns:wne="http://schemas.microsoft.com/office/word/2006/wordml" xmlns:wps="http://schemas.microsoft.com/office/word/2010/wordprocessingShape" xmlns:cx="http://schemas.microsoft.com/office/drawing/2014/chartex" xmlns:cx1="http://schemas.microsoft.com/office/drawing/2015/9/8/chartex" xmlns:cx2="http://schemas.microsoft.com/office/drawing/2015/10/21/chartex" xmlns:cx3="http://schemas.microsoft.com/office/drawing/2016/5/9/chartex" xmlns:cx4="http://schemas.microsoft.com/office/drawing/2016/5/10/chartex" xmlns:cx5="http://schemas.microsoft.com/office/drawing/2016/5/11/chartex" xmlns:cx6="http://schemas.microsoft.com/office/drawing/2016/5/12/chartex" xmlns:cx7="http://schemas.microsoft.com/office/drawing/2016/5/13/chartex" xmlns:cx8="http://schemas.microsoft.com/office/drawing/2016/5/14/chartex" xmlns:aink="http://schemas.microsoft.com/office/drawing/2016/ink" xmlns:am3d="http://schemas.microsoft.com/office/drawing/2017/model3d" xmlns:w16cex="http://schemas.microsoft.com/office/word/2018/wordml/cex" xmlns:w16cid="http://schemas.microsoft.com/office/word/2016/wordml/cid" xmlns:w16="http://schemas.microsoft.com/office/word/2018/wordml" xmlns:w16sdtdh="http://schemas.microsoft.com/office/word/2020/wordml/sdtdatahash" xmlns:w16se="http://schemas.microsoft.com/office/word/2015/wordml/symex" mc:Ignorable="w14 w15 wp14">
   <w:body>
     <w:p>
-      <w:r>
-        <w:t xml:space="preserve"/>
+      <w:pPr>
+        <w:spacing w:after="240"/>
+        <w:jc w:val="center"/>
+      </w:pPr>
+      <w:r>
+        <w:drawing>
+          <wp:inline distT="0" distB="0" distL="0" distR="0">
+            <wp:extent cx="2857500" cy="1133475"/>
+            <wp:effectExtent t="0" r="0" b="0" l="0"/>
+            <wp:docPr id="1" name="" descr="" title=""/>
+            <wp:cNvGraphicFramePr>
+              <a:graphicFrameLocks xmlns:a="http://schemas.openxmlformats.org/drawingml/2006/main" noChangeAspect="1"/>
+            </wp:cNvGraphicFramePr>
+            <a:graphic xmlns:a="http://schemas.openxmlformats.org/drawingml/2006/main">
+              <a:graphicData uri="http://schemas.openxmlformats.org/drawingml/2006/picture">
+                <pic:pic xmlns:pic="http://schemas.openxmlformats.org/drawingml/2006/picture">
+                  <pic:nvPicPr>
+                    <pic:cNvPr id="0" name="" descr=""/>
+                    <pic:cNvPicPr>
+                      <a:picLocks noChangeAspect="1" noChangeArrowheads="1"/>
+                    </pic:cNvPicPr>
+                  </pic:nvPicPr>
+                  <pic:blipFill>
+                    <a:blip r:embed="rId8" cstate="none"/>
+                    <a:srcRect/>
+                    <a:stretch>
+                      <a:fillRect/>
+                    </a:stretch>
+                  </pic:blipFill>
+                  <pic:spPr bwMode="auto">
+                    <a:xfrm>
+                      <a:off x="0" y="0"/>
+                      <a:ext cx="2857500" cy="1133475"/>
+                    </a:xfrm>
+                    <a:prstGeom prst="rect">
+                      <a:avLst/>
+                    </a:prstGeom>
+                  </pic:spPr>
+                </pic:pic>
+              </a:graphicData>
+            </a:graphic>
+          </wp:inline>
+        </w:drawing>
       </w:r>
     </w:p>
     <w:p>

</xml_diff>